<commit_message>
fix: ajustes informe S. Navarrete
</commit_message>
<xml_diff>
--- a/MCDI503/docs/mcdi503_f1_sumativo_grupo5.docx
+++ b/MCDI503/docs/mcdi503_f1_sumativo_grupo5.docx
@@ -1,6 +1,6 @@
 
 <file path=word/document.xml><?xml version="1.0" encoding="utf-8"?>
-<w:document xmlns:wpc="http://schemas.microsoft.com/office/word/2010/wordprocessingCanvas" xmlns:cx="http://schemas.microsoft.com/office/drawing/2014/chartex" xmlns:cx1="http://schemas.microsoft.com/office/drawing/2015/9/8/chartex" xmlns:cx2="http://schemas.microsoft.com/office/drawing/2015/10/21/chartex" xmlns:cx3="http://schemas.microsoft.com/office/drawing/2016/5/9/chartex" xmlns:cx4="http://schemas.microsoft.com/office/drawing/2016/5/10/chartex" xmlns:cx5="http://schemas.microsoft.com/office/drawing/2016/5/11/chartex" xmlns:cx6="http://schemas.microsoft.com/office/drawing/2016/5/12/chartex" xmlns:cx7="http://schemas.microsoft.com/office/drawing/2016/5/13/chartex" xmlns:cx8="http://schemas.microsoft.com/office/drawing/2016/5/14/chartex" xmlns:mc="http://schemas.openxmlformats.org/markup-compatibility/2006" xmlns:aink="http://schemas.microsoft.com/office/drawing/2016/ink" xmlns:am3d="http://schemas.microsoft.com/office/drawing/2017/model3d" xmlns:o="urn:schemas-microsoft-com:office:office" xmlns:oel="http://schemas.microsoft.com/office/2019/extlst" xmlns:r="http://schemas.openxmlformats.org/officeDocument/2006/relationships" xmlns:m="http://schemas.openxmlformats.org/officeDocument/2006/math" xmlns:v="urn:schemas-microsoft-com:vml" xmlns:wp14="http://schemas.microsoft.com/office/word/2010/wordprocessingDrawing" xmlns:wp="http://schemas.openxmlformats.org/drawingml/2006/wordprocessingDrawing" xmlns:w10="urn:schemas-microsoft-com:office:word" xmlns:w="http://schemas.openxmlformats.org/wordprocessingml/2006/main" xmlns:w14="http://schemas.microsoft.com/office/word/2010/wordml" xmlns:w15="http://schemas.microsoft.com/office/word/2012/wordml" xmlns:w16cex="http://schemas.microsoft.com/office/word/2018/wordml/cex" xmlns:w16cid="http://schemas.microsoft.com/office/word/2016/wordml/cid" xmlns:w16="http://schemas.microsoft.com/office/word/2018/wordml" xmlns:w16du="http://schemas.microsoft.com/office/word/2023/wordml/word16du" xmlns:w16sdtdh="http://schemas.microsoft.com/office/word/2020/wordml/sdtdatahash" xmlns:w16sdtfl="http://schemas.microsoft.com/office/word/2024/wordml/sdtformatlock" xmlns:w16se="http://schemas.microsoft.com/office/word/2015/wordml/symex" xmlns:wpg="http://schemas.microsoft.com/office/word/2010/wordprocessingGroup" xmlns:wpi="http://schemas.microsoft.com/office/word/2010/wordprocessingInk" xmlns:wne="http://schemas.microsoft.com/office/word/2006/wordml" xmlns:wps="http://schemas.microsoft.com/office/word/2010/wordprocessingShape" mc:Ignorable="w14 w15 w16se w16cid w16 w16cex w16sdtdh w16sdtfl w16du wp14">
+<w:document xmlns:wpc="http://schemas.microsoft.com/office/word/2010/wordprocessingCanvas" xmlns:cx="http://schemas.microsoft.com/office/drawing/2014/chartex" xmlns:cx1="http://schemas.microsoft.com/office/drawing/2015/9/8/chartex" xmlns:cx2="http://schemas.microsoft.com/office/drawing/2015/10/21/chartex" xmlns:cx3="http://schemas.microsoft.com/office/drawing/2016/5/9/chartex" xmlns:cx4="http://schemas.microsoft.com/office/drawing/2016/5/10/chartex" xmlns:cx5="http://schemas.microsoft.com/office/drawing/2016/5/11/chartex" xmlns:cx6="http://schemas.microsoft.com/office/drawing/2016/5/12/chartex" xmlns:cx7="http://schemas.microsoft.com/office/drawing/2016/5/13/chartex" xmlns:cx8="http://schemas.microsoft.com/office/drawing/2016/5/14/chartex" xmlns:mc="http://schemas.openxmlformats.org/markup-compatibility/2006" xmlns:aink="http://schemas.microsoft.com/office/drawing/2016/ink" xmlns:am3d="http://schemas.microsoft.com/office/drawing/2017/model3d" xmlns:o="urn:schemas-microsoft-com:office:office" xmlns:oel="http://schemas.microsoft.com/office/2019/extlst" xmlns:r="http://schemas.openxmlformats.org/officeDocument/2006/relationships" xmlns:m="http://schemas.openxmlformats.org/officeDocument/2006/math" xmlns:v="urn:schemas-microsoft-com:vml" xmlns:wp14="http://schemas.microsoft.com/office/word/2010/wordprocessingDrawing" xmlns:wp="http://schemas.openxmlformats.org/drawingml/2006/wordprocessingDrawing" xmlns:w10="urn:schemas-microsoft-com:office:word" xmlns:w="http://schemas.openxmlformats.org/wordprocessingml/2006/main" xmlns:w14="http://schemas.microsoft.com/office/word/2010/wordml" xmlns:w15="http://schemas.microsoft.com/office/word/2012/wordml" xmlns:w16cex="http://schemas.microsoft.com/office/word/2018/wordml/cex" xmlns:w16cid="http://schemas.microsoft.com/office/word/2016/wordml/cid" xmlns:w16="http://schemas.microsoft.com/office/word/2018/wordml" xmlns:w16du="http://schemas.microsoft.com/office/word/2023/wordml/word16du" xmlns:w16sdtdh="http://schemas.microsoft.com/office/word/2020/wordml/sdtdatahash" xmlns:w16sdtfl="http://schemas.microsoft.com/office/word/2024/wordml/sdtformatlock" xmlns:w16se="http://schemas.microsoft.com/office/word/2015/wordml/symex" xmlns:wpg="http://schemas.microsoft.com/office/word/2010/wordprocessingGroup" xmlns:wpi="http://schemas.microsoft.com/office/word/2010/wordprocessingInk" xmlns:wne="http://schemas.microsoft.com/office/word/2006/wordml" xmlns:wps="http://schemas.microsoft.com/office/word/2010/wordprocessingShape" xmlns:a="http://schemas.openxmlformats.org/drawingml/2006/main" xmlns:pic="http://schemas.openxmlformats.org/drawingml/2006/picture" mc:Ignorable="w14 w15 w16se w16cid w16 w16cex w16sdtdh w16sdtfl w16du wp14">
   <w:body>
     <w:p>
       <w:pPr>
@@ -808,7 +808,7 @@
             </w:drawing>
           </mc:Choice>
           <mc:Fallback xmlns:pic="http://schemas.openxmlformats.org/drawingml/2006/picture" xmlns:a="http://schemas.openxmlformats.org/drawingml/2006/main">
-            <w:pict>
+            <w:pict w14:anchorId="1E5359A8">
               <v:group id="Group 2" style="width:85.45pt;height:51.55pt;mso-position-horizontal-relative:char;mso-position-vertical-relative:line" coordsize="10852,6546" o:spid="_x0000_s1026" w14:anchorId="42076BD7" o:gfxdata="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">
                 <v:shape id="Graphic 3" style="position:absolute;left:122;top:167;width:2101;height:3099;visibility:visible;mso-wrap-style:square;v-text-anchor:top" coordsize="210185,309880" o:spid="_x0000_s1027" fillcolor="#c6c4c4" stroked="f" path="m209791,l188086,r,184061l181850,232548r-17516,33480l137327,285432r-34712,6261l71098,285811,45396,267038,28085,233684,21742,184061,21742,,,,,185381r8392,58937l30862,282681r32483,20806l101777,309753r41068,-6762l177287,281095r23690,-39451l209791,182219,209791,xe" o:gfxdata="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">
                   <v:path arrowok="t"/>
@@ -1040,15 +1040,14 @@
       <w:pPr>
         <w:spacing w:line="252" w:lineRule="exact"/>
         <w:ind w:left="113"/>
-        <w:rPr>
-          <w:b/>
-        </w:rPr>
-      </w:pPr>
-      <w:r>
-        <w:rPr>
-          <w:rFonts w:ascii="Arial" w:hAnsi="Arial"/>
-          <w:b/>
-          <w:sz w:val="22"/>
+      </w:pPr>
+      <w:r>
+        <w:rPr>
+          <w:rFonts w:ascii="Arial" w:hAnsi="Arial"/>
+          <w:b w:val="1"/>
+          <w:bCs w:val="1"/>
+          <w:sz w:val="22"/>
+          <w:szCs w:val="22"/>
         </w:rPr>
         <w:t>Docente responsable:</w:t>
       </w:r>
@@ -1056,47 +1055,80 @@
         <w:rPr>
           <w:rFonts w:ascii="Arial" w:hAnsi="Arial"/>
           <w:b w:val="0"/>
-          <w:sz w:val="22"/>
+          <w:bCs w:val="0"/>
+          <w:sz w:val="22"/>
+          <w:szCs w:val="22"/>
         </w:rPr>
         <w:t xml:space="preserve"> Sergio Paraíso Medina</w:t>
       </w:r>
     </w:p>
     <w:p>
       <w:pPr>
+        <w:spacing w:line="252" w:lineRule="exact"/>
+        <w:ind w:left="113"/>
+        <w:rPr>
+          <w:rFonts w:ascii="Arial" w:hAnsi="Arial"/>
+          <w:b w:val="0"/>
+          <w:bCs w:val="0"/>
+          <w:sz w:val="22"/>
+          <w:szCs w:val="22"/>
+        </w:rPr>
+      </w:pPr>
+    </w:p>
+    <w:p>
+      <w:pPr>
+        <w:spacing w:line="252" w:lineRule="exact"/>
+        <w:ind w:left="113"/>
+        <w:rPr>
+          <w:rFonts w:ascii="Arial" w:hAnsi="Arial"/>
+          <w:b w:val="0"/>
+          <w:bCs w:val="0"/>
+          <w:sz w:val="22"/>
+          <w:szCs w:val="22"/>
+        </w:rPr>
+      </w:pPr>
+    </w:p>
+    <w:p>
+      <w:pPr>
+        <w:spacing w:line="252" w:lineRule="exact"/>
+        <w:ind w:left="113"/>
+        <w:rPr>
+          <w:rFonts w:ascii="Arial" w:hAnsi="Arial"/>
+          <w:b w:val="0"/>
+          <w:bCs w:val="0"/>
+          <w:sz w:val="22"/>
+          <w:szCs w:val="22"/>
+        </w:rPr>
+      </w:pPr>
+    </w:p>
+    <w:p>
+      <w:pPr>
+        <w:spacing w:line="252" w:lineRule="exact"/>
+        <w:ind w:left="113"/>
+        <w:rPr>
+          <w:rFonts w:ascii="Arial" w:hAnsi="Arial"/>
+          <w:b w:val="0"/>
+          <w:bCs w:val="0"/>
+          <w:sz w:val="22"/>
+          <w:szCs w:val="22"/>
+        </w:rPr>
+      </w:pPr>
+    </w:p>
+    <w:p>
+      <w:pPr>
         <w:pStyle w:val="Ttulo2"/>
-        <w:spacing w:line="252" w:lineRule="exact" w:before="120"/>
-        <w:ind w:left="113"/>
-        <w:rPr>
-          <w:b/>
-        </w:rPr>
-      </w:pPr>
-      <w:r>
-        <w:rPr/>
-        <w:t>I. Portada e Índice</w:t>
-      </w:r>
-    </w:p>
-    <w:p>
-      <w:pPr>
-        <w:pStyle w:val="Ttulo2"/>
-        <w:spacing w:before="0"/>
-        <w:rPr>
-          <w:b/>
-          <w:bCs/>
-        </w:rPr>
-      </w:pPr>
-      <w:r>
-        <w:rPr>
-          <w:b/>
-          <w:bCs/>
-        </w:rPr>
-        <w:t>APARTADOS</w:t>
-      </w:r>
-      <w:r>
-        <w:rPr>
-          <w:b/>
-          <w:bCs/>
-        </w:rPr>
-        <w:t xml:space="preserve"> DEL PDF</w:t>
+        <w:suppressLineNumbers w:val="0"/>
+        <w:bidi w:val="0"/>
+        <w:spacing w:before="0" w:beforeAutospacing="off" w:after="0" w:afterAutospacing="off" w:line="259" w:lineRule="auto"/>
+        <w:ind w:left="0" w:right="0"/>
+        <w:jc w:val="left"/>
+      </w:pPr>
+      <w:r>
+        <w:rPr>
+          <w:b w:val="1"/>
+          <w:bCs w:val="1"/>
+        </w:rPr>
+        <w:t>INDICE</w:t>
       </w:r>
     </w:p>
     <w:p>
@@ -1258,7 +1290,7 @@
         <w:t>Bibliografía</w:t>
       </w:r>
     </w:p>
-    <w:p>
+    <w:p xmlns:wp14="http://schemas.microsoft.com/office/word/2010/wordml" wp14:textId="77777777">
       <w:pPr>
         <w:pStyle w:val="Ttulo2"/>
         <w:pageBreakBefore/>
@@ -1269,733 +1301,1132 @@
         <w:t>II. Introducción y contextualización</w:t>
       </w:r>
     </w:p>
+    <w:p xmlns:wp14="http://schemas.microsoft.com/office/word/2010/wordml" wp14:textId="77777777">
+      <w:pPr>
+        <w:spacing w:after="20" w:line="276" w:lineRule="auto"/>
+        <w:jc w:val="both"/>
+      </w:pPr>
+      <w:r>
+        <w:rPr>
+          <w:rFonts w:ascii="Arial" w:hAnsi="Arial"/>
+          <w:b w:val="0"/>
+          <w:bCs w:val="0"/>
+          <w:i w:val="0"/>
+          <w:iCs w:val="0"/>
+          <w:sz w:val="22"/>
+          <w:szCs w:val="22"/>
+        </w:rPr>
+        <w:t>El hundimiento del RMS Titanic el 15 de abril de 1912, durante su viaje inaugural, es uno de los naufragios más documentados de la historia moderna: de las 2224 personas a bordo murieron 1502 (Kaggle, s. f.), en gran medida por la insuficiencia de botes salvavidas. Si bien el azar tuvo un papel en la supervivencia, la evidencia histórica sugiere que ciertos grupos de pasajeros —según sexo, clase de pasaje o edad— tuvieron mayores probabilidades de sobrevivir que otros.</w:t>
+      </w:r>
+    </w:p>
+    <w:p xmlns:wp14="http://schemas.microsoft.com/office/word/2010/wordml" wp14:textId="77777777">
+      <w:pPr>
+        <w:spacing w:after="20" w:line="276" w:lineRule="auto"/>
+        <w:jc w:val="both"/>
+      </w:pPr>
+      <w:r>
+        <w:rPr>
+          <w:rFonts w:ascii="Arial" w:hAnsi="Arial"/>
+          <w:b w:val="0"/>
+          <w:bCs w:val="0"/>
+          <w:i w:val="0"/>
+          <w:iCs w:val="0"/>
+          <w:sz w:val="22"/>
+          <w:szCs w:val="22"/>
+        </w:rPr>
+        <w:t>El proyecto trabaja con el dataset Titanic-Dataset.csv (891 pasajeros, 12 variables), que combina información demográfica, socioeconómica (clase de pasaje, tarifa) y de composición familiar a bordo. Este avance de Fase 1 tiene como propósito consolidar un primer ciclo de análisis exploratorio de datos (EDA) reproducible, que sirva de base técnica coherente para el desarrollo de fases posteriores del proyecto, entre ellas la eventual estimación de la probabilidad de supervivencia de un pasajero. El valor esperado del análisis es doble: por un lado, diagnosticar la calidad de los datos disponibles; por otro, identificar señales preliminares de asociación entre las variables registradas y la supervivencia, que orienten decisiones de modelado en etapas siguientes.</w:t>
+      </w:r>
+    </w:p>
     <w:p>
       <w:pPr>
-        <w:spacing w:line="276" w:lineRule="auto" w:after="20"/>
-      </w:pPr>
-      <w:r>
+        <w:spacing w:after="20" w:line="276" w:lineRule="auto"/>
+        <w:jc w:val="both"/>
         <w:rPr>
           <w:rFonts w:ascii="Arial" w:hAnsi="Arial"/>
           <w:b w:val="0"/>
+          <w:bCs w:val="0"/>
           <w:i w:val="0"/>
-          <w:sz w:val="22"/>
-        </w:rPr>
-        <w:t>El hundimiento del RMS Titanic el 15 de abril de 1912, durante su viaje inaugural, es uno de los naufragios más documentados de la historia moderna: de las 2224 personas a bordo murieron 1502 (Kaggle, s. f.), en gran medida por la insuficiencia de botes salvavidas. Si bien el azar tuvo un papel en la supervivencia, la evidencia histórica sugiere que ciertos grupos de pasajeros —según sexo, clase de pasaje o edad— tuvieron mayores probabilidades de sobrevivir que otros.</w:t>
-      </w:r>
-    </w:p>
-    <w:p>
-      <w:pPr>
-        <w:spacing w:line="276" w:lineRule="auto" w:after="20"/>
-      </w:pPr>
-      <w:r>
-        <w:rPr>
-          <w:rFonts w:ascii="Arial" w:hAnsi="Arial"/>
-          <w:b w:val="0"/>
-          <w:i w:val="0"/>
-          <w:sz w:val="22"/>
-        </w:rPr>
-        <w:t>El proyecto trabaja con el dataset Titanic-Dataset.csv (891 pasajeros, 12 variables), que combina información demográfica, socioeconómica (clase de pasaje, tarifa) y de composición familiar a bordo. Este avance de Fase 1 tiene como propósito consolidar un primer ciclo de análisis exploratorio de datos (EDA) reproducible, que sirva de base técnica coherente para el desarrollo de fases posteriores del proyecto, entre ellas la eventual estimación de la probabilidad de supervivencia de un pasajero. El valor esperado del análisis es doble: por un lado, diagnosticar la calidad de los datos disponibles; por otro, identificar señales preliminares de asociación entre las variables registradas y la supervivencia, que orienten decisiones de modelado en etapas siguientes.</w:t>
-      </w:r>
-    </w:p>
-    <w:p>
+          <w:iCs w:val="0"/>
+          <w:sz w:val="22"/>
+          <w:szCs w:val="22"/>
+        </w:rPr>
+      </w:pPr>
+    </w:p>
+    <w:p xmlns:wp14="http://schemas.microsoft.com/office/word/2010/wordml" wp14:textId="77777777">
       <w:pPr>
         <w:pStyle w:val="Ttulo2"/>
         <w:spacing w:before="0"/>
+        <w:jc w:val="both"/>
       </w:pPr>
       <w:r>
         <w:rPr/>
         <w:t>III. Objetivo exploratorio, preguntas iniciales y alcance del avance</w:t>
       </w:r>
     </w:p>
+    <w:p xmlns:wp14="http://schemas.microsoft.com/office/word/2010/wordml" wp14:textId="77777777">
+      <w:pPr>
+        <w:spacing w:after="20" w:line="276" w:lineRule="auto"/>
+        <w:jc w:val="both"/>
+      </w:pPr>
+      <w:r>
+        <w:rPr>
+          <w:rFonts w:ascii="Arial" w:hAnsi="Arial"/>
+          <w:b w:val="0"/>
+          <w:bCs w:val="0"/>
+          <w:i w:val="0"/>
+          <w:iCs w:val="0"/>
+          <w:sz w:val="22"/>
+          <w:szCs w:val="22"/>
+        </w:rPr>
+        <w:t>Objetivo exploratorio: implementar un primer ciclo de EDA reproducible sobre el dataset Titanic que permita caracterizar la estructura y calidad del conjunto de datos, identificar patrones preliminares de asociación con la supervivencia, y documentar de forma trazable las decisiones, supuestos y limitaciones.</w:t>
+      </w:r>
+    </w:p>
+    <w:p xmlns:wp14="http://schemas.microsoft.com/office/word/2010/wordml" wp14:textId="77777777">
+      <w:pPr>
+        <w:spacing w:after="20" w:line="276" w:lineRule="auto"/>
+        <w:jc w:val="both"/>
+      </w:pPr>
+      <w:r>
+        <w:rPr>
+          <w:rFonts w:ascii="Arial" w:hAnsi="Arial"/>
+          <w:b w:val="1"/>
+          <w:bCs w:val="1"/>
+          <w:i w:val="0"/>
+          <w:iCs w:val="0"/>
+          <w:sz w:val="22"/>
+          <w:szCs w:val="22"/>
+        </w:rPr>
+        <w:t>Preguntas exploratorias iniciales:</w:t>
+      </w:r>
+    </w:p>
+    <w:p xmlns:wp14="http://schemas.microsoft.com/office/word/2010/wordml" wp14:textId="77777777">
+      <w:pPr>
+        <w:spacing w:after="0" w:line="276" w:lineRule="auto"/>
+        <w:ind w:left="180"/>
+        <w:jc w:val="both"/>
+      </w:pPr>
+      <w:r>
+        <w:rPr>
+          <w:rFonts w:ascii="Arial" w:hAnsi="Arial"/>
+          <w:sz w:val="22"/>
+          <w:szCs w:val="22"/>
+        </w:rPr>
+        <w:t xml:space="preserve">• </w:t>
+      </w:r>
+      <w:r>
+        <w:rPr>
+          <w:rFonts w:ascii="Arial" w:hAnsi="Arial"/>
+          <w:sz w:val="22"/>
+          <w:szCs w:val="22"/>
+        </w:rPr>
+        <w:t>¿Cuál es la estructura general del dataset (dimensiones, tipos de variables, completitud)?</w:t>
+      </w:r>
+    </w:p>
+    <w:p xmlns:wp14="http://schemas.microsoft.com/office/word/2010/wordml" wp14:textId="77777777">
+      <w:pPr>
+        <w:spacing w:after="0" w:line="276" w:lineRule="auto"/>
+        <w:ind w:left="180"/>
+        <w:jc w:val="both"/>
+      </w:pPr>
+      <w:r>
+        <w:rPr>
+          <w:rFonts w:ascii="Arial" w:hAnsi="Arial"/>
+          <w:sz w:val="22"/>
+          <w:szCs w:val="22"/>
+        </w:rPr>
+        <w:t xml:space="preserve">• </w:t>
+      </w:r>
+      <w:r>
+        <w:rPr>
+          <w:rFonts w:ascii="Arial" w:hAnsi="Arial"/>
+          <w:sz w:val="22"/>
+          <w:szCs w:val="22"/>
+        </w:rPr>
+        <w:t>¿Cómo se distribuye la tasa de supervivencia global y según variables categóricas clave (sexo, clase de pasaje, puerto de embarque)?</w:t>
+      </w:r>
+    </w:p>
+    <w:p xmlns:wp14="http://schemas.microsoft.com/office/word/2010/wordml" wp14:textId="77777777">
+      <w:pPr>
+        <w:spacing w:after="0" w:line="276" w:lineRule="auto"/>
+        <w:ind w:left="180"/>
+        <w:jc w:val="both"/>
+      </w:pPr>
+      <w:r>
+        <w:rPr>
+          <w:rFonts w:ascii="Arial" w:hAnsi="Arial"/>
+          <w:sz w:val="22"/>
+          <w:szCs w:val="22"/>
+        </w:rPr>
+        <w:t xml:space="preserve">• </w:t>
+      </w:r>
+      <w:r>
+        <w:rPr>
+          <w:rFonts w:ascii="Arial" w:hAnsi="Arial"/>
+          <w:sz w:val="22"/>
+          <w:szCs w:val="22"/>
+        </w:rPr>
+        <w:t>¿Existen diferencias en variables numéricas (edad, tarifa, tamaño familiar) entre sobrevivientes y no sobrevivientes?</w:t>
+      </w:r>
+    </w:p>
+    <w:p xmlns:wp14="http://schemas.microsoft.com/office/word/2010/wordml" wp14:textId="77777777">
+      <w:pPr>
+        <w:spacing w:after="0" w:line="276" w:lineRule="auto"/>
+        <w:ind w:left="180"/>
+        <w:jc w:val="both"/>
+      </w:pPr>
+      <w:r>
+        <w:rPr>
+          <w:rFonts w:ascii="Arial" w:hAnsi="Arial"/>
+          <w:sz w:val="22"/>
+          <w:szCs w:val="22"/>
+        </w:rPr>
+        <w:t xml:space="preserve">• </w:t>
+      </w:r>
+      <w:r>
+        <w:rPr>
+          <w:rFonts w:ascii="Arial" w:hAnsi="Arial"/>
+          <w:sz w:val="22"/>
+          <w:szCs w:val="22"/>
+        </w:rPr>
+        <w:t>¿Qué variables presentan valores faltantes relevantes y cómo deberían tratarse en esta primera etapa?</w:t>
+      </w:r>
+    </w:p>
+    <w:p xmlns:wp14="http://schemas.microsoft.com/office/word/2010/wordml" wp14:textId="77777777">
+      <w:pPr>
+        <w:spacing w:after="0" w:line="276" w:lineRule="auto"/>
+        <w:ind w:left="180"/>
+        <w:jc w:val="both"/>
+      </w:pPr>
+      <w:r>
+        <w:rPr>
+          <w:rFonts w:ascii="Arial" w:hAnsi="Arial"/>
+          <w:sz w:val="22"/>
+          <w:szCs w:val="22"/>
+        </w:rPr>
+        <w:t xml:space="preserve">• </w:t>
+      </w:r>
+      <w:r>
+        <w:rPr>
+          <w:rFonts w:ascii="Arial" w:hAnsi="Arial"/>
+          <w:sz w:val="22"/>
+          <w:szCs w:val="22"/>
+        </w:rPr>
+        <w:t>¿Se observan valores atípicos evidentes en variables numéricas continuas como Fare y Age?</w:t>
+      </w:r>
+    </w:p>
+    <w:p xmlns:wp14="http://schemas.microsoft.com/office/word/2010/wordml" wp14:textId="77777777">
+      <w:pPr>
+        <w:spacing w:after="20" w:line="276" w:lineRule="auto"/>
+        <w:jc w:val="both"/>
+      </w:pPr>
+      <w:r>
+        <w:rPr>
+          <w:rFonts w:ascii="Arial" w:hAnsi="Arial"/>
+          <w:b w:val="0"/>
+          <w:bCs w:val="0"/>
+          <w:i w:val="0"/>
+          <w:iCs w:val="0"/>
+          <w:sz w:val="22"/>
+          <w:szCs w:val="22"/>
+        </w:rPr>
+        <w:t>Alcance del avance: se cubre la carga y revisión inicial del dataset, la exploración descriptiva univariada y bivariada, la construcción de variables derivadas (tamaño familiar, indicador de viajar solo, título extraído del nombre, indicador de cabina registrada) y la síntesis de hallazgos iniciales. No se realiza en esta fase imputación definitiva de valores faltantes, codificación final de variables ni modelado predictivo.</w:t>
+      </w:r>
+    </w:p>
+    <w:p xmlns:wp14="http://schemas.microsoft.com/office/word/2010/wordml" wp14:textId="77777777">
+      <w:pPr>
+        <w:spacing w:after="20" w:line="276" w:lineRule="auto"/>
+        <w:jc w:val="both"/>
+      </w:pPr>
+      <w:r>
+        <w:rPr>
+          <w:rFonts w:ascii="Arial" w:hAnsi="Arial"/>
+          <w:b w:val="0"/>
+          <w:bCs w:val="0"/>
+          <w:i w:val="0"/>
+          <w:iCs w:val="0"/>
+          <w:sz w:val="22"/>
+          <w:szCs w:val="22"/>
+        </w:rPr>
+        <w:t>Supuestos iniciales y limitaciones preliminares: el dataset corresponde a un subconjunto de 891 pasajeros y no representa la totalidad de personas a bordo; la ausencia de Age podría asociarse a variables observadas como Pclass, y los 2 casos faltantes de Embarked se tratan de forma puntual. Como limitación preliminar, Cabin presenta demasiados valores faltantes (~77%) para su uso directo.</w:t>
+      </w:r>
+    </w:p>
     <w:p>
       <w:pPr>
-        <w:spacing w:line="276" w:lineRule="auto" w:after="20"/>
-      </w:pPr>
-      <w:r>
+        <w:spacing w:after="20" w:line="276" w:lineRule="auto"/>
+        <w:jc w:val="both"/>
         <w:rPr>
           <w:rFonts w:ascii="Arial" w:hAnsi="Arial"/>
           <w:b w:val="0"/>
+          <w:bCs w:val="0"/>
           <w:i w:val="0"/>
-          <w:sz w:val="22"/>
-        </w:rPr>
-        <w:t>Objetivo exploratorio: implementar un primer ciclo de EDA reproducible sobre el dataset Titanic que permita caracterizar la estructura y calidad del conjunto de datos, identificar patrones preliminares de asociación con la supervivencia, y documentar de forma trazable las decisiones, supuestos y limitaciones.</w:t>
-      </w:r>
-    </w:p>
-    <w:p>
-      <w:pPr>
-        <w:spacing w:line="276" w:lineRule="auto" w:after="20"/>
-      </w:pPr>
-      <w:r>
-        <w:rPr>
-          <w:rFonts w:ascii="Arial" w:hAnsi="Arial"/>
-          <w:b/>
-          <w:i w:val="0"/>
-          <w:sz w:val="22"/>
-        </w:rPr>
-        <w:t>Preguntas exploratorias iniciales:</w:t>
-      </w:r>
-    </w:p>
-    <w:p>
-      <w:pPr>
-        <w:spacing w:line="276" w:lineRule="auto" w:after="0"/>
-        <w:ind w:left="180"/>
-      </w:pPr>
-      <w:r>
-        <w:rPr>
-          <w:rFonts w:ascii="Arial" w:hAnsi="Arial"/>
-          <w:sz w:val="22"/>
-        </w:rPr>
-        <w:t xml:space="preserve">• </w:t>
-      </w:r>
-      <w:r>
-        <w:rPr>
-          <w:rFonts w:ascii="Arial" w:hAnsi="Arial"/>
-          <w:sz w:val="22"/>
-        </w:rPr>
-        <w:t>¿Cuál es la estructura general del dataset (dimensiones, tipos de variables, completitud)?</w:t>
-      </w:r>
-    </w:p>
-    <w:p>
-      <w:pPr>
-        <w:spacing w:line="276" w:lineRule="auto" w:after="0"/>
-        <w:ind w:left="180"/>
-      </w:pPr>
-      <w:r>
-        <w:rPr>
-          <w:rFonts w:ascii="Arial" w:hAnsi="Arial"/>
-          <w:sz w:val="22"/>
-        </w:rPr>
-        <w:t xml:space="preserve">• </w:t>
-      </w:r>
-      <w:r>
-        <w:rPr>
-          <w:rFonts w:ascii="Arial" w:hAnsi="Arial"/>
-          <w:sz w:val="22"/>
-        </w:rPr>
-        <w:t>¿Cómo se distribuye la tasa de supervivencia global y según variables categóricas clave (sexo, clase de pasaje, puerto de embarque)?</w:t>
-      </w:r>
-    </w:p>
-    <w:p>
-      <w:pPr>
-        <w:spacing w:line="276" w:lineRule="auto" w:after="0"/>
-        <w:ind w:left="180"/>
-      </w:pPr>
-      <w:r>
-        <w:rPr>
-          <w:rFonts w:ascii="Arial" w:hAnsi="Arial"/>
-          <w:sz w:val="22"/>
-        </w:rPr>
-        <w:t xml:space="preserve">• </w:t>
-      </w:r>
-      <w:r>
-        <w:rPr>
-          <w:rFonts w:ascii="Arial" w:hAnsi="Arial"/>
-          <w:sz w:val="22"/>
-        </w:rPr>
-        <w:t>¿Existen diferencias en variables numéricas (edad, tarifa, tamaño familiar) entre sobrevivientes y no sobrevivientes?</w:t>
-      </w:r>
-    </w:p>
-    <w:p>
-      <w:pPr>
-        <w:spacing w:line="276" w:lineRule="auto" w:after="0"/>
-        <w:ind w:left="180"/>
-      </w:pPr>
-      <w:r>
-        <w:rPr>
-          <w:rFonts w:ascii="Arial" w:hAnsi="Arial"/>
-          <w:sz w:val="22"/>
-        </w:rPr>
-        <w:t xml:space="preserve">• </w:t>
-      </w:r>
-      <w:r>
-        <w:rPr>
-          <w:rFonts w:ascii="Arial" w:hAnsi="Arial"/>
-          <w:sz w:val="22"/>
-        </w:rPr>
-        <w:t>¿Qué variables presentan valores faltantes relevantes y cómo deberían tratarse en esta primera etapa?</w:t>
-      </w:r>
-    </w:p>
-    <w:p>
-      <w:pPr>
-        <w:spacing w:line="276" w:lineRule="auto" w:after="0"/>
-        <w:ind w:left="180"/>
-      </w:pPr>
-      <w:r>
-        <w:rPr>
-          <w:rFonts w:ascii="Arial" w:hAnsi="Arial"/>
-          <w:sz w:val="22"/>
-        </w:rPr>
-        <w:t xml:space="preserve">• </w:t>
-      </w:r>
-      <w:r>
-        <w:rPr>
-          <w:rFonts w:ascii="Arial" w:hAnsi="Arial"/>
-          <w:sz w:val="22"/>
-        </w:rPr>
-        <w:t>¿Se observan valores atípicos evidentes en variables numéricas continuas como Fare y Age?</w:t>
-      </w:r>
-    </w:p>
-    <w:p>
-      <w:pPr>
-        <w:spacing w:line="276" w:lineRule="auto" w:after="20"/>
-      </w:pPr>
-      <w:r>
-        <w:rPr>
-          <w:rFonts w:ascii="Arial" w:hAnsi="Arial"/>
-          <w:b w:val="0"/>
-          <w:i w:val="0"/>
-          <w:sz w:val="22"/>
-        </w:rPr>
-        <w:t>Alcance del avance: se cubre la carga y revisión inicial del dataset, la exploración descriptiva univariada y bivariada, la construcción de variables derivadas (tamaño familiar, indicador de viajar solo, título extraído del nombre, indicador de cabina registrada) y la síntesis de hallazgos iniciales. No se realiza en esta fase imputación definitiva de valores faltantes, codificación final de variables ni modelado predictivo.</w:t>
-      </w:r>
-    </w:p>
-    <w:p>
-      <w:pPr>
-        <w:spacing w:line="276" w:lineRule="auto" w:after="20"/>
-      </w:pPr>
-      <w:r>
-        <w:rPr>
-          <w:rFonts w:ascii="Arial" w:hAnsi="Arial"/>
-          <w:b w:val="0"/>
-          <w:i w:val="0"/>
-          <w:sz w:val="22"/>
-        </w:rPr>
-        <w:t>Supuestos iniciales y limitaciones preliminares: el dataset corresponde a un subconjunto de 891 pasajeros y no representa la totalidad de personas a bordo; la ausencia de Age podría asociarse a variables observadas como Pclass, y los 2 casos faltantes de Embarked se tratan de forma puntual. Como limitación preliminar, Cabin presenta demasiados valores faltantes (~77%) para su uso directo.</w:t>
-      </w:r>
-    </w:p>
-    <w:p>
+          <w:iCs w:val="0"/>
+          <w:sz w:val="22"/>
+          <w:szCs w:val="22"/>
+        </w:rPr>
+      </w:pPr>
+    </w:p>
+    <w:p xmlns:wp14="http://schemas.microsoft.com/office/word/2010/wordml" wp14:textId="77777777">
       <w:pPr>
         <w:pStyle w:val="Ttulo2"/>
         <w:spacing w:before="0"/>
+        <w:jc w:val="both"/>
       </w:pPr>
       <w:r>
         <w:rPr/>
         <w:t>IV. Implementación inicial del EDA en notebook</w:t>
       </w:r>
     </w:p>
+    <w:p xmlns:wp14="http://schemas.microsoft.com/office/word/2010/wordml" wp14:textId="77777777">
+      <w:pPr>
+        <w:spacing w:after="20" w:line="276" w:lineRule="auto"/>
+        <w:jc w:val="both"/>
+      </w:pPr>
+      <w:r>
+        <w:rPr>
+          <w:rFonts w:ascii="Arial" w:hAnsi="Arial"/>
+          <w:b w:val="0"/>
+          <w:bCs w:val="0"/>
+          <w:i w:val="0"/>
+          <w:iCs w:val="0"/>
+          <w:sz w:val="22"/>
+          <w:szCs w:val="22"/>
+        </w:rPr>
+        <w:t>El notebook mcdi503_f1_sumativo_grupo5.ipynb implementa el flujo descrito en 8 apartados: (I) Identificación del proyecto, (II) Contexto y objetivo exploratorio, (III) Carga y revisión inicial de datos, (IV) Exploración preliminar, (V) Decisiones y transformaciones iniciales, (VI) Resultados e interpretación inicial, (VII) Supuestos y limitaciones, (VIII) Cierre del avance. Cada apartado combina celdas narrativas en Markdown (contexto, justificación e interpretación) con celdas de código ejecutables (carga de datos, cálculos y visualizaciones implementados con pandas y seaborn; McKinney, 2010; The pandas development team, 2026; Waskom, 2021), de modo que el razonamiento y la evidencia computacional queden integrados en una misma secuencia legible.</w:t>
+      </w:r>
+    </w:p>
+    <w:p xmlns:wp14="http://schemas.microsoft.com/office/word/2010/wordml" wp14:textId="77777777">
+      <w:pPr>
+        <w:spacing w:after="20" w:line="276" w:lineRule="auto"/>
+        <w:jc w:val="both"/>
+      </w:pPr>
+      <w:r>
+        <w:rPr>
+          <w:rFonts w:ascii="Arial" w:hAnsi="Arial"/>
+          <w:b w:val="0"/>
+          <w:bCs w:val="0"/>
+          <w:i w:val="0"/>
+          <w:iCs w:val="0"/>
+          <w:sz w:val="22"/>
+          <w:szCs w:val="22"/>
+        </w:rPr>
+        <w:t>Cada pregunta exploratoria planteada en el apartado III de este informe se responde con una acción concreta en el notebook: la estructura y completitud del dataset se aborda en el apartado III del notebook (carga y revisión inicial); el diagnóstico y tratamiento inicial de valores faltantes en los apartados III y V; las distribuciones univariadas y frecuencias categóricas en el apartado IV (exploración preliminar); las diferencias entre grupos y la detección de outliers en el apartado VI (resultados e interpretación inicial), apoyado en las variables derivadas del apartado V (decisiones y transformaciones iniciales).</w:t>
+      </w:r>
+    </w:p>
     <w:p>
       <w:pPr>
-        <w:spacing w:line="276" w:lineRule="auto" w:after="20"/>
-      </w:pPr>
-      <w:r>
+        <w:spacing w:after="20" w:line="276" w:lineRule="auto"/>
+        <w:jc w:val="both"/>
         <w:rPr>
           <w:rFonts w:ascii="Arial" w:hAnsi="Arial"/>
           <w:b w:val="0"/>
+          <w:bCs w:val="0"/>
           <w:i w:val="0"/>
-          <w:sz w:val="22"/>
-        </w:rPr>
-        <w:t>El notebook mcdi503_f1_sumativo_grupo5.ipynb implementa el flujo descrito en 8 apartados: (I) Identificación del proyecto, (II) Contexto y objetivo exploratorio, (III) Carga y revisión inicial de datos, (IV) Exploración preliminar, (V) Decisiones y transformaciones iniciales, (VI) Resultados e interpretación inicial, (VII) Supuestos y limitaciones, (VIII) Cierre del avance. Cada apartado combina celdas narrativas en Markdown (contexto, justificación e interpretación) con celdas de código ejecutables (carga de datos, cálculos y visualizaciones implementados con pandas y seaborn; McKinney, 2010; The pandas development team, 2026; Waskom, 2021), de modo que el razonamiento y la evidencia computacional queden integrados en una misma secuencia legible.</w:t>
-      </w:r>
-    </w:p>
-    <w:p>
-      <w:pPr>
-        <w:spacing w:line="276" w:lineRule="auto" w:after="20"/>
-      </w:pPr>
-      <w:r>
-        <w:rPr>
-          <w:rFonts w:ascii="Arial" w:hAnsi="Arial"/>
-          <w:b w:val="0"/>
-          <w:i w:val="0"/>
-          <w:sz w:val="22"/>
-        </w:rPr>
-        <w:t>Cada pregunta exploratoria planteada en el apartado III de este informe se responde con una acción concreta en el notebook: la estructura y completitud del dataset se aborda en el apartado III del notebook (carga y revisión inicial); el diagnóstico y tratamiento inicial de valores faltantes en los apartados III y V; las distribuciones univariadas y frecuencias categóricas en el apartado IV (exploración preliminar); las diferencias entre grupos y la detección de outliers en el apartado VI (resultados e interpretación inicial), apoyado en las variables derivadas del apartado V (decisiones y transformaciones iniciales).</w:t>
-      </w:r>
-    </w:p>
-    <w:p>
+          <w:iCs w:val="0"/>
+          <w:sz w:val="22"/>
+          <w:szCs w:val="22"/>
+        </w:rPr>
+      </w:pPr>
+    </w:p>
+    <w:p xmlns:wp14="http://schemas.microsoft.com/office/word/2010/wordml" wp14:textId="77777777">
       <w:pPr>
         <w:pStyle w:val="Ttulo2"/>
         <w:spacing w:before="0"/>
+        <w:jc w:val="both"/>
       </w:pPr>
       <w:r>
         <w:rPr/>
         <w:t>V. Documentación trazable de decisiones exploratorias</w:t>
       </w:r>
     </w:p>
+    <w:p xmlns:wp14="http://schemas.microsoft.com/office/word/2010/wordml" wp14:textId="77777777">
+      <w:pPr>
+        <w:spacing w:after="20" w:line="276" w:lineRule="auto"/>
+        <w:jc w:val="both"/>
+      </w:pPr>
+      <w:r>
+        <w:rPr>
+          <w:rFonts w:ascii="Arial" w:hAnsi="Arial"/>
+          <w:b w:val="0"/>
+          <w:bCs w:val="0"/>
+          <w:i w:val="0"/>
+          <w:iCs w:val="0"/>
+          <w:sz w:val="22"/>
+          <w:szCs w:val="22"/>
+        </w:rPr>
+        <w:t>En el apartado V del notebook se registran cinco decisiones exploratorias, cada una con su justificación y el resultado intermedio que produjo:</w:t>
+      </w:r>
+    </w:p>
+    <w:p xmlns:wp14="http://schemas.microsoft.com/office/word/2010/wordml" wp14:textId="77777777">
+      <w:pPr>
+        <w:spacing w:after="0" w:line="276" w:lineRule="auto"/>
+        <w:ind w:left="180"/>
+        <w:jc w:val="both"/>
+      </w:pPr>
+      <w:r>
+        <w:rPr>
+          <w:rFonts w:ascii="Arial" w:hAnsi="Arial"/>
+          <w:sz w:val="22"/>
+          <w:szCs w:val="22"/>
+        </w:rPr>
+        <w:t xml:space="preserve">• </w:t>
+      </w:r>
+      <w:r>
+        <w:rPr>
+          <w:rFonts w:ascii="Arial" w:hAnsi="Arial"/>
+          <w:b w:val="1"/>
+          <w:bCs w:val="1"/>
+          <w:sz w:val="22"/>
+          <w:szCs w:val="22"/>
+        </w:rPr>
+        <w:t>Cabin —</w:t>
+      </w:r>
+      <w:r>
+        <w:rPr>
+          <w:rFonts w:ascii="Arial" w:hAnsi="Arial"/>
+          <w:sz w:val="22"/>
+          <w:szCs w:val="22"/>
+        </w:rPr>
+        <w:t xml:space="preserve"> con 77,1% de valores faltantes, no se imputa; se crea el indicador binario Cabin_registrada, porque la sola presencia del dato puede ser informativa.</w:t>
+      </w:r>
+    </w:p>
+    <w:p xmlns:wp14="http://schemas.microsoft.com/office/word/2010/wordml" wp14:textId="77777777">
+      <w:pPr>
+        <w:spacing w:after="0" w:line="276" w:lineRule="auto"/>
+        <w:ind w:left="180"/>
+        <w:jc w:val="both"/>
+      </w:pPr>
+      <w:r>
+        <w:rPr>
+          <w:rFonts w:ascii="Arial" w:hAnsi="Arial"/>
+          <w:sz w:val="22"/>
+          <w:szCs w:val="22"/>
+        </w:rPr>
+        <w:t xml:space="preserve">• </w:t>
+      </w:r>
+      <w:r>
+        <w:rPr>
+          <w:rFonts w:ascii="Arial" w:hAnsi="Arial"/>
+          <w:b w:val="1"/>
+          <w:bCs w:val="1"/>
+          <w:sz w:val="22"/>
+          <w:szCs w:val="22"/>
+        </w:rPr>
+        <w:t>Age —</w:t>
+      </w:r>
+      <w:r>
+        <w:rPr>
+          <w:rFonts w:ascii="Arial" w:hAnsi="Arial"/>
+          <w:sz w:val="22"/>
+          <w:szCs w:val="22"/>
+        </w:rPr>
+        <w:t xml:space="preserve"> con 19,9% de valores faltantes, se mantiene sin imputar en esta fase; se crea Age_registrada y se calcula, solo con fines diagnósticos, la mediana de edad por Pclass (37 años en 1ª clase, 29 en 2ª, 24 en 3ª) y se verifica que la proporción de faltantes difiere por clase (13,9% / 6,0% / 27,7%), lo que sugiere asociación con Pclass.</w:t>
+      </w:r>
+    </w:p>
+    <w:p xmlns:wp14="http://schemas.microsoft.com/office/word/2010/wordml" wp14:textId="77777777">
+      <w:pPr>
+        <w:spacing w:after="0" w:line="276" w:lineRule="auto"/>
+        <w:ind w:left="180"/>
+        <w:jc w:val="both"/>
+      </w:pPr>
+      <w:r>
+        <w:rPr>
+          <w:rFonts w:ascii="Arial" w:hAnsi="Arial"/>
+          <w:sz w:val="22"/>
+          <w:szCs w:val="22"/>
+        </w:rPr>
+        <w:t xml:space="preserve">• </w:t>
+      </w:r>
+      <w:r>
+        <w:rPr>
+          <w:rFonts w:ascii="Arial" w:hAnsi="Arial"/>
+          <w:b w:val="1"/>
+          <w:bCs w:val="1"/>
+          <w:sz w:val="22"/>
+          <w:szCs w:val="22"/>
+        </w:rPr>
+        <w:t>Embarked —</w:t>
+      </w:r>
+      <w:r>
+        <w:rPr>
+          <w:rFonts w:ascii="Arial" w:hAnsi="Arial"/>
+          <w:sz w:val="22"/>
+          <w:szCs w:val="22"/>
+        </w:rPr>
+        <w:t xml:space="preserve"> solo 2 casos faltantes (0,22%); se imputan con la moda ('S'), generando Embarked_imputado, dado el impacto marginal sobre la muestra.</w:t>
+      </w:r>
+    </w:p>
+    <w:p xmlns:wp14="http://schemas.microsoft.com/office/word/2010/wordml" wp14:textId="77777777">
+      <w:pPr>
+        <w:spacing w:after="0" w:line="276" w:lineRule="auto"/>
+        <w:ind w:left="180"/>
+        <w:jc w:val="both"/>
+      </w:pPr>
+      <w:r>
+        <w:rPr>
+          <w:rFonts w:ascii="Arial" w:hAnsi="Arial"/>
+          <w:sz w:val="22"/>
+          <w:szCs w:val="22"/>
+        </w:rPr>
+        <w:t xml:space="preserve">• </w:t>
+      </w:r>
+      <w:r>
+        <w:rPr>
+          <w:rFonts w:ascii="Arial" w:hAnsi="Arial"/>
+          <w:b w:val="1"/>
+          <w:bCs w:val="1"/>
+          <w:sz w:val="22"/>
+          <w:szCs w:val="22"/>
+        </w:rPr>
+        <w:t>FamilySize / IsAlone —</w:t>
+      </w:r>
+      <w:r>
+        <w:rPr>
+          <w:rFonts w:ascii="Arial" w:hAnsi="Arial"/>
+          <w:sz w:val="22"/>
+          <w:szCs w:val="22"/>
+        </w:rPr>
+        <w:t xml:space="preserve"> se combinan SibSp y Parch en FamilySize = SibSp + Parch + 1, y se deriva IsAlone, para observar el efecto del tamaño del grupo familiar sobre la supervivencia.</w:t>
+      </w:r>
+    </w:p>
+    <w:p xmlns:wp14="http://schemas.microsoft.com/office/word/2010/wordml" wp14:textId="77777777">
+      <w:pPr>
+        <w:spacing w:after="0" w:line="276" w:lineRule="auto"/>
+        <w:ind w:left="180"/>
+        <w:jc w:val="both"/>
+      </w:pPr>
+      <w:r>
+        <w:rPr>
+          <w:rFonts w:ascii="Arial" w:hAnsi="Arial"/>
+          <w:sz w:val="22"/>
+          <w:szCs w:val="22"/>
+        </w:rPr>
+        <w:t xml:space="preserve">• </w:t>
+      </w:r>
+      <w:r>
+        <w:rPr>
+          <w:rFonts w:ascii="Arial" w:hAnsi="Arial"/>
+          <w:b w:val="1"/>
+          <w:bCs w:val="1"/>
+          <w:sz w:val="22"/>
+          <w:szCs w:val="22"/>
+        </w:rPr>
+        <w:t>Title —</w:t>
+      </w:r>
+      <w:r>
+        <w:rPr>
+          <w:rFonts w:ascii="Arial" w:hAnsi="Arial"/>
+          <w:sz w:val="22"/>
+          <w:szCs w:val="22"/>
+        </w:rPr>
+        <w:t xml:space="preserve"> se extrae el tratamiento (Mr., Mrs., Miss., Master., etc.) desde Name mediante expresión regular, agrupando categorías poco frecuentes en 'Other', para condensar información demográfica y de estatus.</w:t>
+      </w:r>
+    </w:p>
+    <w:p xmlns:wp14="http://schemas.microsoft.com/office/word/2010/wordml" wp14:textId="77777777">
+      <w:pPr>
+        <w:spacing w:after="20" w:line="276" w:lineRule="auto"/>
+        <w:jc w:val="both"/>
+      </w:pPr>
+      <w:r>
+        <w:rPr>
+          <w:rFonts w:ascii="Arial" w:hAnsi="Arial"/>
+          <w:b w:val="0"/>
+          <w:bCs w:val="0"/>
+          <w:i w:val="0"/>
+          <w:iCs w:val="0"/>
+          <w:sz w:val="22"/>
+          <w:szCs w:val="22"/>
+        </w:rPr>
+        <w:t>Estas decisiones y sus resultados intermedios (tabla de medianas por clase, distribución de títulos, vista del dataset ampliado) se documentan en el apartado V del notebook, y su efecto sobre la exploración se retoma explícitamente en el apartado VI.</w:t>
+      </w:r>
+    </w:p>
     <w:p>
       <w:pPr>
-        <w:spacing w:line="276" w:lineRule="auto" w:after="20"/>
-      </w:pPr>
-      <w:r>
+        <w:spacing w:after="20" w:line="276" w:lineRule="auto"/>
+        <w:jc w:val="both"/>
         <w:rPr>
           <w:rFonts w:ascii="Arial" w:hAnsi="Arial"/>
           <w:b w:val="0"/>
+          <w:bCs w:val="0"/>
           <w:i w:val="0"/>
-          <w:sz w:val="22"/>
-        </w:rPr>
-        <w:t>En el apartado V del notebook se registran cinco decisiones exploratorias, cada una con su justificación y el resultado intermedio que produjo:</w:t>
-      </w:r>
-    </w:p>
-    <w:p>
-      <w:pPr>
-        <w:spacing w:line="276" w:lineRule="auto" w:after="0"/>
-        <w:ind w:left="180"/>
-      </w:pPr>
-      <w:r>
-        <w:rPr>
-          <w:rFonts w:ascii="Arial" w:hAnsi="Arial"/>
-          <w:sz w:val="22"/>
-        </w:rPr>
-        <w:t xml:space="preserve">• </w:t>
-      </w:r>
-      <w:r>
-        <w:rPr>
-          <w:rFonts w:ascii="Arial" w:hAnsi="Arial"/>
-          <w:b/>
-          <w:sz w:val="22"/>
-        </w:rPr>
-        <w:t>Cabin —</w:t>
-      </w:r>
-      <w:r>
-        <w:rPr>
-          <w:rFonts w:ascii="Arial" w:hAnsi="Arial"/>
-          <w:sz w:val="22"/>
-        </w:rPr>
-        <w:t xml:space="preserve"> con 77,1% de valores faltantes, no se imputa; se crea el indicador binario Cabin_registrada, porque la sola presencia del dato puede ser informativa.</w:t>
-      </w:r>
-    </w:p>
-    <w:p>
-      <w:pPr>
-        <w:spacing w:line="276" w:lineRule="auto" w:after="0"/>
-        <w:ind w:left="180"/>
-      </w:pPr>
-      <w:r>
-        <w:rPr>
-          <w:rFonts w:ascii="Arial" w:hAnsi="Arial"/>
-          <w:sz w:val="22"/>
-        </w:rPr>
-        <w:t xml:space="preserve">• </w:t>
-      </w:r>
-      <w:r>
-        <w:rPr>
-          <w:rFonts w:ascii="Arial" w:hAnsi="Arial"/>
-          <w:b/>
-          <w:sz w:val="22"/>
-        </w:rPr>
-        <w:t>Age —</w:t>
-      </w:r>
-      <w:r>
-        <w:rPr>
-          <w:rFonts w:ascii="Arial" w:hAnsi="Arial"/>
-          <w:sz w:val="22"/>
-        </w:rPr>
-        <w:t xml:space="preserve"> con 19,9% de valores faltantes, se mantiene sin imputar en esta fase; se crea Age_registrada y se calcula, solo con fines diagnósticos, la mediana de edad por Pclass (37 años en 1ª clase, 29 en 2ª, 24 en 3ª) y se verifica que la proporción de faltantes difiere por clase (13,9% / 6,0% / 27,7%), lo que sugiere asociación con Pclass.</w:t>
-      </w:r>
-    </w:p>
-    <w:p>
-      <w:pPr>
-        <w:spacing w:line="276" w:lineRule="auto" w:after="0"/>
-        <w:ind w:left="180"/>
-      </w:pPr>
-      <w:r>
-        <w:rPr>
-          <w:rFonts w:ascii="Arial" w:hAnsi="Arial"/>
-          <w:sz w:val="22"/>
-        </w:rPr>
-        <w:t xml:space="preserve">• </w:t>
-      </w:r>
-      <w:r>
-        <w:rPr>
-          <w:rFonts w:ascii="Arial" w:hAnsi="Arial"/>
-          <w:b/>
-          <w:sz w:val="22"/>
-        </w:rPr>
-        <w:t>Embarked —</w:t>
-      </w:r>
-      <w:r>
-        <w:rPr>
-          <w:rFonts w:ascii="Arial" w:hAnsi="Arial"/>
-          <w:sz w:val="22"/>
-        </w:rPr>
-        <w:t xml:space="preserve"> solo 2 casos faltantes (0,22%); se imputan con la moda ('S'), generando Embarked_imputado, dado el impacto marginal sobre la muestra.</w:t>
-      </w:r>
-    </w:p>
-    <w:p>
-      <w:pPr>
-        <w:spacing w:line="276" w:lineRule="auto" w:after="0"/>
-        <w:ind w:left="180"/>
-      </w:pPr>
-      <w:r>
-        <w:rPr>
-          <w:rFonts w:ascii="Arial" w:hAnsi="Arial"/>
-          <w:sz w:val="22"/>
-        </w:rPr>
-        <w:t xml:space="preserve">• </w:t>
-      </w:r>
-      <w:r>
-        <w:rPr>
-          <w:rFonts w:ascii="Arial" w:hAnsi="Arial"/>
-          <w:b/>
-          <w:sz w:val="22"/>
-        </w:rPr>
-        <w:t>FamilySize / IsAlone —</w:t>
-      </w:r>
-      <w:r>
-        <w:rPr>
-          <w:rFonts w:ascii="Arial" w:hAnsi="Arial"/>
-          <w:sz w:val="22"/>
-        </w:rPr>
-        <w:t xml:space="preserve"> se combinan SibSp y Parch en FamilySize = SibSp + Parch + 1, y se deriva IsAlone, para observar el efecto del tamaño del grupo familiar sobre la supervivencia.</w:t>
-      </w:r>
-    </w:p>
-    <w:p>
-      <w:pPr>
-        <w:spacing w:line="276" w:lineRule="auto" w:after="0"/>
-        <w:ind w:left="180"/>
-      </w:pPr>
-      <w:r>
-        <w:rPr>
-          <w:rFonts w:ascii="Arial" w:hAnsi="Arial"/>
-          <w:sz w:val="22"/>
-        </w:rPr>
-        <w:t xml:space="preserve">• </w:t>
-      </w:r>
-      <w:r>
-        <w:rPr>
-          <w:rFonts w:ascii="Arial" w:hAnsi="Arial"/>
-          <w:b/>
-          <w:sz w:val="22"/>
-        </w:rPr>
-        <w:t>Title —</w:t>
-      </w:r>
-      <w:r>
-        <w:rPr>
-          <w:rFonts w:ascii="Arial" w:hAnsi="Arial"/>
-          <w:sz w:val="22"/>
-        </w:rPr>
-        <w:t xml:space="preserve"> se extrae el tratamiento (Mr., Mrs., Miss., Master., etc.) desde Name mediante expresión regular, agrupando categorías poco frecuentes en 'Other', para condensar información demográfica y de estatus.</w:t>
-      </w:r>
-    </w:p>
-    <w:p>
-      <w:pPr>
-        <w:spacing w:line="276" w:lineRule="auto" w:after="20"/>
-      </w:pPr>
-      <w:r>
-        <w:rPr>
-          <w:rFonts w:ascii="Arial" w:hAnsi="Arial"/>
-          <w:b w:val="0"/>
-          <w:i w:val="0"/>
-          <w:sz w:val="22"/>
-        </w:rPr>
-        <w:t>Estas decisiones y sus resultados intermedios (tabla de medianas por clase, distribución de títulos, vista del dataset ampliado) se documentan en el apartado V del notebook, y su efecto sobre la exploración se retoma explícitamente en el apartado VI.</w:t>
-      </w:r>
-    </w:p>
-    <w:p>
+          <w:iCs w:val="0"/>
+          <w:sz w:val="22"/>
+          <w:szCs w:val="22"/>
+        </w:rPr>
+      </w:pPr>
+    </w:p>
+    <w:p xmlns:wp14="http://schemas.microsoft.com/office/word/2010/wordml" wp14:textId="77777777">
       <w:pPr>
         <w:pStyle w:val="Ttulo2"/>
         <w:spacing w:before="0"/>
+        <w:jc w:val="both"/>
       </w:pPr>
       <w:r>
         <w:rPr/>
         <w:t>VI. Reproducibilidad y coherencia técnica</w:t>
       </w:r>
     </w:p>
+    <w:p xmlns:wp14="http://schemas.microsoft.com/office/word/2010/wordml" wp14:textId="6B9BAB77">
+      <w:pPr>
+        <w:pStyle w:val="Normal"/>
+      </w:pPr>
+      <w:r>
+        <w:rPr>
+          <w:rFonts w:ascii="Arial" w:hAnsi="Arial"/>
+          <w:b w:val="0"/>
+          <w:bCs w:val="0"/>
+          <w:i w:val="0"/>
+          <w:iCs w:val="0"/>
+          <w:sz w:val="22"/>
+          <w:szCs w:val="22"/>
+        </w:rPr>
+        <w:t>El notebook se ejecutó de principio a fin sin errores (</w:t>
+      </w:r>
+      <w:r>
+        <w:rPr>
+          <w:rFonts w:ascii="Arial" w:hAnsi="Arial"/>
+          <w:b w:val="0"/>
+          <w:bCs w:val="0"/>
+          <w:i w:val="0"/>
+          <w:iCs w:val="0"/>
+          <w:sz w:val="22"/>
+          <w:szCs w:val="22"/>
+        </w:rPr>
+        <w:t>jupyter</w:t>
+      </w:r>
+      <w:r>
+        <w:rPr>
+          <w:rFonts w:ascii="Arial" w:hAnsi="Arial"/>
+          <w:b w:val="0"/>
+          <w:bCs w:val="0"/>
+          <w:i w:val="0"/>
+          <w:iCs w:val="0"/>
+          <w:sz w:val="22"/>
+          <w:szCs w:val="22"/>
+        </w:rPr>
+        <w:t xml:space="preserve"> </w:t>
+      </w:r>
+      <w:r>
+        <w:rPr>
+          <w:rFonts w:ascii="Arial" w:hAnsi="Arial"/>
+          <w:b w:val="0"/>
+          <w:bCs w:val="0"/>
+          <w:i w:val="0"/>
+          <w:iCs w:val="0"/>
+          <w:sz w:val="22"/>
+          <w:szCs w:val="22"/>
+        </w:rPr>
+        <w:t>nbconvert</w:t>
+      </w:r>
+      <w:r>
+        <w:rPr>
+          <w:rFonts w:ascii="Arial" w:hAnsi="Arial"/>
+          <w:b w:val="0"/>
+          <w:bCs w:val="0"/>
+          <w:i w:val="0"/>
+          <w:iCs w:val="0"/>
+          <w:sz w:val="22"/>
+          <w:szCs w:val="22"/>
+        </w:rPr>
+        <w:t xml:space="preserve"> --</w:t>
+      </w:r>
+      <w:r>
+        <w:rPr>
+          <w:rFonts w:ascii="Arial" w:hAnsi="Arial"/>
+          <w:b w:val="0"/>
+          <w:bCs w:val="0"/>
+          <w:i w:val="0"/>
+          <w:iCs w:val="0"/>
+          <w:sz w:val="22"/>
+          <w:szCs w:val="22"/>
+        </w:rPr>
+        <w:t>execute</w:t>
+      </w:r>
+      <w:r>
+        <w:rPr>
+          <w:rFonts w:ascii="Arial" w:hAnsi="Arial"/>
+          <w:b w:val="0"/>
+          <w:bCs w:val="0"/>
+          <w:i w:val="0"/>
+          <w:iCs w:val="0"/>
+          <w:sz w:val="22"/>
+          <w:szCs w:val="22"/>
+        </w:rPr>
+        <w:t>), en orden secuencial de celdas, sin dependencias externas a los archivos del repositorio ni pasos manuales fuera del propio notebook. Los datos de entrada (data/Titanic-Dataset.csv) se cargan una única vez en el apartado III y todas las transformaciones posteriores (apartado V) se aplican sobre una copia explícita (</w:t>
+      </w:r>
+      <w:r>
+        <w:rPr>
+          <w:rFonts w:ascii="Arial" w:hAnsi="Arial"/>
+          <w:b w:val="0"/>
+          <w:bCs w:val="0"/>
+          <w:i w:val="0"/>
+          <w:iCs w:val="0"/>
+          <w:sz w:val="22"/>
+          <w:szCs w:val="22"/>
+        </w:rPr>
+        <w:t>titanic_exp</w:t>
+      </w:r>
+      <w:r>
+        <w:rPr>
+          <w:rFonts w:ascii="Arial" w:hAnsi="Arial"/>
+          <w:b w:val="0"/>
+          <w:bCs w:val="0"/>
+          <w:i w:val="0"/>
+          <w:iCs w:val="0"/>
+          <w:sz w:val="22"/>
+          <w:szCs w:val="22"/>
+        </w:rPr>
+        <w:t xml:space="preserve">), preservando el </w:t>
+      </w:r>
+      <w:r>
+        <w:rPr>
+          <w:rFonts w:ascii="Arial" w:hAnsi="Arial"/>
+          <w:b w:val="0"/>
+          <w:bCs w:val="0"/>
+          <w:i w:val="0"/>
+          <w:iCs w:val="0"/>
+          <w:sz w:val="22"/>
+          <w:szCs w:val="22"/>
+        </w:rPr>
+        <w:t>dataframe</w:t>
+      </w:r>
+      <w:r>
+        <w:rPr>
+          <w:rFonts w:ascii="Arial" w:hAnsi="Arial"/>
+          <w:b w:val="0"/>
+          <w:bCs w:val="0"/>
+          <w:i w:val="0"/>
+          <w:iCs w:val="0"/>
+          <w:sz w:val="22"/>
+          <w:szCs w:val="22"/>
+        </w:rPr>
+        <w:t xml:space="preserve"> original para trazabilidad. Los resultados presentados en los apartados IV y VI del notebook son reproducibles directamente a partir de esa cadena de transformaciones, sin valores '</w:t>
+      </w:r>
+      <w:r>
+        <w:rPr>
+          <w:rFonts w:ascii="Arial" w:hAnsi="Arial"/>
+          <w:b w:val="0"/>
+          <w:bCs w:val="0"/>
+          <w:i w:val="0"/>
+          <w:iCs w:val="0"/>
+          <w:sz w:val="22"/>
+          <w:szCs w:val="22"/>
+        </w:rPr>
+        <w:t>hardcodeados</w:t>
+      </w:r>
+      <w:r>
+        <w:rPr>
+          <w:rFonts w:ascii="Arial" w:hAnsi="Arial"/>
+          <w:b w:val="0"/>
+          <w:bCs w:val="0"/>
+          <w:i w:val="0"/>
+          <w:iCs w:val="0"/>
+          <w:sz w:val="22"/>
+          <w:szCs w:val="22"/>
+        </w:rPr>
+        <w:t>' que no puedan regenerarse desde el código.</w:t>
+      </w:r>
+    </w:p>
+    <w:p xmlns:wp14="http://schemas.microsoft.com/office/word/2010/wordml" wp14:textId="77777777">
+      <w:pPr>
+        <w:spacing w:after="20" w:line="276" w:lineRule="auto"/>
+        <w:jc w:val="both"/>
+      </w:pPr>
+      <w:r>
+        <w:rPr>
+          <w:rFonts w:ascii="Arial" w:hAnsi="Arial"/>
+          <w:b w:val="0"/>
+          <w:bCs w:val="0"/>
+          <w:i w:val="0"/>
+          <w:iCs w:val="0"/>
+          <w:sz w:val="22"/>
+          <w:szCs w:val="22"/>
+        </w:rPr>
+        <w:t>Criterios básicos de organización aplicados, en línea con las prácticas de reproducibilidad del curso (Paraíso, 2026; Wilson et al., 2017): importación única de librerías y configuración fija de estilo gráfico (sns.set_theme) al inicio, rutas relativas (../data, ../figures) para portabilidad del proyecto, y persistencia de las figuras generadas en figures/ con nombres identificables (f1_titanic_*.png), lo que permite verificar cada resultado gráfico citado en este informe contra su salida original en el notebook.</w:t>
+      </w:r>
+    </w:p>
     <w:p>
       <w:pPr>
-        <w:spacing w:line="276" w:lineRule="auto" w:after="20"/>
-      </w:pPr>
-      <w:r>
+        <w:spacing w:after="20" w:line="276" w:lineRule="auto"/>
+        <w:jc w:val="both"/>
         <w:rPr>
           <w:rFonts w:ascii="Arial" w:hAnsi="Arial"/>
           <w:b w:val="0"/>
+          <w:bCs w:val="0"/>
           <w:i w:val="0"/>
-          <w:sz w:val="22"/>
-        </w:rPr>
-        <w:t>El notebook se ejecutó de principio a fin sin errores (jupyter nbconvert --execute), en orden secuencial de celdas, sin dependencias externas a los archivos del repositorio ni pasos manuales fuera del propio notebook. Los datos de entrada (data/Titanic-Dataset.csv) se cargan una única vez en el apartado III y todas las transformaciones posteriores (apartado V) se aplican sobre una copia explícita (titanic_exp), preservando el dataframe original para trazabilidad. Los resultados presentados en los apartados IV y VI del notebook son reproducibles directamente a partir de esa cadena de transformaciones, sin valores 'hardcodeados' que no puedan regenerarse desde el código.</w:t>
-      </w:r>
-    </w:p>
-    <w:p>
-      <w:pPr>
-        <w:spacing w:line="276" w:lineRule="auto" w:after="20"/>
-      </w:pPr>
-      <w:r>
-        <w:rPr>
-          <w:rFonts w:ascii="Arial" w:hAnsi="Arial"/>
-          <w:b w:val="0"/>
-          <w:i w:val="0"/>
-          <w:sz w:val="22"/>
-        </w:rPr>
-        <w:t>Criterios básicos de organización aplicados, en línea con las prácticas de reproducibilidad del curso (Paraíso, 2026; Wilson et al., 2017): importación única de librerías y configuración fija de estilo gráfico (sns.set_theme) al inicio, rutas relativas (../data, ../figures) para portabilidad del proyecto, y persistencia de las figuras generadas en figures/ con nombres identificables (f1_titanic_*.png), lo que permite verificar cada resultado gráfico citado en este informe contra su salida original en el notebook.</w:t>
-      </w:r>
-    </w:p>
-    <w:p>
+          <w:iCs w:val="0"/>
+          <w:sz w:val="22"/>
+          <w:szCs w:val="22"/>
+        </w:rPr>
+      </w:pPr>
+    </w:p>
+    <w:p xmlns:wp14="http://schemas.microsoft.com/office/word/2010/wordml" wp14:textId="77777777">
       <w:pPr>
         <w:pStyle w:val="Ttulo2"/>
         <w:spacing w:before="0"/>
+        <w:jc w:val="both"/>
       </w:pPr>
       <w:r>
         <w:rPr/>
         <w:t>VII. Registro del proceso, supuestos y limitaciones</w:t>
       </w:r>
     </w:p>
+    <w:p xmlns:wp14="http://schemas.microsoft.com/office/word/2010/wordml" wp14:textId="77777777">
+      <w:pPr>
+        <w:spacing w:after="20" w:line="276" w:lineRule="auto"/>
+        <w:jc w:val="both"/>
+      </w:pPr>
+      <w:r>
+        <w:rPr>
+          <w:rFonts w:ascii="Arial" w:hAnsi="Arial"/>
+          <w:b w:val="1"/>
+          <w:bCs w:val="1"/>
+          <w:i w:val="0"/>
+          <w:iCs w:val="0"/>
+          <w:sz w:val="22"/>
+          <w:szCs w:val="22"/>
+        </w:rPr>
+        <w:t>Pasos principales seguidos durante la exploración:</w:t>
+      </w:r>
+      <w:r>
+        <w:rPr>
+          <w:b w:val="0"/>
+          <w:bCs w:val="0"/>
+          <w:sz w:val="22"/>
+          <w:szCs w:val="22"/>
+        </w:rPr>
+        <w:t xml:space="preserve"> carga del dataset y revisión de dimensiones, tipos de datos y valores faltantes (apartado III); estadísticas descriptivas y visualizaciones univariadas de variables numéricas y categóricas (apartado IV); documentación de cinco decisiones exploratorias y variables derivadas (apartado V); análisis bivariado frente a Survived, detección de outliers con IQR y matriz de correlación (apartado VI); síntesis de hallazgos y proyección (apartado VIII).</w:t>
+      </w:r>
+    </w:p>
+    <w:p xmlns:wp14="http://schemas.microsoft.com/office/word/2010/wordml" wp14:textId="77777777">
+      <w:pPr>
+        <w:spacing w:after="20" w:line="276" w:lineRule="auto"/>
+        <w:jc w:val="both"/>
+      </w:pPr>
+      <w:r>
+        <w:rPr>
+          <w:rFonts w:ascii="Arial" w:hAnsi="Arial"/>
+          <w:b w:val="1"/>
+          <w:bCs w:val="1"/>
+          <w:i w:val="0"/>
+          <w:iCs w:val="0"/>
+          <w:sz w:val="22"/>
+          <w:szCs w:val="22"/>
+        </w:rPr>
+        <w:t>Supuestos considerados:</w:t>
+      </w:r>
+      <w:r>
+        <w:rPr>
+          <w:b w:val="0"/>
+          <w:bCs w:val="0"/>
+          <w:sz w:val="22"/>
+          <w:szCs w:val="22"/>
+        </w:rPr>
+        <w:t xml:space="preserve"> el dataset no contiene duplicados relevantes (PassengerId es único) y refleja fielmente la información oficial disponible; la ausencia de Age podría estar asociada a variables observadas como Pclass; para Cabin no se evalúa el mecanismo de ausencia y su tratamiento se posterga por su elevada proporción de faltantes; ninguna se imputa de forma definitiva.</w:t>
+      </w:r>
+    </w:p>
+    <w:p xmlns:wp14="http://schemas.microsoft.com/office/word/2010/wordml" wp14:textId="77777777">
+      <w:pPr>
+        <w:spacing w:after="20" w:line="276" w:lineRule="auto"/>
+        <w:jc w:val="both"/>
+      </w:pPr>
+      <w:r>
+        <w:rPr>
+          <w:rFonts w:ascii="Arial" w:hAnsi="Arial"/>
+          <w:b w:val="1"/>
+          <w:bCs w:val="1"/>
+          <w:i w:val="0"/>
+          <w:iCs w:val="0"/>
+          <w:sz w:val="22"/>
+          <w:szCs w:val="22"/>
+        </w:rPr>
+        <w:t>Limitaciones detectadas:</w:t>
+      </w:r>
+      <w:r>
+        <w:rPr>
+          <w:b w:val="0"/>
+          <w:bCs w:val="0"/>
+          <w:sz w:val="22"/>
+          <w:szCs w:val="22"/>
+        </w:rPr>
+        <w:t xml:space="preserve"> Cabin es inutilizable de forma directa por su altísima tasa de valores faltantes (77,1%); solo se aprovechó como indicador binario; el 19,9% de valores faltantes en Age limita la robustez de los análisis que la involucran; no se realizaron pruebas estadísticas formales de asociación (p. ej., chi-cuadrado); las lecturas de esta fase son descriptivas, no inferenciales.</w:t>
+      </w:r>
+    </w:p>
+    <w:p xmlns:wp14="http://schemas.microsoft.com/office/word/2010/wordml" wp14:textId="77777777">
+      <w:pPr>
+        <w:spacing w:after="20" w:line="276" w:lineRule="auto"/>
+        <w:jc w:val="both"/>
+      </w:pPr>
+      <w:r>
+        <w:rPr>
+          <w:rFonts w:ascii="Arial" w:hAnsi="Arial"/>
+          <w:b w:val="0"/>
+          <w:bCs w:val="0"/>
+          <w:i w:val="0"/>
+          <w:iCs w:val="0"/>
+          <w:sz w:val="22"/>
+          <w:szCs w:val="22"/>
+        </w:rPr>
+        <w:t>Alcances de esta primera implementación y aspectos pendientes para fases posteriores: definir la estrategia final de imputación de Age, decidir el tratamiento definitivo de Cabin, evaluar el tratamiento de outliers en Fare, y codificar variables y particionar los datos para el modelado predictivo.</w:t>
+      </w:r>
+    </w:p>
     <w:p>
       <w:pPr>
-        <w:spacing w:line="276" w:lineRule="auto" w:after="20"/>
-      </w:pPr>
-      <w:r>
-        <w:rPr>
-          <w:rFonts w:ascii="Arial" w:hAnsi="Arial"/>
-          <w:b/>
+        <w:spacing w:after="20" w:line="276" w:lineRule="auto"/>
+        <w:jc w:val="both"/>
+        <w:rPr>
+          <w:rFonts w:ascii="Arial" w:hAnsi="Arial"/>
+          <w:b w:val="0"/>
+          <w:bCs w:val="0"/>
           <w:i w:val="0"/>
-          <w:sz w:val="22"/>
-        </w:rPr>
-        <w:t>Pasos principales seguidos durante la exploración:</w:t>
-      </w:r>
-      <w:r>
-        <w:rPr>
-          <w:b w:val="0"/>
-          <w:sz w:val="22"/>
-        </w:rPr>
-        <w:t xml:space="preserve"> carga del dataset y revisión de dimensiones, tipos de datos y valores faltantes (apartado III); estadísticas descriptivas y visualizaciones univariadas de variables numéricas y categóricas (apartado IV); documentación de cinco decisiones exploratorias y variables derivadas (apartado V); análisis bivariado frente a Survived, detección de outliers con IQR y matriz de correlación (apartado VI); síntesis de hallazgos y proyección (apartado VIII).</w:t>
-      </w:r>
-    </w:p>
-    <w:p>
-      <w:pPr>
-        <w:spacing w:line="276" w:lineRule="auto" w:after="20"/>
-      </w:pPr>
-      <w:r>
-        <w:rPr>
-          <w:rFonts w:ascii="Arial" w:hAnsi="Arial"/>
-          <w:b/>
-          <w:i w:val="0"/>
-          <w:sz w:val="22"/>
-        </w:rPr>
-        <w:t>Supuestos considerados:</w:t>
-      </w:r>
-      <w:r>
-        <w:rPr>
-          <w:b w:val="0"/>
-          <w:sz w:val="22"/>
-        </w:rPr>
-        <w:t xml:space="preserve"> el dataset no contiene duplicados relevantes (PassengerId es único) y refleja fielmente la información oficial disponible; la ausencia de Age podría estar asociada a variables observadas como Pclass; para Cabin no se evalúa el mecanismo de ausencia y su tratamiento se posterga por su elevada proporción de faltantes; ninguna se imputa de forma definitiva.</w:t>
-      </w:r>
-    </w:p>
-    <w:p>
-      <w:pPr>
-        <w:spacing w:line="276" w:lineRule="auto" w:after="20"/>
-      </w:pPr>
-      <w:r>
-        <w:rPr>
-          <w:rFonts w:ascii="Arial" w:hAnsi="Arial"/>
-          <w:b/>
-          <w:i w:val="0"/>
-          <w:sz w:val="22"/>
-        </w:rPr>
-        <w:t>Limitaciones detectadas:</w:t>
-      </w:r>
-      <w:r>
-        <w:rPr>
-          <w:b w:val="0"/>
-          <w:sz w:val="22"/>
-        </w:rPr>
-        <w:t xml:space="preserve"> Cabin es inutilizable de forma directa por su altísima tasa de valores faltantes (77,1%); solo se aprovechó como indicador binario; el 19,9% de valores faltantes en Age limita la robustez de los análisis que la involucran; no se realizaron pruebas estadísticas formales de asociación (p. ej., chi-cuadrado); las lecturas de esta fase son descriptivas, no inferenciales.</w:t>
-      </w:r>
-    </w:p>
-    <w:p>
-      <w:pPr>
-        <w:spacing w:line="276" w:lineRule="auto" w:after="20"/>
-      </w:pPr>
-      <w:r>
-        <w:rPr>
-          <w:rFonts w:ascii="Arial" w:hAnsi="Arial"/>
-          <w:b w:val="0"/>
-          <w:i w:val="0"/>
-          <w:sz w:val="22"/>
-        </w:rPr>
-        <w:t>Alcances de esta primera implementación y aspectos pendientes para fases posteriores: definir la estrategia final de imputación de Age, decidir el tratamiento definitivo de Cabin, evaluar el tratamiento de outliers en Fare, y codificar variables y particionar los datos para el modelado predictivo.</w:t>
-      </w:r>
-    </w:p>
-    <w:p>
+          <w:iCs w:val="0"/>
+          <w:sz w:val="22"/>
+          <w:szCs w:val="22"/>
+        </w:rPr>
+      </w:pPr>
+    </w:p>
+    <w:p xmlns:wp14="http://schemas.microsoft.com/office/word/2010/wordml" wp14:textId="77777777">
       <w:pPr>
         <w:pStyle w:val="Ttulo2"/>
         <w:spacing w:before="0"/>
+        <w:jc w:val="both"/>
       </w:pPr>
       <w:r>
         <w:rPr/>
         <w:t>VIII. Hallazgos exploratorios iniciales y referencias al notebook</w:t>
       </w:r>
     </w:p>
+    <w:p xmlns:wp14="http://schemas.microsoft.com/office/word/2010/wordml" wp14:textId="77777777">
+      <w:pPr>
+        <w:spacing w:after="0" w:line="276" w:lineRule="auto"/>
+        <w:ind w:left="180"/>
+        <w:jc w:val="both"/>
+      </w:pPr>
+      <w:r>
+        <w:rPr>
+          <w:rFonts w:ascii="Arial" w:hAnsi="Arial"/>
+          <w:sz w:val="22"/>
+          <w:szCs w:val="22"/>
+        </w:rPr>
+        <w:t xml:space="preserve">• </w:t>
+      </w:r>
+      <w:r>
+        <w:rPr>
+          <w:rFonts w:ascii="Arial" w:hAnsi="Arial"/>
+          <w:b w:val="1"/>
+          <w:bCs w:val="1"/>
+          <w:sz w:val="22"/>
+          <w:szCs w:val="22"/>
+        </w:rPr>
+        <w:t>Supervivencia global —</w:t>
+      </w:r>
+      <w:r>
+        <w:rPr>
+          <w:rFonts w:ascii="Arial" w:hAnsi="Arial"/>
+          <w:sz w:val="22"/>
+          <w:szCs w:val="22"/>
+        </w:rPr>
+        <w:t xml:space="preserve"> la tasa de supervivencia global es 38,4% (342 de 891 pasajeros). Véase notebook, apartado IV, conteo de Survived.</w:t>
+      </w:r>
+    </w:p>
+    <w:p xmlns:wp14="http://schemas.microsoft.com/office/word/2010/wordml" wp14:textId="77777777">
+      <w:pPr>
+        <w:spacing w:after="0" w:line="276" w:lineRule="auto"/>
+        <w:ind w:left="180"/>
+        <w:jc w:val="both"/>
+      </w:pPr>
+      <w:r>
+        <w:rPr>
+          <w:rFonts w:ascii="Arial" w:hAnsi="Arial"/>
+          <w:sz w:val="22"/>
+          <w:szCs w:val="22"/>
+        </w:rPr>
+        <w:t xml:space="preserve">• </w:t>
+      </w:r>
+      <w:r>
+        <w:rPr>
+          <w:rFonts w:ascii="Arial" w:hAnsi="Arial"/>
+          <w:b w:val="1"/>
+          <w:bCs w:val="1"/>
+          <w:sz w:val="22"/>
+          <w:szCs w:val="22"/>
+        </w:rPr>
+        <w:t>Sexo y clase de pasaje —</w:t>
+      </w:r>
+      <w:r>
+        <w:rPr>
+          <w:rFonts w:ascii="Arial" w:hAnsi="Arial"/>
+          <w:sz w:val="22"/>
+          <w:szCs w:val="22"/>
+        </w:rPr>
+        <w:t xml:space="preserve"> las mujeres sobrevivieron en 74,2% de los casos frente a 18,9% de los hombres; la supervivencia decrece con la clase de pasaje (1ª: 63,0%, 2ª: 47,3%, 3ª: 24,2%). Véase notebook, apartado VI, figura f1_titanic_supervivencia_categoricas.png.</w:t>
+      </w:r>
+    </w:p>
+    <w:p xmlns:wp14="http://schemas.microsoft.com/office/word/2010/wordml" wp14:textId="77777777">
+      <w:pPr>
+        <w:spacing w:after="0" w:line="276" w:lineRule="auto"/>
+        <w:ind w:left="180"/>
+        <w:jc w:val="both"/>
+      </w:pPr>
+      <w:r>
+        <w:rPr>
+          <w:rFonts w:ascii="Arial" w:hAnsi="Arial"/>
+          <w:sz w:val="22"/>
+          <w:szCs w:val="22"/>
+        </w:rPr>
+        <w:t xml:space="preserve">• </w:t>
+      </w:r>
+      <w:r>
+        <w:rPr>
+          <w:rFonts w:ascii="Arial" w:hAnsi="Arial"/>
+          <w:b w:val="1"/>
+          <w:bCs w:val="1"/>
+          <w:sz w:val="22"/>
+          <w:szCs w:val="22"/>
+        </w:rPr>
+        <w:t>Tarifa y correlaciones —</w:t>
+      </w:r>
+      <w:r>
+        <w:rPr>
+          <w:rFonts w:ascii="Arial" w:hAnsi="Arial"/>
+          <w:sz w:val="22"/>
+          <w:szCs w:val="22"/>
+        </w:rPr>
+        <w:t xml:space="preserve"> Fare se asocia positivamente con la supervivencia y Pclass negativamente, de forma consistente con el patrón anterior; entre las variables originales las correlaciones son moderadas o bajas, mientras que FamilySize correlaciona alto con SibSp (0,89) y Parch (0,78) por construcción, lo que condiciona su uso conjunto en el modelado. Véase notebook, apartado VI, figura f1_titanic_correlacion.png.</w:t>
+      </w:r>
+    </w:p>
+    <w:p xmlns:wp14="http://schemas.microsoft.com/office/word/2010/wordml" wp14:textId="77777777">
+      <w:pPr>
+        <w:spacing w:after="0" w:line="276" w:lineRule="auto"/>
+        <w:ind w:left="180"/>
+        <w:jc w:val="both"/>
+      </w:pPr>
+      <w:r>
+        <w:rPr>
+          <w:rFonts w:ascii="Arial" w:hAnsi="Arial"/>
+          <w:sz w:val="22"/>
+          <w:szCs w:val="22"/>
+        </w:rPr>
+        <w:t xml:space="preserve">• </w:t>
+      </w:r>
+      <w:r>
+        <w:rPr>
+          <w:rFonts w:ascii="Arial" w:hAnsi="Arial"/>
+          <w:b w:val="1"/>
+          <w:bCs w:val="1"/>
+          <w:sz w:val="22"/>
+          <w:szCs w:val="22"/>
+        </w:rPr>
+        <w:t>Composición familiar y título —</w:t>
+      </w:r>
+      <w:r>
+        <w:rPr>
+          <w:rFonts w:ascii="Arial" w:hAnsi="Arial"/>
+          <w:sz w:val="22"/>
+          <w:szCs w:val="22"/>
+        </w:rPr>
+        <w:t xml:space="preserve"> viajar acompañado (IsAlone = 0) se asocia a mayor supervivencia (50,6%) que viajar solo (30,4%); el título extraído del nombre reproduce con más matiz el patrón por sexo y clase. Véase notebook, apartado VI, figura f1_titanic_familia_titulo.png.</w:t>
+      </w:r>
+    </w:p>
+    <w:p xmlns:wp14="http://schemas.microsoft.com/office/word/2010/wordml" wp14:textId="77777777">
+      <w:pPr>
+        <w:spacing w:after="0" w:line="276" w:lineRule="auto"/>
+        <w:ind w:left="180"/>
+        <w:jc w:val="both"/>
+      </w:pPr>
+      <w:r>
+        <w:rPr>
+          <w:rFonts w:ascii="Arial" w:hAnsi="Arial"/>
+          <w:sz w:val="22"/>
+          <w:szCs w:val="22"/>
+        </w:rPr>
+        <w:t xml:space="preserve">• </w:t>
+      </w:r>
+      <w:r>
+        <w:rPr>
+          <w:rFonts w:ascii="Arial" w:hAnsi="Arial"/>
+          <w:b w:val="1"/>
+          <w:bCs w:val="1"/>
+          <w:sz w:val="22"/>
+          <w:szCs w:val="22"/>
+        </w:rPr>
+        <w:t>Valores atípicos —</w:t>
+      </w:r>
+      <w:r>
+        <w:rPr>
+          <w:rFonts w:ascii="Arial" w:hAnsi="Arial"/>
+          <w:sz w:val="22"/>
+          <w:szCs w:val="22"/>
+        </w:rPr>
+        <w:t xml:space="preserve"> Fare presenta 13,0% de valores atípicos (tarifas muy altas) y Age un 1,5%, detectados mediante la regla IQR; no se removieron en esta fase. Véase notebook, apartado VI, celda detectar_outliers_iqr y boxplots f1_titanic_boxplots_survived.png.</w:t>
+      </w:r>
+    </w:p>
+    <w:p xmlns:wp14="http://schemas.microsoft.com/office/word/2010/wordml" wp14:textId="77777777">
+      <w:pPr>
+        <w:spacing w:after="20" w:line="276" w:lineRule="auto"/>
+        <w:jc w:val="both"/>
+      </w:pPr>
+      <w:r>
+        <w:rPr>
+          <w:rFonts w:ascii="Arial" w:hAnsi="Arial"/>
+          <w:b w:val="0"/>
+          <w:bCs w:val="0"/>
+          <w:i w:val="0"/>
+          <w:iCs w:val="0"/>
+          <w:sz w:val="22"/>
+          <w:szCs w:val="22"/>
+        </w:rPr>
+        <w:t>Interpretación breve: los hallazgos reproducen el patrón histórico conocido del hundimiento (prioridad de evacuación de mujeres, niños y pasajeros de clases altas) y sugieren que Pclass, Sex, Fare y las variables derivadas de composición familiar son candidatas relevantes para el modelado predictivo de fases posteriores, mientras que Age y Cabin requieren un tratamiento de datos faltantes más cuidadoso antes de incorporarse plenamente al análisis.</w:t>
+      </w:r>
+    </w:p>
     <w:p>
       <w:pPr>
-        <w:spacing w:line="276" w:lineRule="auto" w:after="0"/>
-        <w:ind w:left="180"/>
-      </w:pPr>
-      <w:r>
-        <w:rPr>
-          <w:rFonts w:ascii="Arial" w:hAnsi="Arial"/>
-          <w:sz w:val="22"/>
-        </w:rPr>
-        <w:t xml:space="preserve">• </w:t>
-      </w:r>
-      <w:r>
-        <w:rPr>
-          <w:rFonts w:ascii="Arial" w:hAnsi="Arial"/>
-          <w:b/>
-          <w:sz w:val="22"/>
-        </w:rPr>
-        <w:t>Supervivencia global —</w:t>
-      </w:r>
-      <w:r>
-        <w:rPr>
-          <w:rFonts w:ascii="Arial" w:hAnsi="Arial"/>
-          <w:sz w:val="22"/>
-        </w:rPr>
-        <w:t xml:space="preserve"> la tasa de supervivencia global es 38,4% (342 de 891 pasajeros). Véase notebook, apartado IV, conteo de Survived.</w:t>
-      </w:r>
-    </w:p>
-    <w:p>
-      <w:pPr>
-        <w:spacing w:line="276" w:lineRule="auto" w:after="0"/>
-        <w:ind w:left="180"/>
-      </w:pPr>
-      <w:r>
-        <w:rPr>
-          <w:rFonts w:ascii="Arial" w:hAnsi="Arial"/>
-          <w:sz w:val="22"/>
-        </w:rPr>
-        <w:t xml:space="preserve">• </w:t>
-      </w:r>
-      <w:r>
-        <w:rPr>
-          <w:rFonts w:ascii="Arial" w:hAnsi="Arial"/>
-          <w:b/>
-          <w:sz w:val="22"/>
-        </w:rPr>
-        <w:t>Sexo y clase de pasaje —</w:t>
-      </w:r>
-      <w:r>
-        <w:rPr>
-          <w:rFonts w:ascii="Arial" w:hAnsi="Arial"/>
-          <w:sz w:val="22"/>
-        </w:rPr>
-        <w:t xml:space="preserve"> las mujeres sobrevivieron en 74,2% de los casos frente a 18,9% de los hombres; la supervivencia decrece con la clase de pasaje (1ª: 63,0%, 2ª: 47,3%, 3ª: 24,2%). Véase notebook, apartado VI, figura f1_titanic_supervivencia_categoricas.png.</w:t>
-      </w:r>
-    </w:p>
-    <w:p>
-      <w:pPr>
-        <w:spacing w:line="276" w:lineRule="auto" w:after="0"/>
-        <w:ind w:left="180"/>
-      </w:pPr>
-      <w:r>
-        <w:rPr>
-          <w:rFonts w:ascii="Arial" w:hAnsi="Arial"/>
-          <w:sz w:val="22"/>
-        </w:rPr>
-        <w:t xml:space="preserve">• </w:t>
-      </w:r>
-      <w:r>
-        <w:rPr>
-          <w:rFonts w:ascii="Arial" w:hAnsi="Arial"/>
-          <w:b/>
-          <w:sz w:val="22"/>
-        </w:rPr>
-        <w:t>Tarifa y correlaciones —</w:t>
-      </w:r>
-      <w:r>
-        <w:rPr>
-          <w:rFonts w:ascii="Arial" w:hAnsi="Arial"/>
-          <w:sz w:val="22"/>
-        </w:rPr>
-        <w:t xml:space="preserve"> Fare se asocia positivamente con la supervivencia y Pclass negativamente, de forma consistente con el patrón anterior; entre las variables originales las correlaciones son moderadas o bajas, mientras que FamilySize correlaciona alto con SibSp (0,89) y Parch (0,78) por construcción, lo que condiciona su uso conjunto en el modelado. Véase notebook, apartado VI, figura f1_titanic_correlacion.png.</w:t>
-      </w:r>
-    </w:p>
-    <w:p>
-      <w:pPr>
-        <w:spacing w:line="276" w:lineRule="auto" w:after="0"/>
-        <w:ind w:left="180"/>
-      </w:pPr>
-      <w:r>
-        <w:rPr>
-          <w:rFonts w:ascii="Arial" w:hAnsi="Arial"/>
-          <w:sz w:val="22"/>
-        </w:rPr>
-        <w:t xml:space="preserve">• </w:t>
-      </w:r>
-      <w:r>
-        <w:rPr>
-          <w:rFonts w:ascii="Arial" w:hAnsi="Arial"/>
-          <w:b/>
-          <w:sz w:val="22"/>
-        </w:rPr>
-        <w:t>Composición familiar y título —</w:t>
-      </w:r>
-      <w:r>
-        <w:rPr>
-          <w:rFonts w:ascii="Arial" w:hAnsi="Arial"/>
-          <w:sz w:val="22"/>
-        </w:rPr>
-        <w:t xml:space="preserve"> viajar acompañado (IsAlone = 0) se asocia a mayor supervivencia (50,6%) que viajar solo (30,4%); el título extraído del nombre reproduce con más matiz el patrón por sexo y clase. Véase notebook, apartado VI, figura f1_titanic_familia_titulo.png.</w:t>
-      </w:r>
-    </w:p>
-    <w:p>
-      <w:pPr>
-        <w:spacing w:line="276" w:lineRule="auto" w:after="0"/>
-        <w:ind w:left="180"/>
-      </w:pPr>
-      <w:r>
-        <w:rPr>
-          <w:rFonts w:ascii="Arial" w:hAnsi="Arial"/>
-          <w:sz w:val="22"/>
-        </w:rPr>
-        <w:t xml:space="preserve">• </w:t>
-      </w:r>
-      <w:r>
-        <w:rPr>
-          <w:rFonts w:ascii="Arial" w:hAnsi="Arial"/>
-          <w:b/>
-          <w:sz w:val="22"/>
-        </w:rPr>
-        <w:t>Valores atípicos —</w:t>
-      </w:r>
-      <w:r>
-        <w:rPr>
-          <w:rFonts w:ascii="Arial" w:hAnsi="Arial"/>
-          <w:sz w:val="22"/>
-        </w:rPr>
-        <w:t xml:space="preserve"> Fare presenta 13,0% de valores atípicos (tarifas muy altas) y Age un 1,5%, detectados mediante la regla IQR; no se removieron en esta fase. Véase notebook, apartado VI, celda detectar_outliers_iqr y boxplots f1_titanic_boxplots_survived.png.</w:t>
-      </w:r>
-    </w:p>
-    <w:p>
-      <w:pPr>
-        <w:spacing w:line="276" w:lineRule="auto" w:after="20"/>
-      </w:pPr>
-      <w:r>
+        <w:spacing w:after="20" w:line="276" w:lineRule="auto"/>
+        <w:jc w:val="both"/>
         <w:rPr>
           <w:rFonts w:ascii="Arial" w:hAnsi="Arial"/>
           <w:b w:val="0"/>
+          <w:bCs w:val="0"/>
           <w:i w:val="0"/>
-          <w:sz w:val="22"/>
-        </w:rPr>
-        <w:t>Interpretación breve: los hallazgos reproducen el patrón histórico conocido del hundimiento (prioridad de evacuación de mujeres, niños y pasajeros de clases altas) y sugieren que Pclass, Sex, Fare y las variables derivadas de composición familiar son candidatas relevantes para el modelado predictivo de fases posteriores, mientras que Age y Cabin requieren un tratamiento de datos faltantes más cuidadoso antes de incorporarse plenamente al análisis.</w:t>
-      </w:r>
-    </w:p>
-    <w:p>
+          <w:iCs w:val="0"/>
+          <w:sz w:val="22"/>
+          <w:szCs w:val="22"/>
+        </w:rPr>
+      </w:pPr>
+    </w:p>
+    <w:p xmlns:wp14="http://schemas.microsoft.com/office/word/2010/wordml" wp14:textId="77777777">
       <w:pPr>
         <w:pStyle w:val="Ttulo2"/>
         <w:spacing w:before="0"/>
+        <w:jc w:val="both"/>
       </w:pPr>
       <w:r>
         <w:rPr/>
         <w:t>IX. Bibliografía</w:t>
       </w:r>
     </w:p>
-    <w:p>
-      <w:pPr>
-        <w:spacing w:line="276" w:lineRule="auto" w:after="0"/>
+    <w:p xmlns:wp14="http://schemas.microsoft.com/office/word/2010/wordml" wp14:textId="77777777">
+      <w:pPr>
+        <w:spacing w:after="0" w:line="276" w:lineRule="auto"/>
         <w:ind w:left="432" w:hanging="432"/>
+        <w:jc w:val="both"/>
       </w:pPr>
       <w:r>
         <w:rPr>
           <w:rFonts w:ascii="Arial" w:hAnsi="Arial"/>
           <w:i w:val="0"/>
-          <w:sz w:val="22"/>
+          <w:iCs w:val="0"/>
+          <w:sz w:val="22"/>
+          <w:szCs w:val="22"/>
         </w:rPr>
         <w:t xml:space="preserve">Kaggle. (s. f.). </w:t>
       </w:r>
       <w:r>
         <w:rPr>
           <w:rFonts w:ascii="Arial" w:hAnsi="Arial"/>
-          <w:i/>
-          <w:sz w:val="22"/>
+          <w:i w:val="1"/>
+          <w:iCs w:val="1"/>
+          <w:sz w:val="22"/>
+          <w:szCs w:val="22"/>
         </w:rPr>
         <w:t>Titanic - Machine Learning from Disaster</w:t>
       </w:r>
@@ -2003,28 +2434,34 @@
         <w:rPr>
           <w:rFonts w:ascii="Arial" w:hAnsi="Arial"/>
           <w:sz w:val="22"/>
+          <w:szCs w:val="22"/>
         </w:rPr>
         <w:t xml:space="preserve"> [Conjunto de datos]. https://www.kaggle.com/c/titanic</w:t>
       </w:r>
     </w:p>
-    <w:p>
-      <w:pPr>
-        <w:spacing w:line="276" w:lineRule="auto" w:after="0"/>
+    <w:p xmlns:wp14="http://schemas.microsoft.com/office/word/2010/wordml" wp14:textId="77777777">
+      <w:pPr>
+        <w:spacing w:after="0" w:line="276" w:lineRule="auto"/>
         <w:ind w:left="432" w:hanging="432"/>
+        <w:jc w:val="both"/>
       </w:pPr>
       <w:r>
         <w:rPr>
           <w:rFonts w:ascii="Arial" w:hAnsi="Arial"/>
           <w:i w:val="0"/>
-          <w:sz w:val="22"/>
+          <w:iCs w:val="0"/>
+          <w:sz w:val="22"/>
+          <w:szCs w:val="22"/>
         </w:rPr>
         <w:t xml:space="preserve">McKinney, W. (2010). Data structures for statistical computing in Python. </w:t>
       </w:r>
       <w:r>
         <w:rPr>
           <w:rFonts w:ascii="Arial" w:hAnsi="Arial"/>
-          <w:i/>
-          <w:sz w:val="22"/>
+          <w:i w:val="1"/>
+          <w:iCs w:val="1"/>
+          <w:sz w:val="22"/>
+          <w:szCs w:val="22"/>
         </w:rPr>
         <w:t>Proceedings of the 9th Python in Science Conference</w:t>
       </w:r>
@@ -2032,28 +2469,34 @@
         <w:rPr>
           <w:rFonts w:ascii="Arial" w:hAnsi="Arial"/>
           <w:sz w:val="22"/>
+          <w:szCs w:val="22"/>
         </w:rPr>
         <w:t>, 56–61. https://doi.org/10.25080/Majora-92bf1922-00a</w:t>
       </w:r>
     </w:p>
-    <w:p>
-      <w:pPr>
-        <w:spacing w:line="276" w:lineRule="auto" w:after="0"/>
+    <w:p xmlns:wp14="http://schemas.microsoft.com/office/word/2010/wordml" wp14:textId="77777777">
+      <w:pPr>
+        <w:spacing w:after="0" w:line="276" w:lineRule="auto"/>
         <w:ind w:left="432" w:hanging="432"/>
+        <w:jc w:val="both"/>
       </w:pPr>
       <w:r>
         <w:rPr>
           <w:rFonts w:ascii="Arial" w:hAnsi="Arial"/>
           <w:i w:val="0"/>
-          <w:sz w:val="22"/>
+          <w:iCs w:val="0"/>
+          <w:sz w:val="22"/>
+          <w:szCs w:val="22"/>
         </w:rPr>
         <w:t xml:space="preserve">Paraíso, S. (2026). </w:t>
       </w:r>
       <w:r>
         <w:rPr>
           <w:rFonts w:ascii="Arial" w:hAnsi="Arial"/>
-          <w:i/>
-          <w:sz w:val="22"/>
+          <w:i w:val="1"/>
+          <w:iCs w:val="1"/>
+          <w:sz w:val="22"/>
+          <w:szCs w:val="22"/>
         </w:rPr>
         <w:t>Resumen aplicado del libro: EDA mínimo viable</w:t>
       </w:r>
@@ -2061,28 +2504,34 @@
         <w:rPr>
           <w:rFonts w:ascii="Arial" w:hAnsi="Arial"/>
           <w:sz w:val="22"/>
+          <w:szCs w:val="22"/>
         </w:rPr>
         <w:t xml:space="preserve"> [Apunte]. Universidad Andrés Bello, Santiago, Chile.</w:t>
       </w:r>
     </w:p>
-    <w:p>
-      <w:pPr>
-        <w:spacing w:line="276" w:lineRule="auto" w:after="0"/>
+    <w:p xmlns:wp14="http://schemas.microsoft.com/office/word/2010/wordml" wp14:textId="77777777">
+      <w:pPr>
+        <w:spacing w:after="0" w:line="276" w:lineRule="auto"/>
         <w:ind w:left="432" w:hanging="432"/>
+        <w:jc w:val="both"/>
       </w:pPr>
       <w:r>
         <w:rPr>
           <w:rFonts w:ascii="Arial" w:hAnsi="Arial"/>
           <w:i w:val="0"/>
-          <w:sz w:val="22"/>
+          <w:iCs w:val="0"/>
+          <w:sz w:val="22"/>
+          <w:szCs w:val="22"/>
         </w:rPr>
         <w:t xml:space="preserve">The pandas development team. (2026). </w:t>
       </w:r>
       <w:r>
         <w:rPr>
           <w:rFonts w:ascii="Arial" w:hAnsi="Arial"/>
-          <w:i/>
-          <w:sz w:val="22"/>
+          <w:i w:val="1"/>
+          <w:iCs w:val="1"/>
+          <w:sz w:val="22"/>
+          <w:szCs w:val="22"/>
         </w:rPr>
         <w:t>pandas documentation</w:t>
       </w:r>
@@ -2090,28 +2539,34 @@
         <w:rPr>
           <w:rFonts w:ascii="Arial" w:hAnsi="Arial"/>
           <w:sz w:val="22"/>
+          <w:szCs w:val="22"/>
         </w:rPr>
         <w:t xml:space="preserve"> (versión 3.0) [Documentación de software]. https://pandas.pydata.org/docs/</w:t>
       </w:r>
     </w:p>
-    <w:p>
-      <w:pPr>
-        <w:spacing w:line="276" w:lineRule="auto" w:after="0"/>
+    <w:p xmlns:wp14="http://schemas.microsoft.com/office/word/2010/wordml" wp14:textId="77777777">
+      <w:pPr>
+        <w:spacing w:after="0" w:line="276" w:lineRule="auto"/>
         <w:ind w:left="432" w:hanging="432"/>
+        <w:jc w:val="both"/>
       </w:pPr>
       <w:r>
         <w:rPr>
           <w:rFonts w:ascii="Arial" w:hAnsi="Arial"/>
           <w:i w:val="0"/>
-          <w:sz w:val="22"/>
+          <w:iCs w:val="0"/>
+          <w:sz w:val="22"/>
+          <w:szCs w:val="22"/>
         </w:rPr>
         <w:t xml:space="preserve">Waskom, M. L. (2021). Seaborn: Statistical data visualization. </w:t>
       </w:r>
       <w:r>
         <w:rPr>
           <w:rFonts w:ascii="Arial" w:hAnsi="Arial"/>
-          <w:i/>
-          <w:sz w:val="22"/>
+          <w:i w:val="1"/>
+          <w:iCs w:val="1"/>
+          <w:sz w:val="22"/>
+          <w:szCs w:val="22"/>
         </w:rPr>
         <w:t>Journal of Open Source Software, 6</w:t>
       </w:r>
@@ -2119,28 +2574,34 @@
         <w:rPr>
           <w:rFonts w:ascii="Arial" w:hAnsi="Arial"/>
           <w:sz w:val="22"/>
+          <w:szCs w:val="22"/>
         </w:rPr>
         <w:t>(60), 3021. https://doi.org/10.21105/joss.03021</w:t>
       </w:r>
     </w:p>
-    <w:p>
-      <w:pPr>
-        <w:spacing w:line="276" w:lineRule="auto" w:after="0"/>
+    <w:p xmlns:wp14="http://schemas.microsoft.com/office/word/2010/wordml" wp14:textId="77777777">
+      <w:pPr>
+        <w:spacing w:after="0" w:line="276" w:lineRule="auto"/>
         <w:ind w:left="432" w:hanging="432"/>
+        <w:jc w:val="both"/>
       </w:pPr>
       <w:r>
         <w:rPr>
           <w:rFonts w:ascii="Arial" w:hAnsi="Arial"/>
           <w:i w:val="0"/>
-          <w:sz w:val="22"/>
+          <w:iCs w:val="0"/>
+          <w:sz w:val="22"/>
+          <w:szCs w:val="22"/>
         </w:rPr>
         <w:t xml:space="preserve">Wilson, G., Bryan, J., Cranston, K., Kitzes, J., Nederbragt, L., &amp; Teal, T. K. (2017). Good enough practices in scientific computing. </w:t>
       </w:r>
       <w:r>
         <w:rPr>
           <w:rFonts w:ascii="Arial" w:hAnsi="Arial"/>
-          <w:i/>
-          <w:sz w:val="22"/>
+          <w:i w:val="1"/>
+          <w:iCs w:val="1"/>
+          <w:sz w:val="22"/>
+          <w:szCs w:val="22"/>
         </w:rPr>
         <w:t>PLOS Computational Biology, 13</w:t>
       </w:r>
@@ -2148,6 +2609,7 @@
         <w:rPr>
           <w:rFonts w:ascii="Arial" w:hAnsi="Arial"/>
           <w:sz w:val="22"/>
+          <w:szCs w:val="22"/>
         </w:rPr>
         <w:t>(6), e1005510. https://doi.org/10.1371/journal.pcbi.1005510</w:t>
       </w:r>
@@ -2155,7 +2617,7 @@
     <w:sectPr>
       <w:headerReference w:type="default" r:id="rId22"/>
       <w:footerReference w:type="default" r:id="rId23"/>
-      <w:pgSz w:w="12240" w:h="15840"/>
+      <w:pgSz w:w="12240" w:h="15840" w:orient="portrait"/>
       <w:pgMar w:top="1100" w:right="840" w:bottom="1340" w:left="1020" w:header="493" w:footer="1149" w:gutter="0"/>
       <w:cols w:space="720"/>
     </w:sectPr>
@@ -2183,7 +2645,7 @@
 </file>
 
 <file path=word/footer1.xml><?xml version="1.0" encoding="utf-8"?>
-<w:ftr xmlns:wpc="http://schemas.microsoft.com/office/word/2010/wordprocessingCanvas" xmlns:cx="http://schemas.microsoft.com/office/drawing/2014/chartex" xmlns:cx1="http://schemas.microsoft.com/office/drawing/2015/9/8/chartex" xmlns:cx2="http://schemas.microsoft.com/office/drawing/2015/10/21/chartex" xmlns:cx3="http://schemas.microsoft.com/office/drawing/2016/5/9/chartex" xmlns:cx4="http://schemas.microsoft.com/office/drawing/2016/5/10/chartex" xmlns:cx5="http://schemas.microsoft.com/office/drawing/2016/5/11/chartex" xmlns:cx6="http://schemas.microsoft.com/office/drawing/2016/5/12/chartex" xmlns:cx7="http://schemas.microsoft.com/office/drawing/2016/5/13/chartex" xmlns:cx8="http://schemas.microsoft.com/office/drawing/2016/5/14/chartex" xmlns:mc="http://schemas.openxmlformats.org/markup-compatibility/2006" xmlns:aink="http://schemas.microsoft.com/office/drawing/2016/ink" xmlns:am3d="http://schemas.microsoft.com/office/drawing/2017/model3d" xmlns:o="urn:schemas-microsoft-com:office:office" xmlns:oel="http://schemas.microsoft.com/office/2019/extlst" xmlns:r="http://schemas.openxmlformats.org/officeDocument/2006/relationships" xmlns:m="http://schemas.openxmlformats.org/officeDocument/2006/math" xmlns:v="urn:schemas-microsoft-com:vml" xmlns:wp14="http://schemas.microsoft.com/office/word/2010/wordprocessingDrawing" xmlns:wp="http://schemas.openxmlformats.org/drawingml/2006/wordprocessingDrawing" xmlns:w10="urn:schemas-microsoft-com:office:word" xmlns:w="http://schemas.openxmlformats.org/wordprocessingml/2006/main" xmlns:w14="http://schemas.microsoft.com/office/word/2010/wordml" xmlns:w15="http://schemas.microsoft.com/office/word/2012/wordml" xmlns:w16cex="http://schemas.microsoft.com/office/word/2018/wordml/cex" xmlns:w16cid="http://schemas.microsoft.com/office/word/2016/wordml/cid" xmlns:w16="http://schemas.microsoft.com/office/word/2018/wordml" xmlns:w16du="http://schemas.microsoft.com/office/word/2023/wordml/word16du" xmlns:w16sdtdh="http://schemas.microsoft.com/office/word/2020/wordml/sdtdatahash" xmlns:w16sdtfl="http://schemas.microsoft.com/office/word/2024/wordml/sdtformatlock" xmlns:w16se="http://schemas.microsoft.com/office/word/2015/wordml/symex" xmlns:wpg="http://schemas.microsoft.com/office/word/2010/wordprocessingGroup" xmlns:wpi="http://schemas.microsoft.com/office/word/2010/wordprocessingInk" xmlns:wne="http://schemas.microsoft.com/office/word/2006/wordml" xmlns:wps="http://schemas.microsoft.com/office/word/2010/wordprocessingShape" mc:Ignorable="w14 w15 w16se w16cid w16 w16cex w16sdtdh w16sdtfl w16du wp14">
+<w:ftr xmlns:wpc="http://schemas.microsoft.com/office/word/2010/wordprocessingCanvas" xmlns:cx="http://schemas.microsoft.com/office/drawing/2014/chartex" xmlns:cx1="http://schemas.microsoft.com/office/drawing/2015/9/8/chartex" xmlns:cx2="http://schemas.microsoft.com/office/drawing/2015/10/21/chartex" xmlns:cx3="http://schemas.microsoft.com/office/drawing/2016/5/9/chartex" xmlns:cx4="http://schemas.microsoft.com/office/drawing/2016/5/10/chartex" xmlns:cx5="http://schemas.microsoft.com/office/drawing/2016/5/11/chartex" xmlns:cx6="http://schemas.microsoft.com/office/drawing/2016/5/12/chartex" xmlns:cx7="http://schemas.microsoft.com/office/drawing/2016/5/13/chartex" xmlns:cx8="http://schemas.microsoft.com/office/drawing/2016/5/14/chartex" xmlns:mc="http://schemas.openxmlformats.org/markup-compatibility/2006" xmlns:aink="http://schemas.microsoft.com/office/drawing/2016/ink" xmlns:am3d="http://schemas.microsoft.com/office/drawing/2017/model3d" xmlns:o="urn:schemas-microsoft-com:office:office" xmlns:oel="http://schemas.microsoft.com/office/2019/extlst" xmlns:r="http://schemas.openxmlformats.org/officeDocument/2006/relationships" xmlns:m="http://schemas.openxmlformats.org/officeDocument/2006/math" xmlns:v="urn:schemas-microsoft-com:vml" xmlns:wp14="http://schemas.microsoft.com/office/word/2010/wordprocessingDrawing" xmlns:wp="http://schemas.openxmlformats.org/drawingml/2006/wordprocessingDrawing" xmlns:w10="urn:schemas-microsoft-com:office:word" xmlns:w="http://schemas.openxmlformats.org/wordprocessingml/2006/main" xmlns:w14="http://schemas.microsoft.com/office/word/2010/wordml" xmlns:w15="http://schemas.microsoft.com/office/word/2012/wordml" xmlns:w16cex="http://schemas.microsoft.com/office/word/2018/wordml/cex" xmlns:w16cid="http://schemas.microsoft.com/office/word/2016/wordml/cid" xmlns:w16="http://schemas.microsoft.com/office/word/2018/wordml" xmlns:w16du="http://schemas.microsoft.com/office/word/2023/wordml/word16du" xmlns:w16sdtdh="http://schemas.microsoft.com/office/word/2020/wordml/sdtdatahash" xmlns:w16sdtfl="http://schemas.microsoft.com/office/word/2024/wordml/sdtformatlock" xmlns:w16se="http://schemas.microsoft.com/office/word/2015/wordml/symex" xmlns:wpg="http://schemas.microsoft.com/office/word/2010/wordprocessingGroup" xmlns:wpi="http://schemas.microsoft.com/office/word/2010/wordprocessingInk" xmlns:wne="http://schemas.microsoft.com/office/word/2006/wordml" xmlns:wps="http://schemas.microsoft.com/office/word/2010/wordprocessingShape" xmlns:a="http://schemas.openxmlformats.org/drawingml/2006/main" xmlns:pic="http://schemas.openxmlformats.org/drawingml/2006/picture" mc:Ignorable="w14 w15 w16se w16cid w16 w16cex w16sdtdh w16sdtfl w16du wp14">
   <w:p>
     <w:pPr>
       <w:pStyle w:val="Textoindependiente"/>
@@ -2310,7 +2772,7 @@
           </w:drawing>
         </mc:Choice>
         <mc:Fallback xmlns:pic="http://schemas.openxmlformats.org/drawingml/2006/picture" xmlns:a="http://schemas.openxmlformats.org/drawingml/2006/main">
-          <w:pict>
+          <w:pict w14:anchorId="0345CD9E">
             <v:shape id="Graphic 17" style="position:absolute;margin-left:42.5pt;margin-top:739.9pt;width:218.15pt;height:.1pt;z-index:-15813632;visibility:visible;mso-wrap-style:square;mso-wrap-distance-left:0;mso-wrap-distance-top:0;mso-wrap-distance-right:0;mso-wrap-distance-bottom:0;mso-position-horizontal:absolute;mso-position-horizontal-relative:page;mso-position-vertical:absolute;mso-position-vertical-relative:page;v-text-anchor:top" coordsize="2770505,1270" o:spid="_x0000_s1026" filled="f" strokecolor="#1d4b63" path="m,l2770204,e" o:gfxdata="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" w14:anchorId="0747A2B0">
               <v:path arrowok="t"/>
               <w10:wrap anchorx="page" anchory="page"/>
@@ -2389,7 +2851,7 @@
           </w:drawing>
         </mc:Choice>
         <mc:Fallback xmlns:pic="http://schemas.openxmlformats.org/drawingml/2006/picture" xmlns:a="http://schemas.openxmlformats.org/drawingml/2006/main">
-          <w:pict>
+          <w:pict w14:anchorId="7E3D2D0C">
             <v:shape id="Graphic 18" style="position:absolute;margin-left:371.35pt;margin-top:739.9pt;width:198.15pt;height:.1pt;z-index:-15813120;visibility:visible;mso-wrap-style:square;mso-wrap-distance-left:0;mso-wrap-distance-top:0;mso-wrap-distance-right:0;mso-wrap-distance-bottom:0;mso-position-horizontal:absolute;mso-position-horizontal-relative:page;mso-position-vertical:absolute;mso-position-vertical-relative:page;v-text-anchor:top" coordsize="2516505,1270" o:spid="_x0000_s1026" filled="f" strokecolor="#1d4b63" path="m,l2516399,e" o:gfxdata="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" w14:anchorId="3C0EE5FF">
               <v:path arrowok="t"/>
               <w10:wrap anchorx="page" anchory="page"/>
@@ -2422,13 +2884,14 @@
 </file>
 
 <file path=word/header1.xml><?xml version="1.0" encoding="utf-8"?>
-<w:hdr xmlns:wpc="http://schemas.microsoft.com/office/word/2010/wordprocessingCanvas" xmlns:cx="http://schemas.microsoft.com/office/drawing/2014/chartex" xmlns:cx1="http://schemas.microsoft.com/office/drawing/2015/9/8/chartex" xmlns:cx2="http://schemas.microsoft.com/office/drawing/2015/10/21/chartex" xmlns:cx3="http://schemas.microsoft.com/office/drawing/2016/5/9/chartex" xmlns:cx4="http://schemas.microsoft.com/office/drawing/2016/5/10/chartex" xmlns:cx5="http://schemas.microsoft.com/office/drawing/2016/5/11/chartex" xmlns:cx6="http://schemas.microsoft.com/office/drawing/2016/5/12/chartex" xmlns:cx7="http://schemas.microsoft.com/office/drawing/2016/5/13/chartex" xmlns:cx8="http://schemas.microsoft.com/office/drawing/2016/5/14/chartex" xmlns:mc="http://schemas.openxmlformats.org/markup-compatibility/2006" xmlns:aink="http://schemas.microsoft.com/office/drawing/2016/ink" xmlns:am3d="http://schemas.microsoft.com/office/drawing/2017/model3d" xmlns:o="urn:schemas-microsoft-com:office:office" xmlns:oel="http://schemas.microsoft.com/office/2019/extlst" xmlns:r="http://schemas.openxmlformats.org/officeDocument/2006/relationships" xmlns:m="http://schemas.openxmlformats.org/officeDocument/2006/math" xmlns:v="urn:schemas-microsoft-com:vml" xmlns:wp14="http://schemas.microsoft.com/office/word/2010/wordprocessingDrawing" xmlns:wp="http://schemas.openxmlformats.org/drawingml/2006/wordprocessingDrawing" xmlns:w10="urn:schemas-microsoft-com:office:word" xmlns:w="http://schemas.openxmlformats.org/wordprocessingml/2006/main" xmlns:w14="http://schemas.microsoft.com/office/word/2010/wordml" xmlns:w15="http://schemas.microsoft.com/office/word/2012/wordml" xmlns:w16cex="http://schemas.microsoft.com/office/word/2018/wordml/cex" xmlns:w16cid="http://schemas.microsoft.com/office/word/2016/wordml/cid" xmlns:w16="http://schemas.microsoft.com/office/word/2018/wordml" xmlns:w16du="http://schemas.microsoft.com/office/word/2023/wordml/word16du" xmlns:w16sdtdh="http://schemas.microsoft.com/office/word/2020/wordml/sdtdatahash" xmlns:w16sdtfl="http://schemas.microsoft.com/office/word/2024/wordml/sdtformatlock" xmlns:w16se="http://schemas.microsoft.com/office/word/2015/wordml/symex" xmlns:wpg="http://schemas.microsoft.com/office/word/2010/wordprocessingGroup" xmlns:wpi="http://schemas.microsoft.com/office/word/2010/wordprocessingInk" xmlns:wne="http://schemas.microsoft.com/office/word/2006/wordml" xmlns:wps="http://schemas.microsoft.com/office/word/2010/wordprocessingShape" mc:Ignorable="w14 w15 w16se w16cid w16 w16cex w16sdtdh w16sdtfl w16du wp14">
+<w:hdr xmlns:wpc="http://schemas.microsoft.com/office/word/2010/wordprocessingCanvas" xmlns:cx="http://schemas.microsoft.com/office/drawing/2014/chartex" xmlns:cx1="http://schemas.microsoft.com/office/drawing/2015/9/8/chartex" xmlns:cx2="http://schemas.microsoft.com/office/drawing/2015/10/21/chartex" xmlns:cx3="http://schemas.microsoft.com/office/drawing/2016/5/9/chartex" xmlns:cx4="http://schemas.microsoft.com/office/drawing/2016/5/10/chartex" xmlns:cx5="http://schemas.microsoft.com/office/drawing/2016/5/11/chartex" xmlns:cx6="http://schemas.microsoft.com/office/drawing/2016/5/12/chartex" xmlns:cx7="http://schemas.microsoft.com/office/drawing/2016/5/13/chartex" xmlns:cx8="http://schemas.microsoft.com/office/drawing/2016/5/14/chartex" xmlns:mc="http://schemas.openxmlformats.org/markup-compatibility/2006" xmlns:aink="http://schemas.microsoft.com/office/drawing/2016/ink" xmlns:am3d="http://schemas.microsoft.com/office/drawing/2017/model3d" xmlns:o="urn:schemas-microsoft-com:office:office" xmlns:oel="http://schemas.microsoft.com/office/2019/extlst" xmlns:r="http://schemas.openxmlformats.org/officeDocument/2006/relationships" xmlns:m="http://schemas.openxmlformats.org/officeDocument/2006/math" xmlns:v="urn:schemas-microsoft-com:vml" xmlns:wp14="http://schemas.microsoft.com/office/word/2010/wordprocessingDrawing" xmlns:wp="http://schemas.openxmlformats.org/drawingml/2006/wordprocessingDrawing" xmlns:w10="urn:schemas-microsoft-com:office:word" xmlns:w="http://schemas.openxmlformats.org/wordprocessingml/2006/main" xmlns:w14="http://schemas.microsoft.com/office/word/2010/wordml" xmlns:w15="http://schemas.microsoft.com/office/word/2012/wordml" xmlns:w16cex="http://schemas.microsoft.com/office/word/2018/wordml/cex" xmlns:w16cid="http://schemas.microsoft.com/office/word/2016/wordml/cid" xmlns:w16="http://schemas.microsoft.com/office/word/2018/wordml" xmlns:w16du="http://schemas.microsoft.com/office/word/2023/wordml/word16du" xmlns:w16sdtdh="http://schemas.microsoft.com/office/word/2020/wordml/sdtdatahash" xmlns:w16sdtfl="http://schemas.microsoft.com/office/word/2024/wordml/sdtformatlock" xmlns:w16se="http://schemas.microsoft.com/office/word/2015/wordml/symex" xmlns:wpg="http://schemas.microsoft.com/office/word/2010/wordprocessingGroup" xmlns:wpi="http://schemas.microsoft.com/office/word/2010/wordprocessingInk" xmlns:wne="http://schemas.microsoft.com/office/word/2006/wordml" xmlns:wps="http://schemas.microsoft.com/office/word/2010/wordprocessingShape" xmlns:a="http://schemas.openxmlformats.org/drawingml/2006/main" xmlns:pic="http://schemas.openxmlformats.org/drawingml/2006/picture" mc:Ignorable="w14 w15 w16se w16cid w16 w16cex w16sdtdh w16sdtfl w16du wp14">
   <w:p>
     <w:pPr>
       <w:pStyle w:val="Textoindependiente"/>
       <w:spacing w:line="14" w:lineRule="auto"/>
       <w:rPr>
         <w:sz w:val="20"/>
+        <w:szCs w:val="20"/>
       </w:rPr>
     </w:pPr>
     <w:r>
@@ -2534,7 +2997,7 @@
           </w:drawing>
         </mc:Choice>
         <mc:Fallback xmlns:pic="http://schemas.openxmlformats.org/drawingml/2006/picture" xmlns:a="http://schemas.openxmlformats.org/drawingml/2006/main">
-          <w:pict>
+          <w:pict w14:anchorId="7EEB9CA8">
             <v:group id="Group 12" style="position:absolute;margin-left:42.5pt;margin-top:37.85pt;width:527pt;height:9.1pt;z-index:-15815168;mso-wrap-distance-left:0;mso-wrap-distance-right:0;mso-position-horizontal-relative:page;mso-position-vertical-relative:page" coordsize="66929,1155" o:spid="_x0000_s1026" w14:anchorId="58BDBA3A" o:gfxdata="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">
               <v:shape id="Graphic 13" style="position:absolute;left:539;top:551;width:66390;height:13;visibility:visible;mso-wrap-style:square;v-text-anchor:top" coordsize="6638925,1270" o:spid="_x0000_s1027" filled="f" strokecolor="#1d4b63" path="m,l6638404,e" o:gfxdata="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">
                 <v:path arrowok="t"/>
@@ -2668,12 +3131,12 @@
           </w:drawing>
         </mc:Choice>
         <mc:Fallback>
-          <w:pict>
-            <v:shapetype w14:anchorId="2B617FCF" id="_x0000_t202" coordsize="21600,21600" o:spt="202" path="m,l,21600r21600,l21600,xe">
+          <w:pict w14:anchorId="6F81A354">
+            <v:shapetype id="_x0000_t202" coordsize="21600,21600" o:spt="202" path="m,l,21600r21600,l21600,xe" w14:anchorId="2B617FCF">
               <v:stroke joinstyle="miter"/>
               <v:path gradientshapeok="t" o:connecttype="rect"/>
             </v:shapetype>
-            <v:shape id="Textbox 15" o:spid="_x0000_s1026" type="#_x0000_t202" style="position:absolute;margin-left:560.4pt;margin-top:23.65pt;width:13.1pt;height:14pt;z-index:-15814656;visibility:visible;mso-wrap-style:square;mso-wrap-distance-left:0;mso-wrap-distance-top:0;mso-wrap-distance-right:0;mso-wrap-distance-bottom:0;mso-position-horizontal:absolute;mso-position-horizontal-relative:page;mso-position-vertical:absolute;mso-position-vertical-relative:page;v-text-anchor:top" o:gfxdata="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" filled="f" stroked="f">
+            <v:shape id="Textbox 15" style="position:absolute;margin-left:560.4pt;margin-top:23.65pt;width:13.1pt;height:14pt;z-index:-15814656;visibility:visible;mso-wrap-style:square;mso-wrap-distance-left:0;mso-wrap-distance-top:0;mso-wrap-distance-right:0;mso-wrap-distance-bottom:0;mso-position-horizontal:absolute;mso-position-horizontal-relative:page;mso-position-vertical:absolute;mso-position-vertical-relative:page;v-text-anchor:top" o:spid="_x0000_s1026" filled="f" stroked="f" type="#_x0000_t202" o:gfxdata="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">
               <v:textbox inset="0,0,0,0">
                 <w:txbxContent>
                   <w:p>
@@ -2753,7 +3216,7 @@
         <w:ind w:left="340" w:hanging="340"/>
       </w:pPr>
       <w:rPr>
-        <w:rFonts w:ascii="Arial" w:eastAsia="Arial" w:hAnsi="Arial" w:cs="Arial" w:hint="default"/>
+        <w:rFonts w:hint="default" w:ascii="Arial" w:hAnsi="Arial" w:eastAsia="Arial" w:cs="Arial"/>
         <w:b/>
         <w:bCs/>
         <w:i w:val="0"/>
@@ -2775,7 +3238,7 @@
         <w:ind w:left="700" w:hanging="341"/>
       </w:pPr>
       <w:rPr>
-        <w:rFonts w:ascii="Arial" w:eastAsia="Arial" w:hAnsi="Arial" w:cs="Arial" w:hint="default"/>
+        <w:rFonts w:hint="default" w:ascii="Arial" w:hAnsi="Arial" w:eastAsia="Arial" w:cs="Arial"/>
         <w:b/>
         <w:bCs/>
         <w:i w:val="0"/>
@@ -2811,7 +3274,7 @@
         <w:ind w:left="1360" w:hanging="340"/>
       </w:pPr>
       <w:rPr>
-        <w:rFonts w:ascii="Arial" w:eastAsia="Arial" w:hAnsi="Arial" w:cs="Arial" w:hint="default"/>
+        <w:rFonts w:hint="default" w:ascii="Arial" w:hAnsi="Arial" w:eastAsia="Arial" w:cs="Arial"/>
         <w:b w:val="0"/>
         <w:bCs w:val="0"/>
         <w:i w:val="0"/>
@@ -2898,7 +3361,7 @@
         <w:ind w:left="502" w:hanging="360"/>
       </w:pPr>
       <w:rPr>
-        <w:rFonts w:ascii="Arial" w:eastAsia="MS Mincho" w:hAnsi="Arial" w:cs="Arial" w:hint="default"/>
+        <w:rFonts w:hint="default" w:ascii="Arial" w:hAnsi="Arial" w:eastAsia="MS Mincho" w:cs="Arial"/>
         <w:b/>
         <w:bCs/>
         <w:sz w:val="22"/>
@@ -2990,7 +3453,7 @@
         <w:ind w:left="1207" w:hanging="340"/>
       </w:pPr>
       <w:rPr>
-        <w:rFonts w:ascii="Arial" w:eastAsia="Arial" w:hAnsi="Arial" w:cs="Arial" w:hint="default"/>
+        <w:rFonts w:hint="default" w:ascii="Arial" w:hAnsi="Arial" w:eastAsia="Arial" w:cs="Arial"/>
         <w:b/>
         <w:bCs/>
         <w:i w:val="0"/>
@@ -3695,11 +4158,11 @@
 </file>
 
 <file path=word/styles.xml><?xml version="1.0" encoding="utf-8"?>
-<w:styles xmlns:mc="http://schemas.openxmlformats.org/markup-compatibility/2006" xmlns:r="http://schemas.openxmlformats.org/officeDocument/2006/relationships" xmlns:w="http://schemas.openxmlformats.org/wordprocessingml/2006/main" xmlns:w14="http://schemas.microsoft.com/office/word/2010/wordml" xmlns:w15="http://schemas.microsoft.com/office/word/2012/wordml" xmlns:w16cex="http://schemas.microsoft.com/office/word/2018/wordml/cex" xmlns:w16cid="http://schemas.microsoft.com/office/word/2016/wordml/cid" xmlns:w16="http://schemas.microsoft.com/office/word/2018/wordml" xmlns:w16du="http://schemas.microsoft.com/office/word/2023/wordml/word16du" xmlns:w16sdtdh="http://schemas.microsoft.com/office/word/2020/wordml/sdtdatahash" xmlns:w16sdtfl="http://schemas.microsoft.com/office/word/2024/wordml/sdtformatlock" xmlns:w16se="http://schemas.microsoft.com/office/word/2015/wordml/symex" mc:Ignorable="w14 w15 w16se w16cid w16 w16cex w16sdtdh w16sdtfl w16du">
+<w:styles xmlns:wp14="http://schemas.microsoft.com/office/word/2010/wordprocessingDrawing" xmlns:mc="http://schemas.openxmlformats.org/markup-compatibility/2006" xmlns:r="http://schemas.openxmlformats.org/officeDocument/2006/relationships" xmlns:w="http://schemas.openxmlformats.org/wordprocessingml/2006/main" xmlns:w14="http://schemas.microsoft.com/office/word/2010/wordml" xmlns:w15="http://schemas.microsoft.com/office/word/2012/wordml" xmlns:w16cex="http://schemas.microsoft.com/office/word/2018/wordml/cex" xmlns:w16cid="http://schemas.microsoft.com/office/word/2016/wordml/cid" xmlns:w16="http://schemas.microsoft.com/office/word/2018/wordml" xmlns:w16du="http://schemas.microsoft.com/office/word/2023/wordml/word16du" xmlns:w16sdtdh="http://schemas.microsoft.com/office/word/2020/wordml/sdtdatahash" xmlns:w16sdtfl="http://schemas.microsoft.com/office/word/2024/wordml/sdtformatlock" xmlns:w16se="http://schemas.microsoft.com/office/word/2015/wordml/symex" mc:Ignorable="w14 w15 w16se w16cid w16 w16cex w16sdtdh w16sdtfl w16du wp14">
   <w:docDefaults>
     <w:rPrDefault>
       <w:rPr>
-        <w:rFonts w:asciiTheme="minorHAnsi" w:eastAsiaTheme="minorHAnsi" w:hAnsiTheme="minorHAnsi" w:cstheme="minorBidi"/>
+        <w:rFonts w:asciiTheme="minorHAnsi" w:hAnsiTheme="minorHAnsi" w:eastAsiaTheme="minorHAnsi" w:cstheme="minorBidi"/>
         <w:sz w:val="22"/>
         <w:szCs w:val="22"/>
         <w:lang w:val="en-US" w:eastAsia="en-US" w:bidi="ar-SA"/>
@@ -3716,14 +4179,14 @@
   <w:latentStyles w:defLockedState="0" w:defUIPriority="99" w:defSemiHidden="0" w:defUnhideWhenUsed="0" w:defQFormat="0" w:count="376">
     <w:lsdException w:name="Normal" w:uiPriority="0" w:qFormat="1"/>
     <w:lsdException w:name="heading 1" w:uiPriority="9" w:qFormat="1"/>
-    <w:lsdException w:name="heading 2" w:semiHidden="1" w:uiPriority="9" w:unhideWhenUsed="1" w:qFormat="1"/>
-    <w:lsdException w:name="heading 3" w:semiHidden="1" w:uiPriority="9" w:unhideWhenUsed="1" w:qFormat="1"/>
-    <w:lsdException w:name="heading 4" w:semiHidden="1" w:uiPriority="9" w:unhideWhenUsed="1" w:qFormat="1"/>
-    <w:lsdException w:name="heading 5" w:semiHidden="1" w:uiPriority="9" w:unhideWhenUsed="1" w:qFormat="1"/>
-    <w:lsdException w:name="heading 6" w:semiHidden="1" w:uiPriority="9" w:unhideWhenUsed="1" w:qFormat="1"/>
-    <w:lsdException w:name="heading 7" w:semiHidden="1" w:uiPriority="9" w:unhideWhenUsed="1" w:qFormat="1"/>
-    <w:lsdException w:name="heading 8" w:semiHidden="1" w:uiPriority="9" w:unhideWhenUsed="1" w:qFormat="1"/>
-    <w:lsdException w:name="heading 9" w:semiHidden="1" w:uiPriority="9" w:unhideWhenUsed="1" w:qFormat="1"/>
+    <w:lsdException w:name="heading 2" w:uiPriority="9" w:semiHidden="1" w:unhideWhenUsed="1" w:qFormat="1"/>
+    <w:lsdException w:name="heading 3" w:uiPriority="9" w:semiHidden="1" w:unhideWhenUsed="1" w:qFormat="1"/>
+    <w:lsdException w:name="heading 4" w:uiPriority="9" w:semiHidden="1" w:unhideWhenUsed="1" w:qFormat="1"/>
+    <w:lsdException w:name="heading 5" w:uiPriority="9" w:semiHidden="1" w:unhideWhenUsed="1" w:qFormat="1"/>
+    <w:lsdException w:name="heading 6" w:uiPriority="9" w:semiHidden="1" w:unhideWhenUsed="1" w:qFormat="1"/>
+    <w:lsdException w:name="heading 7" w:uiPriority="9" w:semiHidden="1" w:unhideWhenUsed="1" w:qFormat="1"/>
+    <w:lsdException w:name="heading 8" w:uiPriority="9" w:semiHidden="1" w:unhideWhenUsed="1" w:qFormat="1"/>
+    <w:lsdException w:name="heading 9" w:uiPriority="9" w:semiHidden="1" w:unhideWhenUsed="1" w:qFormat="1"/>
     <w:lsdException w:name="index 1" w:semiHidden="1" w:unhideWhenUsed="1"/>
     <w:lsdException w:name="index 2" w:semiHidden="1" w:unhideWhenUsed="1"/>
     <w:lsdException w:name="index 3" w:semiHidden="1" w:unhideWhenUsed="1"/>
@@ -3733,22 +4196,22 @@
     <w:lsdException w:name="index 7" w:semiHidden="1" w:unhideWhenUsed="1"/>
     <w:lsdException w:name="index 8" w:semiHidden="1" w:unhideWhenUsed="1"/>
     <w:lsdException w:name="index 9" w:semiHidden="1" w:unhideWhenUsed="1"/>
-    <w:lsdException w:name="toc 1" w:semiHidden="1" w:uiPriority="39" w:unhideWhenUsed="1"/>
-    <w:lsdException w:name="toc 2" w:semiHidden="1" w:uiPriority="39" w:unhideWhenUsed="1"/>
-    <w:lsdException w:name="toc 3" w:semiHidden="1" w:uiPriority="39" w:unhideWhenUsed="1"/>
-    <w:lsdException w:name="toc 4" w:semiHidden="1" w:uiPriority="39" w:unhideWhenUsed="1"/>
-    <w:lsdException w:name="toc 5" w:semiHidden="1" w:uiPriority="39" w:unhideWhenUsed="1"/>
-    <w:lsdException w:name="toc 6" w:semiHidden="1" w:uiPriority="39" w:unhideWhenUsed="1"/>
-    <w:lsdException w:name="toc 7" w:semiHidden="1" w:uiPriority="39" w:unhideWhenUsed="1"/>
-    <w:lsdException w:name="toc 8" w:semiHidden="1" w:uiPriority="39" w:unhideWhenUsed="1"/>
-    <w:lsdException w:name="toc 9" w:semiHidden="1" w:uiPriority="39" w:unhideWhenUsed="1"/>
+    <w:lsdException w:name="toc 1" w:uiPriority="39" w:semiHidden="1" w:unhideWhenUsed="1"/>
+    <w:lsdException w:name="toc 2" w:uiPriority="39" w:semiHidden="1" w:unhideWhenUsed="1"/>
+    <w:lsdException w:name="toc 3" w:uiPriority="39" w:semiHidden="1" w:unhideWhenUsed="1"/>
+    <w:lsdException w:name="toc 4" w:uiPriority="39" w:semiHidden="1" w:unhideWhenUsed="1"/>
+    <w:lsdException w:name="toc 5" w:uiPriority="39" w:semiHidden="1" w:unhideWhenUsed="1"/>
+    <w:lsdException w:name="toc 6" w:uiPriority="39" w:semiHidden="1" w:unhideWhenUsed="1"/>
+    <w:lsdException w:name="toc 7" w:uiPriority="39" w:semiHidden="1" w:unhideWhenUsed="1"/>
+    <w:lsdException w:name="toc 8" w:uiPriority="39" w:semiHidden="1" w:unhideWhenUsed="1"/>
+    <w:lsdException w:name="toc 9" w:uiPriority="39" w:semiHidden="1" w:unhideWhenUsed="1"/>
     <w:lsdException w:name="Normal Indent" w:semiHidden="1" w:unhideWhenUsed="1"/>
     <w:lsdException w:name="footnote text" w:semiHidden="1" w:unhideWhenUsed="1"/>
     <w:lsdException w:name="annotation text" w:semiHidden="1" w:unhideWhenUsed="1"/>
     <w:lsdException w:name="header" w:semiHidden="1" w:unhideWhenUsed="1"/>
     <w:lsdException w:name="footer" w:semiHidden="1" w:unhideWhenUsed="1"/>
     <w:lsdException w:name="index heading" w:semiHidden="1" w:unhideWhenUsed="1"/>
-    <w:lsdException w:name="caption" w:semiHidden="1" w:uiPriority="35" w:unhideWhenUsed="1" w:qFormat="1"/>
+    <w:lsdException w:name="caption" w:uiPriority="35" w:semiHidden="1" w:unhideWhenUsed="1" w:qFormat="1"/>
     <w:lsdException w:name="table of figures" w:semiHidden="1" w:unhideWhenUsed="1"/>
     <w:lsdException w:name="envelope address" w:semiHidden="1" w:unhideWhenUsed="1"/>
     <w:lsdException w:name="envelope return" w:semiHidden="1" w:unhideWhenUsed="1"/>
@@ -3779,7 +4242,7 @@
     <w:lsdException w:name="Title" w:uiPriority="10" w:qFormat="1"/>
     <w:lsdException w:name="Closing" w:semiHidden="1" w:unhideWhenUsed="1"/>
     <w:lsdException w:name="Signature" w:semiHidden="1" w:unhideWhenUsed="1"/>
-    <w:lsdException w:name="Default Paragraph Font" w:semiHidden="1" w:uiPriority="1" w:unhideWhenUsed="1"/>
+    <w:lsdException w:name="Default Paragraph Font" w:uiPriority="1" w:semiHidden="1" w:unhideWhenUsed="1"/>
     <w:lsdException w:name="Body Text" w:semiHidden="1" w:unhideWhenUsed="1"/>
     <w:lsdException w:name="Body Text Indent" w:semiHidden="1" w:unhideWhenUsed="1"/>
     <w:lsdException w:name="List Continue" w:semiHidden="1" w:unhideWhenUsed="1"/>
@@ -3979,8 +4442,8 @@
     <w:lsdException w:name="Subtle Reference" w:uiPriority="31" w:qFormat="1"/>
     <w:lsdException w:name="Intense Reference" w:uiPriority="32" w:qFormat="1"/>
     <w:lsdException w:name="Book Title" w:uiPriority="33" w:qFormat="1"/>
-    <w:lsdException w:name="Bibliography" w:semiHidden="1" w:uiPriority="37" w:unhideWhenUsed="1"/>
-    <w:lsdException w:name="TOC Heading" w:semiHidden="1" w:uiPriority="39" w:unhideWhenUsed="1" w:qFormat="1"/>
+    <w:lsdException w:name="Bibliography" w:uiPriority="37" w:semiHidden="1" w:unhideWhenUsed="1"/>
+    <w:lsdException w:name="TOC Heading" w:uiPriority="39" w:semiHidden="1" w:unhideWhenUsed="1" w:qFormat="1"/>
     <w:lsdException w:name="Plain Table 1" w:uiPriority="41"/>
     <w:lsdException w:name="Plain Table 2" w:uiPriority="42"/>
     <w:lsdException w:name="Plain Table 3" w:uiPriority="43"/>
@@ -4091,11 +4554,11 @@
     <w:lsdException w:name="Unresolved Mention" w:semiHidden="1" w:unhideWhenUsed="1"/>
     <w:lsdException w:name="Smart Link" w:semiHidden="1" w:unhideWhenUsed="1"/>
   </w:latentStyles>
-  <w:style w:type="paragraph" w:default="1" w:styleId="Normal">
+  <w:style w:type="paragraph" w:styleId="Normal" w:default="1">
     <w:name w:val="Normal"/>
     <w:qFormat/>
     <w:rPr>
-      <w:rFonts w:ascii="Arial" w:eastAsia="Arial" w:hAnsi="Arial" w:cs="Arial"/>
+      <w:rFonts w:ascii="Arial" w:hAnsi="Arial" w:eastAsia="Arial" w:cs="Arial"/>
       <w:lang w:val="es-ES"/>
     </w:rPr>
   </w:style>
@@ -4121,13 +4584,13 @@
       <w:szCs w:val="26"/>
     </w:rPr>
   </w:style>
-  <w:style w:type="character" w:default="1" w:styleId="Fuentedeprrafopredeter">
+  <w:style w:type="character" w:styleId="Fuentedeprrafopredeter" w:default="1">
     <w:name w:val="Default Paragraph Font"/>
     <w:uiPriority w:val="1"/>
     <w:semiHidden/>
     <w:unhideWhenUsed/>
   </w:style>
-  <w:style w:type="table" w:default="1" w:styleId="Tablanormal">
+  <w:style w:type="table" w:styleId="Tablanormal" w:default="1">
     <w:name w:val="Normal Table"/>
     <w:uiPriority w:val="99"/>
     <w:semiHidden/>
@@ -4142,13 +4605,13 @@
       </w:tblCellMar>
     </w:tblPr>
   </w:style>
-  <w:style w:type="numbering" w:default="1" w:styleId="Sinlista">
+  <w:style w:type="numbering" w:styleId="Sinlista" w:default="1">
     <w:name w:val="No List"/>
     <w:uiPriority w:val="99"/>
     <w:semiHidden/>
     <w:unhideWhenUsed/>
   </w:style>
-  <w:style w:type="table" w:customStyle="1" w:styleId="TableNormal">
+  <w:style w:type="table" w:styleId="TableNormal" w:customStyle="1">
     <w:name w:val="Table Normal"/>
     <w:uiPriority w:val="2"/>
     <w:semiHidden/>
@@ -4200,30 +4663,30 @@
       <w:jc w:val="both"/>
     </w:pPr>
   </w:style>
-  <w:style w:type="paragraph" w:customStyle="1" w:styleId="TableParagraph">
+  <w:style w:type="paragraph" w:styleId="TableParagraph" w:customStyle="1">
     <w:name w:val="Table Paragraph"/>
     <w:basedOn w:val="Normal"/>
     <w:uiPriority w:val="1"/>
     <w:qFormat/>
   </w:style>
-  <w:style w:type="character" w:customStyle="1" w:styleId="normaltextrun">
+  <w:style w:type="character" w:styleId="normaltextrun" w:customStyle="1">
     <w:name w:val="normaltextrun"/>
     <w:basedOn w:val="Fuentedeprrafopredeter"/>
     <w:rsid w:val="00E02CCA"/>
   </w:style>
-  <w:style w:type="character" w:customStyle="1" w:styleId="eop">
+  <w:style w:type="character" w:styleId="eop" w:customStyle="1">
     <w:name w:val="eop"/>
     <w:basedOn w:val="Fuentedeprrafopredeter"/>
     <w:rsid w:val="00464217"/>
   </w:style>
-  <w:style w:type="character" w:customStyle="1" w:styleId="PrrafodelistaCar">
+  <w:style w:type="character" w:styleId="PrrafodelistaCar" w:customStyle="1">
     <w:name w:val="Párrafo de lista Car"/>
     <w:link w:val="Prrafodelista"/>
     <w:uiPriority w:val="34"/>
     <w:qFormat/>
     <w:rsid w:val="005F5AD8"/>
     <w:rPr>
-      <w:rFonts w:ascii="Arial" w:eastAsia="Arial" w:hAnsi="Arial" w:cs="Arial"/>
+      <w:rFonts w:ascii="Arial" w:hAnsi="Arial" w:eastAsia="Arial" w:cs="Arial"/>
       <w:lang w:val="es-ES"/>
     </w:rPr>
   </w:style>
@@ -4240,7 +4703,7 @@
       <w:spacing w:before="100" w:beforeAutospacing="1" w:after="100" w:afterAutospacing="1"/>
     </w:pPr>
     <w:rPr>
-      <w:rFonts w:ascii="Times" w:eastAsia="MS Mincho" w:hAnsi="Times" w:cs="Times New Roman"/>
+      <w:rFonts w:ascii="Times" w:hAnsi="Times" w:eastAsia="MS Mincho" w:cs="Times New Roman"/>
       <w:sz w:val="20"/>
       <w:szCs w:val="20"/>
       <w:lang w:val="es-ES_tradnl" w:eastAsia="es-ES"/>
@@ -4258,14 +4721,14 @@
       <w:szCs w:val="20"/>
     </w:rPr>
   </w:style>
-  <w:style w:type="character" w:customStyle="1" w:styleId="TextocomentarioCar">
+  <w:style w:type="character" w:styleId="TextocomentarioCar" w:customStyle="1">
     <w:name w:val="Texto comentario Car"/>
     <w:basedOn w:val="Fuentedeprrafopredeter"/>
     <w:link w:val="Textocomentario"/>
     <w:uiPriority w:val="99"/>
     <w:semiHidden/>
     <w:rPr>
-      <w:rFonts w:ascii="Arial" w:eastAsia="Arial" w:hAnsi="Arial" w:cs="Arial"/>
+      <w:rFonts w:ascii="Arial" w:hAnsi="Arial" w:eastAsia="Arial" w:cs="Arial"/>
       <w:sz w:val="20"/>
       <w:szCs w:val="20"/>
       <w:lang w:val="es-ES"/>
@@ -4282,14 +4745,14 @@
       <w:szCs w:val="16"/>
     </w:rPr>
   </w:style>
-  <w:style w:type="character" w:customStyle="1" w:styleId="Ttulo2Car">
+  <w:style w:type="character" w:styleId="Ttulo2Car" w:customStyle="1">
     <w:name w:val="Título 2 Car"/>
     <w:basedOn w:val="Fuentedeprrafopredeter"/>
     <w:link w:val="Ttulo2"/>
     <w:uiPriority w:val="9"/>
     <w:rsid w:val="00A863D6"/>
     <w:rPr>
-      <w:rFonts w:ascii="Arial" w:eastAsiaTheme="majorEastAsia" w:hAnsi="Arial" w:cstheme="majorBidi"/>
+      <w:rFonts w:ascii="Arial" w:hAnsi="Arial" w:eastAsiaTheme="majorEastAsia" w:cstheme="majorBidi"/>
       <w:color w:val="002F49"/>
       <w:sz w:val="28"/>
       <w:szCs w:val="26"/>

</xml_diff>

<commit_message>
fix: se sube corregido
</commit_message>
<xml_diff>
--- a/MCDI503/docs/mcdi503_f1_sumativo_grupo5.docx
+++ b/MCDI503/docs/mcdi503_f1_sumativo_grupo5.docx
@@ -1,10 +1,11 @@
 
 <file path=word/document.xml><?xml version="1.0" encoding="utf-8"?>
-<w:document xmlns:wpc="http://schemas.microsoft.com/office/word/2010/wordprocessingCanvas" xmlns:cx="http://schemas.microsoft.com/office/drawing/2014/chartex" xmlns:cx1="http://schemas.microsoft.com/office/drawing/2015/9/8/chartex" xmlns:cx2="http://schemas.microsoft.com/office/drawing/2015/10/21/chartex" xmlns:cx3="http://schemas.microsoft.com/office/drawing/2016/5/9/chartex" xmlns:cx4="http://schemas.microsoft.com/office/drawing/2016/5/10/chartex" xmlns:cx5="http://schemas.microsoft.com/office/drawing/2016/5/11/chartex" xmlns:cx6="http://schemas.microsoft.com/office/drawing/2016/5/12/chartex" xmlns:cx7="http://schemas.microsoft.com/office/drawing/2016/5/13/chartex" xmlns:cx8="http://schemas.microsoft.com/office/drawing/2016/5/14/chartex" xmlns:mc="http://schemas.openxmlformats.org/markup-compatibility/2006" xmlns:aink="http://schemas.microsoft.com/office/drawing/2016/ink" xmlns:am3d="http://schemas.microsoft.com/office/drawing/2017/model3d" xmlns:o="urn:schemas-microsoft-com:office:office" xmlns:oel="http://schemas.microsoft.com/office/2019/extlst" xmlns:r="http://schemas.openxmlformats.org/officeDocument/2006/relationships" xmlns:m="http://schemas.openxmlformats.org/officeDocument/2006/math" xmlns:v="urn:schemas-microsoft-com:vml" xmlns:wp14="http://schemas.microsoft.com/office/word/2010/wordprocessingDrawing" xmlns:wp="http://schemas.openxmlformats.org/drawingml/2006/wordprocessingDrawing" xmlns:w10="urn:schemas-microsoft-com:office:word" xmlns:w="http://schemas.openxmlformats.org/wordprocessingml/2006/main" xmlns:w14="http://schemas.microsoft.com/office/word/2010/wordml" xmlns:w15="http://schemas.microsoft.com/office/word/2012/wordml" xmlns:w16cex="http://schemas.microsoft.com/office/word/2018/wordml/cex" xmlns:w16cid="http://schemas.microsoft.com/office/word/2016/wordml/cid" xmlns:w16="http://schemas.microsoft.com/office/word/2018/wordml" xmlns:w16du="http://schemas.microsoft.com/office/word/2023/wordml/word16du" xmlns:w16sdtdh="http://schemas.microsoft.com/office/word/2020/wordml/sdtdatahash" xmlns:w16sdtfl="http://schemas.microsoft.com/office/word/2024/wordml/sdtformatlock" xmlns:w16se="http://schemas.microsoft.com/office/word/2015/wordml/symex" xmlns:wpg="http://schemas.microsoft.com/office/word/2010/wordprocessingGroup" xmlns:wpi="http://schemas.microsoft.com/office/word/2010/wordprocessingInk" xmlns:wne="http://schemas.microsoft.com/office/word/2006/wordml" xmlns:wps="http://schemas.microsoft.com/office/word/2010/wordprocessingShape" xmlns:a="http://schemas.openxmlformats.org/drawingml/2006/main" xmlns:pic="http://schemas.openxmlformats.org/drawingml/2006/picture" mc:Ignorable="w14 w15 w16se w16cid w16 w16cex w16sdtdh w16sdtfl w16du wp14">
+<w:document xmlns:wpc="http://schemas.microsoft.com/office/word/2010/wordprocessingCanvas" xmlns:cx="http://schemas.microsoft.com/office/drawing/2014/chartex" xmlns:cx1="http://schemas.microsoft.com/office/drawing/2015/9/8/chartex" xmlns:cx2="http://schemas.microsoft.com/office/drawing/2015/10/21/chartex" xmlns:cx3="http://schemas.microsoft.com/office/drawing/2016/5/9/chartex" xmlns:cx4="http://schemas.microsoft.com/office/drawing/2016/5/10/chartex" xmlns:cx5="http://schemas.microsoft.com/office/drawing/2016/5/11/chartex" xmlns:cx6="http://schemas.microsoft.com/office/drawing/2016/5/12/chartex" xmlns:cx7="http://schemas.microsoft.com/office/drawing/2016/5/13/chartex" xmlns:cx8="http://schemas.microsoft.com/office/drawing/2016/5/14/chartex" xmlns:mc="http://schemas.openxmlformats.org/markup-compatibility/2006" xmlns:aink="http://schemas.microsoft.com/office/drawing/2016/ink" xmlns:am3d="http://schemas.microsoft.com/office/drawing/2017/model3d" xmlns:o="urn:schemas-microsoft-com:office:office" xmlns:oel="http://schemas.microsoft.com/office/2019/extlst" xmlns:r="http://schemas.openxmlformats.org/officeDocument/2006/relationships" xmlns:m="http://schemas.openxmlformats.org/officeDocument/2006/math" xmlns:v="urn:schemas-microsoft-com:vml" xmlns:wp14="http://schemas.microsoft.com/office/word/2010/wordprocessingDrawing" xmlns:wp="http://schemas.openxmlformats.org/drawingml/2006/wordprocessingDrawing" xmlns:w10="urn:schemas-microsoft-com:office:word" xmlns:w="http://schemas.openxmlformats.org/wordprocessingml/2006/main" xmlns:w14="http://schemas.microsoft.com/office/word/2010/wordml" xmlns:w15="http://schemas.microsoft.com/office/word/2012/wordml" xmlns:w16cei="http://schemas.microsoft.com/office/word/2026/wordml/cei" xmlns:w16cex="http://schemas.microsoft.com/office/word/2018/wordml/cex" xmlns:w16cid="http://schemas.microsoft.com/office/word/2016/wordml/cid" xmlns:w16="http://schemas.microsoft.com/office/word/2018/wordml" xmlns:w16du="http://schemas.microsoft.com/office/word/2023/wordml/word16du" xmlns:w16sdtdh="http://schemas.microsoft.com/office/word/2020/wordml/sdtdatahash" xmlns:w16sdtfl="http://schemas.microsoft.com/office/word/2024/wordml/sdtformatlock" xmlns:w16se="http://schemas.microsoft.com/office/word/2015/wordml/symex" xmlns:wpg="http://schemas.microsoft.com/office/word/2010/wordprocessingGroup" xmlns:wpi="http://schemas.microsoft.com/office/word/2010/wordprocessingInk" xmlns:wne="http://schemas.microsoft.com/office/word/2006/wordml" xmlns:wps="http://schemas.microsoft.com/office/word/2010/wordprocessingShape" mc:Ignorable="w14 w15 w16se w16cid w16 w16cex w16sdtdh w16sdtfl w16du wp14">
   <w:body>
     <w:p>
       <w:pPr>
         <w:ind w:left="3566"/>
+        <w:jc w:val="both"/>
         <w:rPr>
           <w:sz w:val="20"/>
         </w:rPr>
@@ -807,8 +808,8 @@
               </wp:inline>
             </w:drawing>
           </mc:Choice>
-          <mc:Fallback xmlns:pic="http://schemas.openxmlformats.org/drawingml/2006/picture" xmlns:a="http://schemas.openxmlformats.org/drawingml/2006/main">
-            <w:pict w14:anchorId="1E5359A8">
+          <mc:Fallback xmlns:a="http://schemas.openxmlformats.org/drawingml/2006/main" xmlns:pic="http://schemas.openxmlformats.org/drawingml/2006/picture">
+            <w:pict>
               <v:group id="Group 2" style="width:85.45pt;height:51.55pt;mso-position-horizontal-relative:char;mso-position-vertical-relative:line" coordsize="10852,6546" o:spid="_x0000_s1026" w14:anchorId="42076BD7" o:gfxdata="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">
                 <v:shape id="Graphic 3" style="position:absolute;left:122;top:167;width:2101;height:3099;visibility:visible;mso-wrap-style:square;v-text-anchor:top" coordsize="210185,309880" o:spid="_x0000_s1027" fillcolor="#c6c4c4" stroked="f" path="m209791,l188086,r,184061l181850,232548r-17516,33480l137327,285432r-34712,6261l71098,285811,45396,267038,28085,233684,21742,184061,21742,,,,,185381r8392,58937l30862,282681r32483,20806l101777,309753r41068,-6762l177287,281095r23690,-39451l209791,182219,209791,xe" o:gfxdata="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">
                   <v:path arrowok="t"/>
@@ -866,6 +867,7 @@
     <w:p>
       <w:pPr>
         <w:pStyle w:val="Ttulo"/>
+        <w:jc w:val="both"/>
         <w:rPr>
           <w:color w:val="000000"/>
           <w:lang w:val="es-CL"/>
@@ -887,6 +889,7 @@
     <w:p>
       <w:pPr>
         <w:pStyle w:val="Ttulo"/>
+        <w:jc w:val="both"/>
         <w:rPr>
           <w:lang w:eastAsia="es-ES" w:bidi="es-ES"/>
         </w:rPr>
@@ -901,6 +904,7 @@
     <w:p>
       <w:pPr>
         <w:pStyle w:val="Ttulo"/>
+        <w:jc w:val="both"/>
         <w:rPr>
           <w:lang w:eastAsia="es-ES" w:bidi="es-ES"/>
         </w:rPr>
@@ -914,20 +918,9 @@
     </w:p>
     <w:p>
       <w:pPr>
-        <w:pStyle w:val="Textoindependiente"/>
-        <w:rPr>
-          <w:b/>
-          <w:sz w:val="20"/>
-        </w:rPr>
-      </w:pPr>
-    </w:p>
-    <w:p>
-      <w:pPr>
         <w:spacing w:before="93"/>
-        <w:ind w:left="113" w:right="0"/>
-        <w:rPr>
-          <w:b/>
-        </w:rPr>
+        <w:ind w:left="113"/>
+        <w:jc w:val="both"/>
       </w:pPr>
       <w:r>
         <w:rPr>
@@ -953,18 +946,27 @@
         <w:t>integrante/s:</w:t>
       </w:r>
       <w:r>
-        <w:rPr>
-          <w:rFonts w:ascii="Arial" w:hAnsi="Arial"/>
-          <w:b w:val="0"/>
-          <w:sz w:val="22"/>
-        </w:rPr>
-        <w:t xml:space="preserve"> Arturo Knopke Vera, Nicolás Soletic Cobos, Sebastián Navarrete Soto, Roberto Moncada González</w:t>
+        <w:t xml:space="preserve"> </w:t>
+      </w:r>
+    </w:p>
+    <w:p>
+      <w:pPr>
+        <w:spacing w:before="93"/>
+        <w:ind w:left="113"/>
+        <w:jc w:val="both"/>
+        <w:rPr>
+          <w:b/>
+        </w:rPr>
+      </w:pPr>
+      <w:r>
+        <w:t>Arturo Knopke Vera, Nicolás Soletic Cobos, Sebastián Navarrete Soto, Roberto Moncada González</w:t>
       </w:r>
     </w:p>
     <w:p>
       <w:pPr>
         <w:spacing w:before="1"/>
-        <w:ind w:left="113" w:right="0"/>
+        <w:ind w:left="113"/>
+        <w:jc w:val="both"/>
         <w:rPr>
           <w:b/>
         </w:rPr>
@@ -978,11 +980,6 @@
         <w:t>Curso:</w:t>
       </w:r>
       <w:r>
-        <w:rPr>
-          <w:rFonts w:ascii="Arial" w:hAnsi="Arial"/>
-          <w:b w:val="0"/>
-          <w:sz w:val="22"/>
-        </w:rPr>
         <w:t xml:space="preserve"> MCDI503 – Exploración Inteligente para la Ciencia de Datos</w:t>
       </w:r>
     </w:p>
@@ -990,6 +987,7 @@
       <w:pPr>
         <w:spacing w:line="252" w:lineRule="exact"/>
         <w:ind w:left="113"/>
+        <w:jc w:val="both"/>
         <w:rPr>
           <w:b/>
         </w:rPr>
@@ -1003,11 +1001,6 @@
         <w:t>Fecha:</w:t>
       </w:r>
       <w:r>
-        <w:rPr>
-          <w:rFonts w:ascii="Arial" w:hAnsi="Arial"/>
-          <w:b w:val="0"/>
-          <w:sz w:val="22"/>
-        </w:rPr>
         <w:t xml:space="preserve"> 6 de septiembre de 2026</w:t>
       </w:r>
     </w:p>
@@ -1015,24 +1008,18 @@
       <w:pPr>
         <w:spacing w:line="252" w:lineRule="exact"/>
         <w:ind w:left="113"/>
+        <w:jc w:val="both"/>
         <w:rPr>
           <w:b/>
         </w:rPr>
       </w:pPr>
       <w:r>
         <w:rPr>
-          <w:rFonts w:ascii="Arial" w:hAnsi="Arial"/>
           <w:b/>
-          <w:sz w:val="22"/>
         </w:rPr>
         <w:t>Título del avance:</w:t>
       </w:r>
       <w:r>
-        <w:rPr>
-          <w:rFonts w:ascii="Arial" w:hAnsi="Arial"/>
-          <w:b w:val="0"/>
-          <w:sz w:val="22"/>
-        </w:rPr>
         <w:t xml:space="preserve"> Análisis exploratorio reproducible del dataset Titanic — Fase 1</w:t>
       </w:r>
     </w:p>
@@ -1040,25 +1027,15 @@
       <w:pPr>
         <w:spacing w:line="252" w:lineRule="exact"/>
         <w:ind w:left="113"/>
-      </w:pPr>
-      <w:r>
-        <w:rPr>
-          <w:rFonts w:ascii="Arial" w:hAnsi="Arial"/>
-          <w:b w:val="1"/>
-          <w:bCs w:val="1"/>
-          <w:sz w:val="22"/>
-          <w:szCs w:val="22"/>
+        <w:jc w:val="both"/>
+      </w:pPr>
+      <w:r>
+        <w:rPr>
+          <w:b/>
         </w:rPr>
         <w:t>Docente responsable:</w:t>
       </w:r>
       <w:r>
-        <w:rPr>
-          <w:rFonts w:ascii="Arial" w:hAnsi="Arial"/>
-          <w:b w:val="0"/>
-          <w:bCs w:val="0"/>
-          <w:sz w:val="22"/>
-          <w:szCs w:val="22"/>
-        </w:rPr>
         <w:t xml:space="preserve"> Sergio Paraíso Medina</w:t>
       </w:r>
     </w:p>
@@ -1066,38 +1043,62 @@
       <w:pPr>
         <w:spacing w:line="252" w:lineRule="exact"/>
         <w:ind w:left="113"/>
-        <w:rPr>
-          <w:rFonts w:ascii="Arial" w:hAnsi="Arial"/>
-          <w:b w:val="0"/>
-          <w:bCs w:val="0"/>
-          <w:sz w:val="22"/>
-          <w:szCs w:val="22"/>
-        </w:rPr>
-      </w:pPr>
+        <w:jc w:val="both"/>
+        <w:rPr>
+          <w:b/>
+        </w:rPr>
+      </w:pPr>
+      <w:r>
+        <w:rPr>
+          <w:b/>
+        </w:rPr>
+        <w:t>Repositorio</w:t>
+      </w:r>
+      <w:r>
+        <w:rPr>
+          <w:b/>
+        </w:rPr>
+        <w:t xml:space="preserve"> </w:t>
+      </w:r>
+      <w:proofErr w:type="spellStart"/>
+      <w:r>
+        <w:rPr>
+          <w:b/>
+        </w:rPr>
+        <w:t>Github</w:t>
+      </w:r>
+      <w:proofErr w:type="spellEnd"/>
+      <w:r>
+        <w:rPr>
+          <w:b/>
+        </w:rPr>
+        <w:t>:</w:t>
+      </w:r>
     </w:p>
     <w:p>
       <w:pPr>
         <w:spacing w:line="252" w:lineRule="exact"/>
         <w:ind w:left="113"/>
-        <w:rPr>
-          <w:rFonts w:ascii="Arial" w:hAnsi="Arial"/>
-          <w:b w:val="0"/>
-          <w:bCs w:val="0"/>
-          <w:sz w:val="22"/>
-          <w:szCs w:val="22"/>
-        </w:rPr>
-      </w:pPr>
+        <w:jc w:val="both"/>
+        <w:rPr>
+          <w:bCs/>
+        </w:rPr>
+      </w:pPr>
+      <w:r>
+        <w:rPr>
+          <w:bCs/>
+        </w:rPr>
+        <w:t>https://github.com/robertomoncada-blip/Magister_ciencia_datos/tree/main/MCDI503</w:t>
+      </w:r>
     </w:p>
     <w:p>
       <w:pPr>
         <w:spacing w:line="252" w:lineRule="exact"/>
         <w:ind w:left="113"/>
-        <w:rPr>
-          <w:rFonts w:ascii="Arial" w:hAnsi="Arial"/>
-          <w:b w:val="0"/>
-          <w:bCs w:val="0"/>
-          <w:sz w:val="22"/>
-          <w:szCs w:val="22"/>
+        <w:jc w:val="both"/>
+        <w:rPr>
+          <w:b/>
+          <w:lang w:val="es-CL"/>
         </w:rPr>
       </w:pPr>
     </w:p>
@@ -1105,28 +1106,47 @@
       <w:pPr>
         <w:spacing w:line="252" w:lineRule="exact"/>
         <w:ind w:left="113"/>
-        <w:rPr>
-          <w:rFonts w:ascii="Arial" w:hAnsi="Arial"/>
-          <w:b w:val="0"/>
-          <w:bCs w:val="0"/>
-          <w:sz w:val="22"/>
-          <w:szCs w:val="22"/>
+        <w:jc w:val="both"/>
+        <w:rPr>
+          <w:b/>
+        </w:rPr>
+      </w:pPr>
+    </w:p>
+    <w:p>
+      <w:pPr>
+        <w:spacing w:line="252" w:lineRule="exact"/>
+        <w:ind w:left="113"/>
+        <w:jc w:val="both"/>
+        <w:rPr>
+          <w:b/>
         </w:rPr>
       </w:pPr>
     </w:p>
     <w:p>
       <w:pPr>
         <w:pStyle w:val="Ttulo2"/>
-        <w:suppressLineNumbers w:val="0"/>
-        <w:bidi w:val="0"/>
-        <w:spacing w:before="0" w:beforeAutospacing="off" w:after="0" w:afterAutospacing="off" w:line="259" w:lineRule="auto"/>
-        <w:ind w:left="0" w:right="0"/>
-        <w:jc w:val="left"/>
-      </w:pPr>
-      <w:r>
-        <w:rPr>
-          <w:b w:val="1"/>
-          <w:bCs w:val="1"/>
+        <w:spacing w:before="120" w:line="252" w:lineRule="exact"/>
+        <w:ind w:left="113"/>
+        <w:jc w:val="both"/>
+        <w:rPr>
+          <w:b/>
+        </w:rPr>
+      </w:pPr>
+    </w:p>
+    <w:p>
+      <w:pPr>
+        <w:pStyle w:val="Ttulo2"/>
+        <w:spacing w:before="0"/>
+        <w:jc w:val="both"/>
+        <w:rPr>
+          <w:b/>
+          <w:bCs/>
+        </w:rPr>
+      </w:pPr>
+      <w:r>
+        <w:rPr>
+          <w:b/>
+          <w:bCs/>
         </w:rPr>
         <w:t>INDICE</w:t>
       </w:r>
@@ -1138,7 +1158,7 @@
           <w:ilvl w:val="0"/>
           <w:numId w:val="5"/>
         </w:numPr>
-        <w:spacing w:before="0" w:after="0" w:line="276" w:lineRule="auto"/>
+        <w:spacing w:before="0" w:line="276" w:lineRule="auto"/>
         <w:ind w:right="227"/>
       </w:pPr>
       <w:r>
@@ -1152,7 +1172,7 @@
           <w:ilvl w:val="0"/>
           <w:numId w:val="5"/>
         </w:numPr>
-        <w:spacing w:before="0" w:after="0" w:line="276" w:lineRule="auto"/>
+        <w:spacing w:before="0" w:line="276" w:lineRule="auto"/>
         <w:ind w:right="227"/>
       </w:pPr>
       <w:r>
@@ -1169,7 +1189,7 @@
           <w:ilvl w:val="0"/>
           <w:numId w:val="5"/>
         </w:numPr>
-        <w:spacing w:before="0" w:after="0" w:line="276" w:lineRule="auto"/>
+        <w:spacing w:before="0" w:line="276" w:lineRule="auto"/>
         <w:ind w:right="227"/>
       </w:pPr>
       <w:r>
@@ -1183,7 +1203,7 @@
           <w:ilvl w:val="0"/>
           <w:numId w:val="5"/>
         </w:numPr>
-        <w:spacing w:before="0" w:after="0" w:line="276" w:lineRule="auto"/>
+        <w:spacing w:before="0" w:line="276" w:lineRule="auto"/>
         <w:ind w:right="227"/>
       </w:pPr>
       <w:r>
@@ -1206,7 +1226,7 @@
           <w:ilvl w:val="0"/>
           <w:numId w:val="5"/>
         </w:numPr>
-        <w:spacing w:before="0" w:after="0" w:line="276" w:lineRule="auto"/>
+        <w:spacing w:before="0" w:line="276" w:lineRule="auto"/>
         <w:ind w:right="227"/>
       </w:pPr>
       <w:r>
@@ -1229,7 +1249,7 @@
           <w:ilvl w:val="0"/>
           <w:numId w:val="5"/>
         </w:numPr>
-        <w:spacing w:before="0" w:after="0" w:line="276" w:lineRule="auto"/>
+        <w:spacing w:before="0" w:line="276" w:lineRule="auto"/>
         <w:ind w:right="227"/>
         <w:rPr>
           <w:lang w:val="en-US"/>
@@ -1249,7 +1269,7 @@
           <w:ilvl w:val="0"/>
           <w:numId w:val="5"/>
         </w:numPr>
-        <w:spacing w:before="0" w:after="0" w:line="276" w:lineRule="auto"/>
+        <w:spacing w:before="0" w:line="276" w:lineRule="auto"/>
         <w:ind w:right="227"/>
         <w:rPr>
           <w:lang w:val="es-CL"/>
@@ -1266,7 +1286,7 @@
           <w:ilvl w:val="0"/>
           <w:numId w:val="5"/>
         </w:numPr>
-        <w:spacing w:before="0" w:after="0" w:line="276" w:lineRule="auto"/>
+        <w:spacing w:before="0" w:line="276" w:lineRule="auto"/>
         <w:ind w:right="227"/>
       </w:pPr>
       <w:r>
@@ -1283,1333 +1303,861 @@
           <w:ilvl w:val="0"/>
           <w:numId w:val="5"/>
         </w:numPr>
-        <w:spacing w:before="0" w:after="0" w:line="276" w:lineRule="auto"/>
+        <w:spacing w:before="0" w:line="276" w:lineRule="auto"/>
         <w:ind w:right="227"/>
       </w:pPr>
       <w:r>
         <w:t>Bibliografía</w:t>
       </w:r>
     </w:p>
-    <w:p xmlns:wp14="http://schemas.microsoft.com/office/word/2010/wordml" wp14:textId="77777777">
-      <w:pPr>
-        <w:pStyle w:val="Ttulo2"/>
-        <w:pageBreakBefore/>
-        <w:spacing w:before="0"/>
-      </w:pPr>
-      <w:r>
-        <w:rPr/>
-        <w:t>II. Introducción y contextualización</w:t>
-      </w:r>
-    </w:p>
-    <w:p xmlns:wp14="http://schemas.microsoft.com/office/word/2010/wordml" wp14:textId="77777777">
-      <w:pPr>
-        <w:spacing w:after="20" w:line="276" w:lineRule="auto"/>
-        <w:jc w:val="both"/>
-      </w:pPr>
-      <w:r>
-        <w:rPr>
-          <w:rFonts w:ascii="Arial" w:hAnsi="Arial"/>
-          <w:b w:val="0"/>
-          <w:bCs w:val="0"/>
-          <w:i w:val="0"/>
-          <w:iCs w:val="0"/>
-          <w:sz w:val="22"/>
-          <w:szCs w:val="22"/>
-        </w:rPr>
-        <w:t>El hundimiento del RMS Titanic el 15 de abril de 1912, durante su viaje inaugural, es uno de los naufragios más documentados de la historia moderna: de las 2224 personas a bordo murieron 1502 (Kaggle, s. f.), en gran medida por la insuficiencia de botes salvavidas. Si bien el azar tuvo un papel en la supervivencia, la evidencia histórica sugiere que ciertos grupos de pasajeros —según sexo, clase de pasaje o edad— tuvieron mayores probabilidades de sobrevivir que otros.</w:t>
-      </w:r>
-    </w:p>
-    <w:p xmlns:wp14="http://schemas.microsoft.com/office/word/2010/wordml" wp14:textId="77777777">
-      <w:pPr>
-        <w:spacing w:after="20" w:line="276" w:lineRule="auto"/>
-        <w:jc w:val="both"/>
-      </w:pPr>
-      <w:r>
-        <w:rPr>
-          <w:rFonts w:ascii="Arial" w:hAnsi="Arial"/>
-          <w:b w:val="0"/>
-          <w:bCs w:val="0"/>
-          <w:i w:val="0"/>
-          <w:iCs w:val="0"/>
-          <w:sz w:val="22"/>
-          <w:szCs w:val="22"/>
-        </w:rPr>
-        <w:t>El proyecto trabaja con el dataset Titanic-Dataset.csv (891 pasajeros, 12 variables), que combina información demográfica, socioeconómica (clase de pasaje, tarifa) y de composición familiar a bordo. Este avance de Fase 1 tiene como propósito consolidar un primer ciclo de análisis exploratorio de datos (EDA) reproducible, que sirva de base técnica coherente para el desarrollo de fases posteriores del proyecto, entre ellas la eventual estimación de la probabilidad de supervivencia de un pasajero. El valor esperado del análisis es doble: por un lado, diagnosticar la calidad de los datos disponibles; por otro, identificar señales preliminares de asociación entre las variables registradas y la supervivencia, que orienten decisiones de modelado en etapas siguientes.</w:t>
-      </w:r>
-    </w:p>
-    <w:p>
-      <w:pPr>
-        <w:spacing w:after="20" w:line="276" w:lineRule="auto"/>
-        <w:jc w:val="both"/>
-        <w:rPr>
-          <w:rFonts w:ascii="Arial" w:hAnsi="Arial"/>
-          <w:b w:val="0"/>
-          <w:bCs w:val="0"/>
-          <w:i w:val="0"/>
-          <w:iCs w:val="0"/>
-          <w:sz w:val="22"/>
-          <w:szCs w:val="22"/>
-        </w:rPr>
-      </w:pPr>
-    </w:p>
-    <w:p xmlns:wp14="http://schemas.microsoft.com/office/word/2010/wordml" wp14:textId="77777777">
+    <w:p>
+      <w:pPr>
+        <w:pStyle w:val="Prrafodelista"/>
+        <w:spacing w:before="0" w:line="276" w:lineRule="auto"/>
+        <w:ind w:left="1080" w:right="227" w:firstLine="0"/>
+      </w:pPr>
+    </w:p>
+    <w:p>
+      <w:pPr>
+        <w:pStyle w:val="Prrafodelista"/>
+        <w:spacing w:before="0" w:line="276" w:lineRule="auto"/>
+        <w:ind w:left="1080" w:right="227" w:firstLine="0"/>
+      </w:pPr>
+    </w:p>
+    <w:p>
+      <w:pPr>
+        <w:pStyle w:val="Prrafodelista"/>
+        <w:spacing w:before="0" w:line="276" w:lineRule="auto"/>
+        <w:ind w:left="1080" w:right="227" w:firstLine="0"/>
+      </w:pPr>
+    </w:p>
+    <w:p>
+      <w:pPr>
+        <w:pStyle w:val="Prrafodelista"/>
+        <w:spacing w:before="0" w:line="276" w:lineRule="auto"/>
+        <w:ind w:left="1080" w:right="227" w:firstLine="0"/>
+      </w:pPr>
+    </w:p>
+    <w:p>
+      <w:pPr>
+        <w:pStyle w:val="Prrafodelista"/>
+        <w:spacing w:before="0" w:line="276" w:lineRule="auto"/>
+        <w:ind w:left="1080" w:right="227" w:firstLine="0"/>
+      </w:pPr>
+    </w:p>
+    <w:p>
+      <w:pPr>
+        <w:pStyle w:val="Prrafodelista"/>
+        <w:spacing w:before="0" w:line="276" w:lineRule="auto"/>
+        <w:ind w:left="1080" w:right="227" w:firstLine="0"/>
+      </w:pPr>
+    </w:p>
+    <w:p>
+      <w:pPr>
+        <w:pStyle w:val="Prrafodelista"/>
+        <w:spacing w:before="0" w:line="276" w:lineRule="auto"/>
+        <w:ind w:left="1080" w:right="227" w:firstLine="0"/>
+      </w:pPr>
+    </w:p>
+    <w:p>
+      <w:pPr>
+        <w:pStyle w:val="Prrafodelista"/>
+        <w:spacing w:before="0" w:line="276" w:lineRule="auto"/>
+        <w:ind w:left="1080" w:right="227" w:firstLine="0"/>
+      </w:pPr>
+    </w:p>
+    <w:p>
+      <w:pPr>
+        <w:pStyle w:val="Prrafodelista"/>
+        <w:spacing w:before="0" w:line="276" w:lineRule="auto"/>
+        <w:ind w:left="1080" w:right="227" w:firstLine="0"/>
+      </w:pPr>
+    </w:p>
+    <w:p>
+      <w:pPr>
+        <w:pStyle w:val="Prrafodelista"/>
+        <w:spacing w:before="0" w:line="276" w:lineRule="auto"/>
+        <w:ind w:left="1080" w:right="227" w:firstLine="0"/>
+      </w:pPr>
+    </w:p>
+    <w:p>
+      <w:pPr>
+        <w:pStyle w:val="Prrafodelista"/>
+        <w:spacing w:before="0" w:line="276" w:lineRule="auto"/>
+        <w:ind w:left="1080" w:right="227" w:firstLine="0"/>
+      </w:pPr>
+    </w:p>
+    <w:p>
       <w:pPr>
         <w:pStyle w:val="Ttulo2"/>
         <w:spacing w:before="0"/>
         <w:jc w:val="both"/>
       </w:pPr>
       <w:r>
-        <w:rPr/>
-        <w:t>III. Objetivo exploratorio, preguntas iniciales y alcance del avance</w:t>
-      </w:r>
-    </w:p>
-    <w:p xmlns:wp14="http://schemas.microsoft.com/office/word/2010/wordml" wp14:textId="77777777">
+        <w:t>II. Introducción y contextualización</w:t>
+      </w:r>
+    </w:p>
+    <w:p>
       <w:pPr>
         <w:spacing w:after="20" w:line="276" w:lineRule="auto"/>
         <w:jc w:val="both"/>
       </w:pPr>
       <w:r>
-        <w:rPr>
-          <w:rFonts w:ascii="Arial" w:hAnsi="Arial"/>
-          <w:b w:val="0"/>
-          <w:bCs w:val="0"/>
-          <w:i w:val="0"/>
-          <w:iCs w:val="0"/>
-          <w:sz w:val="22"/>
-          <w:szCs w:val="22"/>
-        </w:rPr>
-        <w:t>Objetivo exploratorio: implementar un primer ciclo de EDA reproducible sobre el dataset Titanic que permita caracterizar la estructura y calidad del conjunto de datos, identificar patrones preliminares de asociación con la supervivencia, y documentar de forma trazable las decisiones, supuestos y limitaciones.</w:t>
-      </w:r>
-    </w:p>
-    <w:p xmlns:wp14="http://schemas.microsoft.com/office/word/2010/wordml" wp14:textId="77777777">
+        <w:t>El hundimiento del RMS Titanic (1912) es un naufragio ampliamente documentado: de 2</w:t>
+      </w:r>
+      <w:r>
+        <w:t>.</w:t>
+      </w:r>
+      <w:r>
+        <w:t xml:space="preserve">224 personas a bordo murieron 1502 (Kaggle, s. f.), por la falta de botes salvavidas, y la evidencia histórica sugiere que sexo, clase de pasaje y edad condicionaron la supervivencia. Se trabaja con Titanic-Dataset.csv (891 pasajeros, 12 variables): información demográfica, socioeconómica y de composición familiar. Este avance consolida un primer ciclo de análisis exploratorio de datos (EDA) reproducible como base de las fases posteriores, incluida la eventual estimación de supervivencia; su valor esperado </w:t>
+      </w:r>
+      <w:r>
+        <w:t>es diagnosticar la calidad de los datos e identificar señales preliminares de asociación con la supervivencia que orienten el modelado.</w:t>
+      </w:r>
+    </w:p>
+    <w:p>
       <w:pPr>
         <w:spacing w:after="20" w:line="276" w:lineRule="auto"/>
         <w:jc w:val="both"/>
       </w:pPr>
-      <w:r>
-        <w:rPr>
-          <w:rFonts w:ascii="Arial" w:hAnsi="Arial"/>
-          <w:b w:val="1"/>
-          <w:bCs w:val="1"/>
-          <w:i w:val="0"/>
-          <w:iCs w:val="0"/>
-          <w:sz w:val="22"/>
-          <w:szCs w:val="22"/>
-        </w:rPr>
-        <w:t>Preguntas exploratorias iniciales:</w:t>
-      </w:r>
-    </w:p>
-    <w:p xmlns:wp14="http://schemas.microsoft.com/office/word/2010/wordml" wp14:textId="77777777">
-      <w:pPr>
-        <w:spacing w:after="0" w:line="276" w:lineRule="auto"/>
-        <w:ind w:left="180"/>
-        <w:jc w:val="both"/>
-      </w:pPr>
-      <w:r>
-        <w:rPr>
-          <w:rFonts w:ascii="Arial" w:hAnsi="Arial"/>
-          <w:sz w:val="22"/>
-          <w:szCs w:val="22"/>
-        </w:rPr>
-        <w:t xml:space="preserve">• </w:t>
-      </w:r>
-      <w:r>
-        <w:rPr>
-          <w:rFonts w:ascii="Arial" w:hAnsi="Arial"/>
-          <w:sz w:val="22"/>
-          <w:szCs w:val="22"/>
-        </w:rPr>
-        <w:t>¿Cuál es la estructura general del dataset (dimensiones, tipos de variables, completitud)?</w:t>
-      </w:r>
-    </w:p>
-    <w:p xmlns:wp14="http://schemas.microsoft.com/office/word/2010/wordml" wp14:textId="77777777">
-      <w:pPr>
-        <w:spacing w:after="0" w:line="276" w:lineRule="auto"/>
-        <w:ind w:left="180"/>
-        <w:jc w:val="both"/>
-      </w:pPr>
-      <w:r>
-        <w:rPr>
-          <w:rFonts w:ascii="Arial" w:hAnsi="Arial"/>
-          <w:sz w:val="22"/>
-          <w:szCs w:val="22"/>
-        </w:rPr>
-        <w:t xml:space="preserve">• </w:t>
-      </w:r>
-      <w:r>
-        <w:rPr>
-          <w:rFonts w:ascii="Arial" w:hAnsi="Arial"/>
-          <w:sz w:val="22"/>
-          <w:szCs w:val="22"/>
-        </w:rPr>
-        <w:t>¿Cómo se distribuye la tasa de supervivencia global y según variables categóricas clave (sexo, clase de pasaje, puerto de embarque)?</w:t>
-      </w:r>
-    </w:p>
-    <w:p xmlns:wp14="http://schemas.microsoft.com/office/word/2010/wordml" wp14:textId="77777777">
-      <w:pPr>
-        <w:spacing w:after="0" w:line="276" w:lineRule="auto"/>
-        <w:ind w:left="180"/>
-        <w:jc w:val="both"/>
-      </w:pPr>
-      <w:r>
-        <w:rPr>
-          <w:rFonts w:ascii="Arial" w:hAnsi="Arial"/>
-          <w:sz w:val="22"/>
-          <w:szCs w:val="22"/>
-        </w:rPr>
-        <w:t xml:space="preserve">• </w:t>
-      </w:r>
-      <w:r>
-        <w:rPr>
-          <w:rFonts w:ascii="Arial" w:hAnsi="Arial"/>
-          <w:sz w:val="22"/>
-          <w:szCs w:val="22"/>
-        </w:rPr>
-        <w:t>¿Existen diferencias en variables numéricas (edad, tarifa, tamaño familiar) entre sobrevivientes y no sobrevivientes?</w:t>
-      </w:r>
-    </w:p>
-    <w:p xmlns:wp14="http://schemas.microsoft.com/office/word/2010/wordml" wp14:textId="77777777">
-      <w:pPr>
-        <w:spacing w:after="0" w:line="276" w:lineRule="auto"/>
-        <w:ind w:left="180"/>
-        <w:jc w:val="both"/>
-      </w:pPr>
-      <w:r>
-        <w:rPr>
-          <w:rFonts w:ascii="Arial" w:hAnsi="Arial"/>
-          <w:sz w:val="22"/>
-          <w:szCs w:val="22"/>
-        </w:rPr>
-        <w:t xml:space="preserve">• </w:t>
-      </w:r>
-      <w:r>
-        <w:rPr>
-          <w:rFonts w:ascii="Arial" w:hAnsi="Arial"/>
-          <w:sz w:val="22"/>
-          <w:szCs w:val="22"/>
-        </w:rPr>
-        <w:t>¿Qué variables presentan valores faltantes relevantes y cómo deberían tratarse en esta primera etapa?</w:t>
-      </w:r>
-    </w:p>
-    <w:p xmlns:wp14="http://schemas.microsoft.com/office/word/2010/wordml" wp14:textId="77777777">
-      <w:pPr>
-        <w:spacing w:after="0" w:line="276" w:lineRule="auto"/>
-        <w:ind w:left="180"/>
-        <w:jc w:val="both"/>
-      </w:pPr>
-      <w:r>
-        <w:rPr>
-          <w:rFonts w:ascii="Arial" w:hAnsi="Arial"/>
-          <w:sz w:val="22"/>
-          <w:szCs w:val="22"/>
-        </w:rPr>
-        <w:t xml:space="preserve">• </w:t>
-      </w:r>
-      <w:r>
-        <w:rPr>
-          <w:rFonts w:ascii="Arial" w:hAnsi="Arial"/>
-          <w:sz w:val="22"/>
-          <w:szCs w:val="22"/>
-        </w:rPr>
-        <w:t>¿Se observan valores atípicos evidentes en variables numéricas continuas como Fare y Age?</w:t>
-      </w:r>
-    </w:p>
-    <w:p xmlns:wp14="http://schemas.microsoft.com/office/word/2010/wordml" wp14:textId="77777777">
-      <w:pPr>
-        <w:spacing w:after="20" w:line="276" w:lineRule="auto"/>
-        <w:jc w:val="both"/>
-      </w:pPr>
-      <w:r>
-        <w:rPr>
-          <w:rFonts w:ascii="Arial" w:hAnsi="Arial"/>
-          <w:b w:val="0"/>
-          <w:bCs w:val="0"/>
-          <w:i w:val="0"/>
-          <w:iCs w:val="0"/>
-          <w:sz w:val="22"/>
-          <w:szCs w:val="22"/>
-        </w:rPr>
-        <w:t>Alcance del avance: se cubre la carga y revisión inicial del dataset, la exploración descriptiva univariada y bivariada, la construcción de variables derivadas (tamaño familiar, indicador de viajar solo, título extraído del nombre, indicador de cabina registrada) y la síntesis de hallazgos iniciales. No se realiza en esta fase imputación definitiva de valores faltantes, codificación final de variables ni modelado predictivo.</w:t>
-      </w:r>
-    </w:p>
-    <w:p xmlns:wp14="http://schemas.microsoft.com/office/word/2010/wordml" wp14:textId="77777777">
-      <w:pPr>
-        <w:spacing w:after="20" w:line="276" w:lineRule="auto"/>
-        <w:jc w:val="both"/>
-      </w:pPr>
-      <w:r>
-        <w:rPr>
-          <w:rFonts w:ascii="Arial" w:hAnsi="Arial"/>
-          <w:b w:val="0"/>
-          <w:bCs w:val="0"/>
-          <w:i w:val="0"/>
-          <w:iCs w:val="0"/>
-          <w:sz w:val="22"/>
-          <w:szCs w:val="22"/>
-        </w:rPr>
-        <w:t>Supuestos iniciales y limitaciones preliminares: el dataset corresponde a un subconjunto de 891 pasajeros y no representa la totalidad de personas a bordo; la ausencia de Age podría asociarse a variables observadas como Pclass, y los 2 casos faltantes de Embarked se tratan de forma puntual. Como limitación preliminar, Cabin presenta demasiados valores faltantes (~77%) para su uso directo.</w:t>
-      </w:r>
-    </w:p>
-    <w:p>
-      <w:pPr>
-        <w:spacing w:after="20" w:line="276" w:lineRule="auto"/>
-        <w:jc w:val="both"/>
-        <w:rPr>
-          <w:rFonts w:ascii="Arial" w:hAnsi="Arial"/>
-          <w:b w:val="0"/>
-          <w:bCs w:val="0"/>
-          <w:i w:val="0"/>
-          <w:iCs w:val="0"/>
-          <w:sz w:val="22"/>
-          <w:szCs w:val="22"/>
-        </w:rPr>
-      </w:pPr>
-    </w:p>
-    <w:p xmlns:wp14="http://schemas.microsoft.com/office/word/2010/wordml" wp14:textId="77777777">
+    </w:p>
+    <w:p>
       <w:pPr>
         <w:pStyle w:val="Ttulo2"/>
         <w:spacing w:before="0"/>
         <w:jc w:val="both"/>
       </w:pPr>
       <w:r>
-        <w:rPr/>
-        <w:t>IV. Implementación inicial del EDA en notebook</w:t>
-      </w:r>
-    </w:p>
-    <w:p xmlns:wp14="http://schemas.microsoft.com/office/word/2010/wordml" wp14:textId="77777777">
+        <w:t>III. Objetivo exploratorio, preguntas iniciales y alcance del avance</w:t>
+      </w:r>
+    </w:p>
+    <w:p>
       <w:pPr>
         <w:spacing w:after="20" w:line="276" w:lineRule="auto"/>
         <w:jc w:val="both"/>
       </w:pPr>
       <w:r>
-        <w:rPr>
-          <w:rFonts w:ascii="Arial" w:hAnsi="Arial"/>
-          <w:b w:val="0"/>
-          <w:bCs w:val="0"/>
-          <w:i w:val="0"/>
-          <w:iCs w:val="0"/>
-          <w:sz w:val="22"/>
-          <w:szCs w:val="22"/>
-        </w:rPr>
-        <w:t>El notebook mcdi503_f1_sumativo_grupo5.ipynb implementa el flujo descrito en 8 apartados: (I) Identificación del proyecto, (II) Contexto y objetivo exploratorio, (III) Carga y revisión inicial de datos, (IV) Exploración preliminar, (V) Decisiones y transformaciones iniciales, (VI) Resultados e interpretación inicial, (VII) Supuestos y limitaciones, (VIII) Cierre del avance. Cada apartado combina celdas narrativas en Markdown (contexto, justificación e interpretación) con celdas de código ejecutables (carga de datos, cálculos y visualizaciones implementados con pandas y seaborn; McKinney, 2010; The pandas development team, 2026; Waskom, 2021), de modo que el razonamiento y la evidencia computacional queden integrados en una misma secuencia legible.</w:t>
-      </w:r>
-    </w:p>
-    <w:p xmlns:wp14="http://schemas.microsoft.com/office/word/2010/wordml" wp14:textId="77777777">
+        <w:t xml:space="preserve">Objetivo exploratorio: implementar un primer ciclo de EDA reproducible sobre el dataset Titanic que permita caracterizar su estructura y calidad, identificar patrones preliminares de asociación con la supervivencia y documentar de forma trazable decisiones, supuestos y limitaciones. </w:t>
+      </w:r>
+      <w:r>
+        <w:rPr>
+          <w:b/>
+        </w:rPr>
+        <w:t>Preguntas exploratorias iniciales:</w:t>
+      </w:r>
+    </w:p>
+    <w:p>
+      <w:pPr>
+        <w:spacing w:line="276" w:lineRule="auto"/>
+        <w:ind w:left="180"/>
+        <w:jc w:val="both"/>
+      </w:pPr>
+      <w:r>
+        <w:t>• ¿Cuál es la estructura general del dataset (dimensiones, tipos de variables, completitud)?</w:t>
+      </w:r>
+    </w:p>
+    <w:p>
+      <w:pPr>
+        <w:spacing w:line="276" w:lineRule="auto"/>
+        <w:ind w:left="180"/>
+        <w:jc w:val="both"/>
+      </w:pPr>
+      <w:r>
+        <w:t>• ¿Cómo se distribuye la supervivencia global y según sexo, clase de pasaje y puerto de embarque?</w:t>
+      </w:r>
+    </w:p>
+    <w:p>
+      <w:pPr>
+        <w:spacing w:line="276" w:lineRule="auto"/>
+        <w:ind w:left="180"/>
+        <w:jc w:val="both"/>
+      </w:pPr>
+      <w:r>
+        <w:t>• ¿Difieren edad, tarifa y tamaño familiar entre sobrevivientes y no sobrevivientes?</w:t>
+      </w:r>
+    </w:p>
+    <w:p>
+      <w:pPr>
+        <w:spacing w:line="276" w:lineRule="auto"/>
+        <w:ind w:left="180"/>
+        <w:jc w:val="both"/>
+      </w:pPr>
+      <w:r>
+        <w:t>• ¿Qué variables presentan faltantes relevantes y cómo tratarlos en esta primera etapa?</w:t>
+      </w:r>
+    </w:p>
+    <w:p>
+      <w:pPr>
+        <w:spacing w:line="276" w:lineRule="auto"/>
+        <w:ind w:left="180"/>
+        <w:jc w:val="both"/>
+      </w:pPr>
+      <w:r>
+        <w:t>• ¿Se observan valores atípicos evidentes en variables numéricas continuas como Fare y Age?</w:t>
+      </w:r>
+    </w:p>
+    <w:p>
       <w:pPr>
         <w:spacing w:after="20" w:line="276" w:lineRule="auto"/>
         <w:jc w:val="both"/>
       </w:pPr>
       <w:r>
-        <w:rPr>
-          <w:rFonts w:ascii="Arial" w:hAnsi="Arial"/>
-          <w:b w:val="0"/>
-          <w:bCs w:val="0"/>
-          <w:i w:val="0"/>
-          <w:iCs w:val="0"/>
-          <w:sz w:val="22"/>
-          <w:szCs w:val="22"/>
-        </w:rPr>
-        <w:t>Cada pregunta exploratoria planteada en el apartado III de este informe se responde con una acción concreta en el notebook: la estructura y completitud del dataset se aborda en el apartado III del notebook (carga y revisión inicial); el diagnóstico y tratamiento inicial de valores faltantes en los apartados III y V; las distribuciones univariadas y frecuencias categóricas en el apartado IV (exploración preliminar); las diferencias entre grupos y la detección de outliers en el apartado VI (resultados e interpretación inicial), apoyado en las variables derivadas del apartado V (decisiones y transformaciones iniciales).</w:t>
+        <w:t>Alcance: carga y revisión, exploración univariada y bivariada, variables derivadas (tamaño familiar, viajar solo, título, cabina registrada) y síntesis; sin imputación definitiva, codificación ni modelado.</w:t>
       </w:r>
     </w:p>
     <w:p>
       <w:pPr>
         <w:spacing w:after="20" w:line="276" w:lineRule="auto"/>
         <w:jc w:val="both"/>
-        <w:rPr>
-          <w:rFonts w:ascii="Arial" w:hAnsi="Arial"/>
-          <w:b w:val="0"/>
-          <w:bCs w:val="0"/>
-          <w:i w:val="0"/>
-          <w:iCs w:val="0"/>
-          <w:sz w:val="22"/>
-          <w:szCs w:val="22"/>
-        </w:rPr>
-      </w:pPr>
-    </w:p>
-    <w:p xmlns:wp14="http://schemas.microsoft.com/office/word/2010/wordml" wp14:textId="77777777">
+      </w:pPr>
+      <w:r>
+        <w:t>Supuestos iniciales y limitaciones preliminares: el dataset es un subconjunto de 891 pasajeros, no la totalidad de personas a bordo; la ausencia de Age podría asociarse a Pclass y los 2 faltantes de Embarked se tratan de forma puntual; Cabin tiene demasiados faltantes (~77%) para su uso directo.</w:t>
+      </w:r>
+    </w:p>
+    <w:p>
+      <w:pPr>
+        <w:spacing w:after="20" w:line="276" w:lineRule="auto"/>
+        <w:jc w:val="both"/>
+      </w:pPr>
+    </w:p>
+    <w:p>
       <w:pPr>
         <w:pStyle w:val="Ttulo2"/>
         <w:spacing w:before="0"/>
         <w:jc w:val="both"/>
       </w:pPr>
       <w:r>
-        <w:rPr/>
-        <w:t>V. Documentación trazable de decisiones exploratorias</w:t>
-      </w:r>
-    </w:p>
-    <w:p xmlns:wp14="http://schemas.microsoft.com/office/word/2010/wordml" wp14:textId="77777777">
+        <w:t>IV. Implementación inicial del EDA en notebook</w:t>
+      </w:r>
+    </w:p>
+    <w:p>
       <w:pPr>
         <w:spacing w:after="20" w:line="276" w:lineRule="auto"/>
         <w:jc w:val="both"/>
       </w:pPr>
       <w:r>
-        <w:rPr>
-          <w:rFonts w:ascii="Arial" w:hAnsi="Arial"/>
-          <w:b w:val="0"/>
-          <w:bCs w:val="0"/>
-          <w:i w:val="0"/>
-          <w:iCs w:val="0"/>
-          <w:sz w:val="22"/>
-          <w:szCs w:val="22"/>
-        </w:rPr>
-        <w:t>En el apartado V del notebook se registran cinco decisiones exploratorias, cada una con su justificación y el resultado intermedio que produjo:</w:t>
-      </w:r>
-    </w:p>
-    <w:p xmlns:wp14="http://schemas.microsoft.com/office/word/2010/wordml" wp14:textId="77777777">
-      <w:pPr>
-        <w:spacing w:after="0" w:line="276" w:lineRule="auto"/>
-        <w:ind w:left="180"/>
-        <w:jc w:val="both"/>
-      </w:pPr>
-      <w:r>
-        <w:rPr>
-          <w:rFonts w:ascii="Arial" w:hAnsi="Arial"/>
-          <w:sz w:val="22"/>
-          <w:szCs w:val="22"/>
-        </w:rPr>
-        <w:t xml:space="preserve">• </w:t>
-      </w:r>
-      <w:r>
-        <w:rPr>
-          <w:rFonts w:ascii="Arial" w:hAnsi="Arial"/>
-          <w:b w:val="1"/>
-          <w:bCs w:val="1"/>
-          <w:sz w:val="22"/>
-          <w:szCs w:val="22"/>
-        </w:rPr>
-        <w:t>Cabin —</w:t>
-      </w:r>
-      <w:r>
-        <w:rPr>
-          <w:rFonts w:ascii="Arial" w:hAnsi="Arial"/>
-          <w:sz w:val="22"/>
-          <w:szCs w:val="22"/>
-        </w:rPr>
-        <w:t xml:space="preserve"> con 77,1% de valores faltantes, no se imputa; se crea el indicador binario Cabin_registrada, porque la sola presencia del dato puede ser informativa.</w:t>
-      </w:r>
-    </w:p>
-    <w:p xmlns:wp14="http://schemas.microsoft.com/office/word/2010/wordml" wp14:textId="77777777">
-      <w:pPr>
-        <w:spacing w:after="0" w:line="276" w:lineRule="auto"/>
-        <w:ind w:left="180"/>
-        <w:jc w:val="both"/>
-      </w:pPr>
-      <w:r>
-        <w:rPr>
-          <w:rFonts w:ascii="Arial" w:hAnsi="Arial"/>
-          <w:sz w:val="22"/>
-          <w:szCs w:val="22"/>
-        </w:rPr>
-        <w:t xml:space="preserve">• </w:t>
-      </w:r>
-      <w:r>
-        <w:rPr>
-          <w:rFonts w:ascii="Arial" w:hAnsi="Arial"/>
-          <w:b w:val="1"/>
-          <w:bCs w:val="1"/>
-          <w:sz w:val="22"/>
-          <w:szCs w:val="22"/>
-        </w:rPr>
-        <w:t>Age —</w:t>
-      </w:r>
-      <w:r>
-        <w:rPr>
-          <w:rFonts w:ascii="Arial" w:hAnsi="Arial"/>
-          <w:sz w:val="22"/>
-          <w:szCs w:val="22"/>
-        </w:rPr>
-        <w:t xml:space="preserve"> con 19,9% de valores faltantes, se mantiene sin imputar en esta fase; se crea Age_registrada y se calcula, solo con fines diagnósticos, la mediana de edad por Pclass (37 años en 1ª clase, 29 en 2ª, 24 en 3ª) y se verifica que la proporción de faltantes difiere por clase (13,9% / 6,0% / 27,7%), lo que sugiere asociación con Pclass.</w:t>
-      </w:r>
-    </w:p>
-    <w:p xmlns:wp14="http://schemas.microsoft.com/office/word/2010/wordml" wp14:textId="77777777">
-      <w:pPr>
-        <w:spacing w:after="0" w:line="276" w:lineRule="auto"/>
-        <w:ind w:left="180"/>
-        <w:jc w:val="both"/>
-      </w:pPr>
-      <w:r>
-        <w:rPr>
-          <w:rFonts w:ascii="Arial" w:hAnsi="Arial"/>
-          <w:sz w:val="22"/>
-          <w:szCs w:val="22"/>
-        </w:rPr>
-        <w:t xml:space="preserve">• </w:t>
-      </w:r>
-      <w:r>
-        <w:rPr>
-          <w:rFonts w:ascii="Arial" w:hAnsi="Arial"/>
-          <w:b w:val="1"/>
-          <w:bCs w:val="1"/>
-          <w:sz w:val="22"/>
-          <w:szCs w:val="22"/>
-        </w:rPr>
-        <w:t>Embarked —</w:t>
-      </w:r>
-      <w:r>
-        <w:rPr>
-          <w:rFonts w:ascii="Arial" w:hAnsi="Arial"/>
-          <w:sz w:val="22"/>
-          <w:szCs w:val="22"/>
-        </w:rPr>
-        <w:t xml:space="preserve"> solo 2 casos faltantes (0,22%); se imputan con la moda ('S'), generando Embarked_imputado, dado el impacto marginal sobre la muestra.</w:t>
-      </w:r>
-    </w:p>
-    <w:p xmlns:wp14="http://schemas.microsoft.com/office/word/2010/wordml" wp14:textId="77777777">
-      <w:pPr>
-        <w:spacing w:after="0" w:line="276" w:lineRule="auto"/>
-        <w:ind w:left="180"/>
-        <w:jc w:val="both"/>
-      </w:pPr>
-      <w:r>
-        <w:rPr>
-          <w:rFonts w:ascii="Arial" w:hAnsi="Arial"/>
-          <w:sz w:val="22"/>
-          <w:szCs w:val="22"/>
-        </w:rPr>
-        <w:t xml:space="preserve">• </w:t>
-      </w:r>
-      <w:r>
-        <w:rPr>
-          <w:rFonts w:ascii="Arial" w:hAnsi="Arial"/>
-          <w:b w:val="1"/>
-          <w:bCs w:val="1"/>
-          <w:sz w:val="22"/>
-          <w:szCs w:val="22"/>
-        </w:rPr>
-        <w:t>FamilySize / IsAlone —</w:t>
-      </w:r>
-      <w:r>
-        <w:rPr>
-          <w:rFonts w:ascii="Arial" w:hAnsi="Arial"/>
-          <w:sz w:val="22"/>
-          <w:szCs w:val="22"/>
-        </w:rPr>
-        <w:t xml:space="preserve"> se combinan SibSp y Parch en FamilySize = SibSp + Parch + 1, y se deriva IsAlone, para observar el efecto del tamaño del grupo familiar sobre la supervivencia.</w:t>
-      </w:r>
-    </w:p>
-    <w:p xmlns:wp14="http://schemas.microsoft.com/office/word/2010/wordml" wp14:textId="77777777">
-      <w:pPr>
-        <w:spacing w:after="0" w:line="276" w:lineRule="auto"/>
-        <w:ind w:left="180"/>
-        <w:jc w:val="both"/>
-      </w:pPr>
-      <w:r>
-        <w:rPr>
-          <w:rFonts w:ascii="Arial" w:hAnsi="Arial"/>
-          <w:sz w:val="22"/>
-          <w:szCs w:val="22"/>
-        </w:rPr>
-        <w:t xml:space="preserve">• </w:t>
-      </w:r>
-      <w:r>
-        <w:rPr>
-          <w:rFonts w:ascii="Arial" w:hAnsi="Arial"/>
-          <w:b w:val="1"/>
-          <w:bCs w:val="1"/>
-          <w:sz w:val="22"/>
-          <w:szCs w:val="22"/>
-        </w:rPr>
-        <w:t>Title —</w:t>
-      </w:r>
-      <w:r>
-        <w:rPr>
-          <w:rFonts w:ascii="Arial" w:hAnsi="Arial"/>
-          <w:sz w:val="22"/>
-          <w:szCs w:val="22"/>
-        </w:rPr>
-        <w:t xml:space="preserve"> se extrae el tratamiento (Mr., Mrs., Miss., Master., etc.) desde Name mediante expresión regular, agrupando categorías poco frecuentes en 'Other', para condensar información demográfica y de estatus.</w:t>
-      </w:r>
-    </w:p>
-    <w:p xmlns:wp14="http://schemas.microsoft.com/office/word/2010/wordml" wp14:textId="77777777">
+        <w:t>El notebook mcdi503_f1_sumativo_grupo5.ipynb se organiza en 8 apartados (identificación; contexto y objetivo; carga y revisión inicial; exploración preliminar; decisiones y transformaciones; resultados e interpretación; supuestos y limitaciones; cierre), cada uno con celdas narrativas en Markdown (contexto, justificación e interpretación) y celdas de código en pandas y seaborn (McKinney, 2010; The pandas development team, 2026; Waskom, 2021), integrando razonamiento y evidencia en una secuencia.</w:t>
+      </w:r>
+    </w:p>
+    <w:p>
       <w:pPr>
         <w:spacing w:after="20" w:line="276" w:lineRule="auto"/>
         <w:jc w:val="both"/>
       </w:pPr>
       <w:r>
-        <w:rPr>
-          <w:rFonts w:ascii="Arial" w:hAnsi="Arial"/>
-          <w:b w:val="0"/>
-          <w:bCs w:val="0"/>
-          <w:i w:val="0"/>
-          <w:iCs w:val="0"/>
-          <w:sz w:val="22"/>
-          <w:szCs w:val="22"/>
-        </w:rPr>
-        <w:t>Estas decisiones y sus resultados intermedios (tabla de medianas por clase, distribución de títulos, vista del dataset ampliado) se documentan en el apartado V del notebook, y su efecto sobre la exploración se retoma explícitamente en el apartado VI.</w:t>
+        <w:t>Cada pregunta del apartado III tiene una acción en el notebook: estructura y completitud (III); faltantes (III y V); distribuciones y frecuencias (IV); diferencias entre grupos y outliers (VI), con las variables derivadas de V.</w:t>
       </w:r>
     </w:p>
     <w:p>
       <w:pPr>
         <w:spacing w:after="20" w:line="276" w:lineRule="auto"/>
         <w:jc w:val="both"/>
-        <w:rPr>
-          <w:rFonts w:ascii="Arial" w:hAnsi="Arial"/>
-          <w:b w:val="0"/>
-          <w:bCs w:val="0"/>
-          <w:i w:val="0"/>
-          <w:iCs w:val="0"/>
-          <w:sz w:val="22"/>
-          <w:szCs w:val="22"/>
-        </w:rPr>
-      </w:pPr>
-    </w:p>
-    <w:p xmlns:wp14="http://schemas.microsoft.com/office/word/2010/wordml" wp14:textId="77777777">
+      </w:pPr>
+    </w:p>
+    <w:p>
       <w:pPr>
         <w:pStyle w:val="Ttulo2"/>
         <w:spacing w:before="0"/>
         <w:jc w:val="both"/>
       </w:pPr>
       <w:r>
-        <w:rPr/>
-        <w:t>VI. Reproducibilidad y coherencia técnica</w:t>
-      </w:r>
-    </w:p>
-    <w:p xmlns:wp14="http://schemas.microsoft.com/office/word/2010/wordml" wp14:textId="6B9BAB77">
-      <w:pPr>
-        <w:pStyle w:val="Normal"/>
-      </w:pPr>
-      <w:r>
-        <w:rPr>
-          <w:rFonts w:ascii="Arial" w:hAnsi="Arial"/>
-          <w:b w:val="0"/>
-          <w:bCs w:val="0"/>
-          <w:i w:val="0"/>
-          <w:iCs w:val="0"/>
-          <w:sz w:val="22"/>
-          <w:szCs w:val="22"/>
-        </w:rPr>
-        <w:t>El notebook se ejecutó de principio a fin sin errores (</w:t>
-      </w:r>
-      <w:r>
-        <w:rPr>
-          <w:rFonts w:ascii="Arial" w:hAnsi="Arial"/>
-          <w:b w:val="0"/>
-          <w:bCs w:val="0"/>
-          <w:i w:val="0"/>
-          <w:iCs w:val="0"/>
-          <w:sz w:val="22"/>
-          <w:szCs w:val="22"/>
-        </w:rPr>
-        <w:t>jupyter</w:t>
-      </w:r>
-      <w:r>
-        <w:rPr>
-          <w:rFonts w:ascii="Arial" w:hAnsi="Arial"/>
-          <w:b w:val="0"/>
-          <w:bCs w:val="0"/>
-          <w:i w:val="0"/>
-          <w:iCs w:val="0"/>
-          <w:sz w:val="22"/>
-          <w:szCs w:val="22"/>
-        </w:rPr>
-        <w:t xml:space="preserve"> </w:t>
-      </w:r>
-      <w:r>
-        <w:rPr>
-          <w:rFonts w:ascii="Arial" w:hAnsi="Arial"/>
-          <w:b w:val="0"/>
-          <w:bCs w:val="0"/>
-          <w:i w:val="0"/>
-          <w:iCs w:val="0"/>
-          <w:sz w:val="22"/>
-          <w:szCs w:val="22"/>
-        </w:rPr>
-        <w:t>nbconvert</w:t>
-      </w:r>
-      <w:r>
-        <w:rPr>
-          <w:rFonts w:ascii="Arial" w:hAnsi="Arial"/>
-          <w:b w:val="0"/>
-          <w:bCs w:val="0"/>
-          <w:i w:val="0"/>
-          <w:iCs w:val="0"/>
-          <w:sz w:val="22"/>
-          <w:szCs w:val="22"/>
-        </w:rPr>
-        <w:t xml:space="preserve"> --</w:t>
-      </w:r>
-      <w:r>
-        <w:rPr>
-          <w:rFonts w:ascii="Arial" w:hAnsi="Arial"/>
-          <w:b w:val="0"/>
-          <w:bCs w:val="0"/>
-          <w:i w:val="0"/>
-          <w:iCs w:val="0"/>
-          <w:sz w:val="22"/>
-          <w:szCs w:val="22"/>
-        </w:rPr>
-        <w:t>execute</w:t>
-      </w:r>
-      <w:r>
-        <w:rPr>
-          <w:rFonts w:ascii="Arial" w:hAnsi="Arial"/>
-          <w:b w:val="0"/>
-          <w:bCs w:val="0"/>
-          <w:i w:val="0"/>
-          <w:iCs w:val="0"/>
-          <w:sz w:val="22"/>
-          <w:szCs w:val="22"/>
-        </w:rPr>
-        <w:t>), en orden secuencial de celdas, sin dependencias externas a los archivos del repositorio ni pasos manuales fuera del propio notebook. Los datos de entrada (data/Titanic-Dataset.csv) se cargan una única vez en el apartado III y todas las transformaciones posteriores (apartado V) se aplican sobre una copia explícita (</w:t>
-      </w:r>
-      <w:r>
-        <w:rPr>
-          <w:rFonts w:ascii="Arial" w:hAnsi="Arial"/>
-          <w:b w:val="0"/>
-          <w:bCs w:val="0"/>
-          <w:i w:val="0"/>
-          <w:iCs w:val="0"/>
-          <w:sz w:val="22"/>
-          <w:szCs w:val="22"/>
-        </w:rPr>
-        <w:t>titanic_exp</w:t>
-      </w:r>
-      <w:r>
-        <w:rPr>
-          <w:rFonts w:ascii="Arial" w:hAnsi="Arial"/>
-          <w:b w:val="0"/>
-          <w:bCs w:val="0"/>
-          <w:i w:val="0"/>
-          <w:iCs w:val="0"/>
-          <w:sz w:val="22"/>
-          <w:szCs w:val="22"/>
-        </w:rPr>
-        <w:t xml:space="preserve">), preservando el </w:t>
-      </w:r>
-      <w:r>
-        <w:rPr>
-          <w:rFonts w:ascii="Arial" w:hAnsi="Arial"/>
-          <w:b w:val="0"/>
-          <w:bCs w:val="0"/>
-          <w:i w:val="0"/>
-          <w:iCs w:val="0"/>
-          <w:sz w:val="22"/>
-          <w:szCs w:val="22"/>
-        </w:rPr>
-        <w:t>dataframe</w:t>
-      </w:r>
-      <w:r>
-        <w:rPr>
-          <w:rFonts w:ascii="Arial" w:hAnsi="Arial"/>
-          <w:b w:val="0"/>
-          <w:bCs w:val="0"/>
-          <w:i w:val="0"/>
-          <w:iCs w:val="0"/>
-          <w:sz w:val="22"/>
-          <w:szCs w:val="22"/>
-        </w:rPr>
-        <w:t xml:space="preserve"> original para trazabilidad. Los resultados presentados en los apartados IV y VI del notebook son reproducibles directamente a partir de esa cadena de transformaciones, sin valores '</w:t>
-      </w:r>
-      <w:r>
-        <w:rPr>
-          <w:rFonts w:ascii="Arial" w:hAnsi="Arial"/>
-          <w:b w:val="0"/>
-          <w:bCs w:val="0"/>
-          <w:i w:val="0"/>
-          <w:iCs w:val="0"/>
-          <w:sz w:val="22"/>
-          <w:szCs w:val="22"/>
-        </w:rPr>
-        <w:t>hardcodeados</w:t>
-      </w:r>
-      <w:r>
-        <w:rPr>
-          <w:rFonts w:ascii="Arial" w:hAnsi="Arial"/>
-          <w:b w:val="0"/>
-          <w:bCs w:val="0"/>
-          <w:i w:val="0"/>
-          <w:iCs w:val="0"/>
-          <w:sz w:val="22"/>
-          <w:szCs w:val="22"/>
-        </w:rPr>
-        <w:t>' que no puedan regenerarse desde el código.</w:t>
-      </w:r>
-    </w:p>
-    <w:p xmlns:wp14="http://schemas.microsoft.com/office/word/2010/wordml" wp14:textId="77777777">
+        <w:t>V. Documentación trazable de decisiones exploratorias</w:t>
+      </w:r>
+    </w:p>
+    <w:p>
       <w:pPr>
         <w:spacing w:after="20" w:line="276" w:lineRule="auto"/>
         <w:jc w:val="both"/>
       </w:pPr>
       <w:r>
-        <w:rPr>
-          <w:rFonts w:ascii="Arial" w:hAnsi="Arial"/>
-          <w:b w:val="0"/>
-          <w:bCs w:val="0"/>
-          <w:i w:val="0"/>
-          <w:iCs w:val="0"/>
-          <w:sz w:val="22"/>
-          <w:szCs w:val="22"/>
-        </w:rPr>
-        <w:t>Criterios básicos de organización aplicados, en línea con las prácticas de reproducibilidad del curso (Paraíso, 2026; Wilson et al., 2017): importación única de librerías y configuración fija de estilo gráfico (sns.set_theme) al inicio, rutas relativas (../data, ../figures) para portabilidad del proyecto, y persistencia de las figuras generadas en figures/ con nombres identificables (f1_titanic_*.png), lo que permite verificar cada resultado gráfico citado en este informe contra su salida original en el notebook.</w:t>
+        <w:t>El apartado V del notebook registra cinco decisiones, cada una con justificación y resultado intermedio:</w:t>
+      </w:r>
+    </w:p>
+    <w:p>
+      <w:pPr>
+        <w:spacing w:line="276" w:lineRule="auto"/>
+        <w:ind w:left="180"/>
+        <w:jc w:val="both"/>
+      </w:pPr>
+      <w:r>
+        <w:t xml:space="preserve">• </w:t>
+      </w:r>
+      <w:r>
+        <w:rPr>
+          <w:b/>
+        </w:rPr>
+        <w:t>Cabin —</w:t>
+      </w:r>
+      <w:r>
+        <w:t xml:space="preserve"> 77,1% faltante: no se imputa; se crea Cabin_registrada, pues su presencia puede informar.</w:t>
+      </w:r>
+    </w:p>
+    <w:p>
+      <w:pPr>
+        <w:spacing w:line="276" w:lineRule="auto"/>
+        <w:ind w:left="180"/>
+        <w:jc w:val="both"/>
+      </w:pPr>
+      <w:r>
+        <w:t xml:space="preserve">• </w:t>
+      </w:r>
+      <w:r>
+        <w:rPr>
+          <w:b/>
+        </w:rPr>
+        <w:t>Age —</w:t>
+      </w:r>
+      <w:r>
+        <w:t xml:space="preserve"> 19,9% faltante, sin imputar; se crea Age_registrada y, como diagnóstico, se calculan mediana de edad (37, 29 y 24 años) y proporción de faltantes (13,9% / 6,0% / 27,7%) por Pclass, lo que sugiere asociación.</w:t>
+      </w:r>
+    </w:p>
+    <w:p>
+      <w:pPr>
+        <w:spacing w:line="276" w:lineRule="auto"/>
+        <w:ind w:left="180"/>
+        <w:jc w:val="both"/>
+      </w:pPr>
+      <w:r>
+        <w:t xml:space="preserve">• </w:t>
+      </w:r>
+      <w:r>
+        <w:rPr>
+          <w:b/>
+        </w:rPr>
+        <w:t>Embarked —</w:t>
+      </w:r>
+      <w:r>
+        <w:t xml:space="preserve"> 2 faltantes (0,22%), impacto marginal: imputados con la moda ('S') en Embarked_imputado.</w:t>
+      </w:r>
+    </w:p>
+    <w:p>
+      <w:pPr>
+        <w:spacing w:line="276" w:lineRule="auto"/>
+        <w:ind w:left="180"/>
+        <w:jc w:val="both"/>
+      </w:pPr>
+      <w:r>
+        <w:t xml:space="preserve">• </w:t>
+      </w:r>
+      <w:r>
+        <w:rPr>
+          <w:b/>
+        </w:rPr>
+        <w:t>FamilySize / IsAlone —</w:t>
+      </w:r>
+      <w:r>
+        <w:t xml:space="preserve"> FamilySize = SibSp + Parch + 1 e IsAlone, para evaluar el efecto familiar.</w:t>
+      </w:r>
+    </w:p>
+    <w:p>
+      <w:pPr>
+        <w:spacing w:line="276" w:lineRule="auto"/>
+        <w:ind w:left="180"/>
+        <w:jc w:val="both"/>
+      </w:pPr>
+      <w:r>
+        <w:t xml:space="preserve">• </w:t>
+      </w:r>
+      <w:r>
+        <w:rPr>
+          <w:b/>
+        </w:rPr>
+        <w:t>Title —</w:t>
+      </w:r>
+      <w:r>
+        <w:t xml:space="preserve"> tratamiento (Mr., Mrs., Miss., </w:t>
+      </w:r>
+      <w:proofErr w:type="gramStart"/>
+      <w:r>
+        <w:t>Master</w:t>
+      </w:r>
+      <w:proofErr w:type="gramEnd"/>
+      <w:r>
+        <w:t>.) extraído de Name con expresión regular, agrupando los poco frecuentes en 'Other'; condensa información demográfica y de estatus.</w:t>
       </w:r>
     </w:p>
     <w:p>
       <w:pPr>
         <w:spacing w:after="20" w:line="276" w:lineRule="auto"/>
         <w:jc w:val="both"/>
-        <w:rPr>
-          <w:rFonts w:ascii="Arial" w:hAnsi="Arial"/>
-          <w:b w:val="0"/>
-          <w:bCs w:val="0"/>
-          <w:i w:val="0"/>
-          <w:iCs w:val="0"/>
-          <w:sz w:val="22"/>
-          <w:szCs w:val="22"/>
-        </w:rPr>
-      </w:pPr>
-    </w:p>
-    <w:p xmlns:wp14="http://schemas.microsoft.com/office/word/2010/wordml" wp14:textId="77777777">
+      </w:pPr>
+      <w:r>
+        <w:lastRenderedPageBreak/>
+        <w:t>Estos resultados intermedios quedan en el apartado V del notebook y se retoman en el VI.</w:t>
+      </w:r>
+    </w:p>
+    <w:p>
       <w:pPr>
         <w:pStyle w:val="Ttulo2"/>
         <w:spacing w:before="0"/>
         <w:jc w:val="both"/>
       </w:pPr>
       <w:r>
-        <w:rPr/>
-        <w:t>VII. Registro del proceso, supuestos y limitaciones</w:t>
-      </w:r>
-    </w:p>
-    <w:p xmlns:wp14="http://schemas.microsoft.com/office/word/2010/wordml" wp14:textId="77777777">
+        <w:t>VI. Reproducibilidad y coherencia técnica</w:t>
+      </w:r>
+    </w:p>
+    <w:p>
       <w:pPr>
         <w:spacing w:after="20" w:line="276" w:lineRule="auto"/>
         <w:jc w:val="both"/>
       </w:pPr>
       <w:r>
-        <w:rPr>
-          <w:rFonts w:ascii="Arial" w:hAnsi="Arial"/>
-          <w:b w:val="1"/>
-          <w:bCs w:val="1"/>
-          <w:i w:val="0"/>
-          <w:iCs w:val="0"/>
-          <w:sz w:val="22"/>
-          <w:szCs w:val="22"/>
-        </w:rPr>
-        <w:t>Pasos principales seguidos durante la exploración:</w:t>
-      </w:r>
-      <w:r>
-        <w:rPr>
-          <w:b w:val="0"/>
-          <w:bCs w:val="0"/>
-          <w:sz w:val="22"/>
-          <w:szCs w:val="22"/>
-        </w:rPr>
-        <w:t xml:space="preserve"> carga del dataset y revisión de dimensiones, tipos de datos y valores faltantes (apartado III); estadísticas descriptivas y visualizaciones univariadas de variables numéricas y categóricas (apartado IV); documentación de cinco decisiones exploratorias y variables derivadas (apartado V); análisis bivariado frente a Survived, detección de outliers con IQR y matriz de correlación (apartado VI); síntesis de hallazgos y proyección (apartado VIII).</w:t>
-      </w:r>
-    </w:p>
-    <w:p xmlns:wp14="http://schemas.microsoft.com/office/word/2010/wordml" wp14:textId="77777777">
+        <w:t>Ejecutado sin errores (jupyter nbconvert --execute), en orden secuencial, sin dependencias externas; los datos (data/Titanic-Dataset.csv) se cargan una vez (III), las transformaciones (V) usan una copia (titanic_exp) que preserva el original y los de IV y VI se regeneran de esa cadena sin valores 'hardcodeados'.</w:t>
+      </w:r>
+    </w:p>
+    <w:p>
       <w:pPr>
         <w:spacing w:after="20" w:line="276" w:lineRule="auto"/>
         <w:jc w:val="both"/>
       </w:pPr>
       <w:r>
-        <w:rPr>
-          <w:rFonts w:ascii="Arial" w:hAnsi="Arial"/>
-          <w:b w:val="1"/>
-          <w:bCs w:val="1"/>
-          <w:i w:val="0"/>
-          <w:iCs w:val="0"/>
-          <w:sz w:val="22"/>
-          <w:szCs w:val="22"/>
-        </w:rPr>
-        <w:t>Supuestos considerados:</w:t>
-      </w:r>
-      <w:r>
-        <w:rPr>
-          <w:b w:val="0"/>
-          <w:bCs w:val="0"/>
-          <w:sz w:val="22"/>
-          <w:szCs w:val="22"/>
-        </w:rPr>
-        <w:t xml:space="preserve"> el dataset no contiene duplicados relevantes (PassengerId es único) y refleja fielmente la información oficial disponible; la ausencia de Age podría estar asociada a variables observadas como Pclass; para Cabin no se evalúa el mecanismo de ausencia y su tratamiento se posterga por su elevada proporción de faltantes; ninguna se imputa de forma definitiva.</w:t>
-      </w:r>
-    </w:p>
-    <w:p xmlns:wp14="http://schemas.microsoft.com/office/word/2010/wordml" wp14:textId="77777777">
+        <w:t xml:space="preserve">Criterios de organización acordes con las prácticas de reproducibilidad (Paraíso, 2026; Wilson et al., 2017): importación única de librerías, estilo gráfico fijo (sns.set_theme), rutas relativas </w:t>
+      </w:r>
+      <w:proofErr w:type="gramStart"/>
+      <w:r>
+        <w:t>(..</w:t>
+      </w:r>
+      <w:proofErr w:type="gramEnd"/>
+      <w:r>
+        <w:t>/</w:t>
+      </w:r>
+      <w:proofErr w:type="gramStart"/>
+      <w:r>
+        <w:t>data, ..</w:t>
+      </w:r>
+      <w:proofErr w:type="gramEnd"/>
+      <w:r>
+        <w:t>/figures) y figuras persistidas en figures/ (f1_titanic_*.png), verificables en el notebook.</w:t>
+      </w:r>
+    </w:p>
+    <w:p>
       <w:pPr>
         <w:spacing w:after="20" w:line="276" w:lineRule="auto"/>
         <w:jc w:val="both"/>
       </w:pPr>
-      <w:r>
-        <w:rPr>
-          <w:rFonts w:ascii="Arial" w:hAnsi="Arial"/>
-          <w:b w:val="1"/>
-          <w:bCs w:val="1"/>
-          <w:i w:val="0"/>
-          <w:iCs w:val="0"/>
-          <w:sz w:val="22"/>
-          <w:szCs w:val="22"/>
-        </w:rPr>
-        <w:t>Limitaciones detectadas:</w:t>
-      </w:r>
-      <w:r>
-        <w:rPr>
-          <w:b w:val="0"/>
-          <w:bCs w:val="0"/>
-          <w:sz w:val="22"/>
-          <w:szCs w:val="22"/>
-        </w:rPr>
-        <w:t xml:space="preserve"> Cabin es inutilizable de forma directa por su altísima tasa de valores faltantes (77,1%); solo se aprovechó como indicador binario; el 19,9% de valores faltantes en Age limita la robustez de los análisis que la involucran; no se realizaron pruebas estadísticas formales de asociación (p. ej., chi-cuadrado); las lecturas de esta fase son descriptivas, no inferenciales.</w:t>
-      </w:r>
-    </w:p>
-    <w:p xmlns:wp14="http://schemas.microsoft.com/office/word/2010/wordml" wp14:textId="77777777">
-      <w:pPr>
-        <w:spacing w:after="20" w:line="276" w:lineRule="auto"/>
-        <w:jc w:val="both"/>
-      </w:pPr>
-      <w:r>
-        <w:rPr>
-          <w:rFonts w:ascii="Arial" w:hAnsi="Arial"/>
-          <w:b w:val="0"/>
-          <w:bCs w:val="0"/>
-          <w:i w:val="0"/>
-          <w:iCs w:val="0"/>
-          <w:sz w:val="22"/>
-          <w:szCs w:val="22"/>
-        </w:rPr>
-        <w:t>Alcances de esta primera implementación y aspectos pendientes para fases posteriores: definir la estrategia final de imputación de Age, decidir el tratamiento definitivo de Cabin, evaluar el tratamiento de outliers en Fare, y codificar variables y particionar los datos para el modelado predictivo.</w:t>
-      </w:r>
-    </w:p>
-    <w:p>
-      <w:pPr>
-        <w:spacing w:after="20" w:line="276" w:lineRule="auto"/>
-        <w:jc w:val="both"/>
-        <w:rPr>
-          <w:rFonts w:ascii="Arial" w:hAnsi="Arial"/>
-          <w:b w:val="0"/>
-          <w:bCs w:val="0"/>
-          <w:i w:val="0"/>
-          <w:iCs w:val="0"/>
-          <w:sz w:val="22"/>
-          <w:szCs w:val="22"/>
-        </w:rPr>
-      </w:pPr>
-    </w:p>
-    <w:p xmlns:wp14="http://schemas.microsoft.com/office/word/2010/wordml" wp14:textId="77777777">
+    </w:p>
+    <w:p>
       <w:pPr>
         <w:pStyle w:val="Ttulo2"/>
         <w:spacing w:before="0"/>
         <w:jc w:val="both"/>
       </w:pPr>
       <w:r>
-        <w:rPr/>
-        <w:t>VIII. Hallazgos exploratorios iniciales y referencias al notebook</w:t>
-      </w:r>
-    </w:p>
-    <w:p xmlns:wp14="http://schemas.microsoft.com/office/word/2010/wordml" wp14:textId="77777777">
-      <w:pPr>
-        <w:spacing w:after="0" w:line="276" w:lineRule="auto"/>
-        <w:ind w:left="180"/>
-        <w:jc w:val="both"/>
-      </w:pPr>
-      <w:r>
-        <w:rPr>
-          <w:rFonts w:ascii="Arial" w:hAnsi="Arial"/>
-          <w:sz w:val="22"/>
-          <w:szCs w:val="22"/>
-        </w:rPr>
-        <w:t xml:space="preserve">• </w:t>
-      </w:r>
-      <w:r>
-        <w:rPr>
-          <w:rFonts w:ascii="Arial" w:hAnsi="Arial"/>
-          <w:b w:val="1"/>
-          <w:bCs w:val="1"/>
-          <w:sz w:val="22"/>
-          <w:szCs w:val="22"/>
-        </w:rPr>
-        <w:t>Supervivencia global —</w:t>
-      </w:r>
-      <w:r>
-        <w:rPr>
-          <w:rFonts w:ascii="Arial" w:hAnsi="Arial"/>
-          <w:sz w:val="22"/>
-          <w:szCs w:val="22"/>
-        </w:rPr>
-        <w:t xml:space="preserve"> la tasa de supervivencia global es 38,4% (342 de 891 pasajeros). Véase notebook, apartado IV, conteo de Survived.</w:t>
-      </w:r>
-    </w:p>
-    <w:p xmlns:wp14="http://schemas.microsoft.com/office/word/2010/wordml" wp14:textId="77777777">
-      <w:pPr>
-        <w:spacing w:after="0" w:line="276" w:lineRule="auto"/>
-        <w:ind w:left="180"/>
-        <w:jc w:val="both"/>
-      </w:pPr>
-      <w:r>
-        <w:rPr>
-          <w:rFonts w:ascii="Arial" w:hAnsi="Arial"/>
-          <w:sz w:val="22"/>
-          <w:szCs w:val="22"/>
-        </w:rPr>
-        <w:t xml:space="preserve">• </w:t>
-      </w:r>
-      <w:r>
-        <w:rPr>
-          <w:rFonts w:ascii="Arial" w:hAnsi="Arial"/>
-          <w:b w:val="1"/>
-          <w:bCs w:val="1"/>
-          <w:sz w:val="22"/>
-          <w:szCs w:val="22"/>
-        </w:rPr>
-        <w:t>Sexo y clase de pasaje —</w:t>
-      </w:r>
-      <w:r>
-        <w:rPr>
-          <w:rFonts w:ascii="Arial" w:hAnsi="Arial"/>
-          <w:sz w:val="22"/>
-          <w:szCs w:val="22"/>
-        </w:rPr>
-        <w:t xml:space="preserve"> las mujeres sobrevivieron en 74,2% de los casos frente a 18,9% de los hombres; la supervivencia decrece con la clase de pasaje (1ª: 63,0%, 2ª: 47,3%, 3ª: 24,2%). Véase notebook, apartado VI, figura f1_titanic_supervivencia_categoricas.png.</w:t>
-      </w:r>
-    </w:p>
-    <w:p xmlns:wp14="http://schemas.microsoft.com/office/word/2010/wordml" wp14:textId="77777777">
-      <w:pPr>
-        <w:spacing w:after="0" w:line="276" w:lineRule="auto"/>
-        <w:ind w:left="180"/>
-        <w:jc w:val="both"/>
-      </w:pPr>
-      <w:r>
-        <w:rPr>
-          <w:rFonts w:ascii="Arial" w:hAnsi="Arial"/>
-          <w:sz w:val="22"/>
-          <w:szCs w:val="22"/>
-        </w:rPr>
-        <w:t xml:space="preserve">• </w:t>
-      </w:r>
-      <w:r>
-        <w:rPr>
-          <w:rFonts w:ascii="Arial" w:hAnsi="Arial"/>
-          <w:b w:val="1"/>
-          <w:bCs w:val="1"/>
-          <w:sz w:val="22"/>
-          <w:szCs w:val="22"/>
-        </w:rPr>
-        <w:t>Tarifa y correlaciones —</w:t>
-      </w:r>
-      <w:r>
-        <w:rPr>
-          <w:rFonts w:ascii="Arial" w:hAnsi="Arial"/>
-          <w:sz w:val="22"/>
-          <w:szCs w:val="22"/>
-        </w:rPr>
-        <w:t xml:space="preserve"> Fare se asocia positivamente con la supervivencia y Pclass negativamente, de forma consistente con el patrón anterior; entre las variables originales las correlaciones son moderadas o bajas, mientras que FamilySize correlaciona alto con SibSp (0,89) y Parch (0,78) por construcción, lo que condiciona su uso conjunto en el modelado. Véase notebook, apartado VI, figura f1_titanic_correlacion.png.</w:t>
-      </w:r>
-    </w:p>
-    <w:p xmlns:wp14="http://schemas.microsoft.com/office/word/2010/wordml" wp14:textId="77777777">
-      <w:pPr>
-        <w:spacing w:after="0" w:line="276" w:lineRule="auto"/>
-        <w:ind w:left="180"/>
-        <w:jc w:val="both"/>
-      </w:pPr>
-      <w:r>
-        <w:rPr>
-          <w:rFonts w:ascii="Arial" w:hAnsi="Arial"/>
-          <w:sz w:val="22"/>
-          <w:szCs w:val="22"/>
-        </w:rPr>
-        <w:t xml:space="preserve">• </w:t>
-      </w:r>
-      <w:r>
-        <w:rPr>
-          <w:rFonts w:ascii="Arial" w:hAnsi="Arial"/>
-          <w:b w:val="1"/>
-          <w:bCs w:val="1"/>
-          <w:sz w:val="22"/>
-          <w:szCs w:val="22"/>
-        </w:rPr>
-        <w:t>Composición familiar y título —</w:t>
-      </w:r>
-      <w:r>
-        <w:rPr>
-          <w:rFonts w:ascii="Arial" w:hAnsi="Arial"/>
-          <w:sz w:val="22"/>
-          <w:szCs w:val="22"/>
-        </w:rPr>
-        <w:t xml:space="preserve"> viajar acompañado (IsAlone = 0) se asocia a mayor supervivencia (50,6%) que viajar solo (30,4%); el título extraído del nombre reproduce con más matiz el patrón por sexo y clase. Véase notebook, apartado VI, figura f1_titanic_familia_titulo.png.</w:t>
-      </w:r>
-    </w:p>
-    <w:p xmlns:wp14="http://schemas.microsoft.com/office/word/2010/wordml" wp14:textId="77777777">
-      <w:pPr>
-        <w:spacing w:after="0" w:line="276" w:lineRule="auto"/>
-        <w:ind w:left="180"/>
-        <w:jc w:val="both"/>
-      </w:pPr>
-      <w:r>
-        <w:rPr>
-          <w:rFonts w:ascii="Arial" w:hAnsi="Arial"/>
-          <w:sz w:val="22"/>
-          <w:szCs w:val="22"/>
-        </w:rPr>
-        <w:t xml:space="preserve">• </w:t>
-      </w:r>
-      <w:r>
-        <w:rPr>
-          <w:rFonts w:ascii="Arial" w:hAnsi="Arial"/>
-          <w:b w:val="1"/>
-          <w:bCs w:val="1"/>
-          <w:sz w:val="22"/>
-          <w:szCs w:val="22"/>
-        </w:rPr>
-        <w:t>Valores atípicos —</w:t>
-      </w:r>
-      <w:r>
-        <w:rPr>
-          <w:rFonts w:ascii="Arial" w:hAnsi="Arial"/>
-          <w:sz w:val="22"/>
-          <w:szCs w:val="22"/>
-        </w:rPr>
-        <w:t xml:space="preserve"> Fare presenta 13,0% de valores atípicos (tarifas muy altas) y Age un 1,5%, detectados mediante la regla IQR; no se removieron en esta fase. Véase notebook, apartado VI, celda detectar_outliers_iqr y boxplots f1_titanic_boxplots_survived.png.</w:t>
-      </w:r>
-    </w:p>
-    <w:p xmlns:wp14="http://schemas.microsoft.com/office/word/2010/wordml" wp14:textId="77777777">
-      <w:pPr>
+        <w:t>VII. Registro del proceso, supuestos y limitaciones</w:t>
+      </w:r>
+    </w:p>
+    <w:p>
+      <w:pPr>
+        <w:keepNext/>
         <w:spacing w:after="20" w:line="276" w:lineRule="auto"/>
         <w:jc w:val="both"/>
       </w:pPr>
       <w:r>
         <w:rPr>
-          <w:rFonts w:ascii="Arial" w:hAnsi="Arial"/>
-          <w:b w:val="0"/>
-          <w:bCs w:val="0"/>
-          <w:i w:val="0"/>
-          <w:iCs w:val="0"/>
-          <w:sz w:val="22"/>
-          <w:szCs w:val="22"/>
-        </w:rPr>
-        <w:t>Interpretación breve: los hallazgos reproducen el patrón histórico conocido del hundimiento (prioridad de evacuación de mujeres, niños y pasajeros de clases altas) y sugieren que Pclass, Sex, Fare y las variables derivadas de composición familiar son candidatas relevantes para el modelado predictivo de fases posteriores, mientras que Age y Cabin requieren un tratamiento de datos faltantes más cuidadoso antes de incorporarse plenamente al análisis.</w:t>
-      </w:r>
-    </w:p>
-    <w:p>
-      <w:pPr>
+          <w:b/>
+        </w:rPr>
+        <w:t>Pasos principales:</w:t>
+      </w:r>
+      <w:r>
+        <w:t xml:space="preserve"> carga y revisión (III); descriptivos univariados (IV); cinco decisiones y variables derivadas (V); bivariado frente a Survived, outliers IQR y correlación (VI); síntesis y proyección (VIII).</w:t>
+      </w:r>
+    </w:p>
+    <w:p>
+      <w:pPr>
+        <w:keepNext/>
         <w:spacing w:after="20" w:line="276" w:lineRule="auto"/>
         <w:jc w:val="both"/>
-        <w:rPr>
-          <w:rFonts w:ascii="Arial" w:hAnsi="Arial"/>
-          <w:b w:val="0"/>
-          <w:bCs w:val="0"/>
-          <w:i w:val="0"/>
-          <w:iCs w:val="0"/>
-          <w:sz w:val="22"/>
-          <w:szCs w:val="22"/>
-        </w:rPr>
-      </w:pPr>
-    </w:p>
-    <w:p xmlns:wp14="http://schemas.microsoft.com/office/word/2010/wordml" wp14:textId="77777777">
+      </w:pPr>
+      <w:r>
+        <w:rPr>
+          <w:b/>
+        </w:rPr>
+        <w:t>Supuestos considerados:</w:t>
+      </w:r>
+      <w:r>
+        <w:t xml:space="preserve"> PassengerId único y registros fieles; la ausencia de Age podría asociarse a Pclass; Cabin se posterga por su alta tasa de faltantes, sin evaluar el mecanismo; ninguna se imputa aún.</w:t>
+      </w:r>
+    </w:p>
+    <w:p>
+      <w:pPr>
+        <w:keepNext/>
+        <w:spacing w:after="20" w:line="276" w:lineRule="auto"/>
+        <w:jc w:val="both"/>
+      </w:pPr>
+      <w:r>
+        <w:rPr>
+          <w:b/>
+        </w:rPr>
+        <w:t>Limitaciones detectadas:</w:t>
+      </w:r>
+      <w:r>
+        <w:t xml:space="preserve"> Cabin (77,1% faltante) solo como indicador; el 19,9% faltante en Age limita sus análisis; sin pruebas estadísticas formales (p. ej., chi-cuadrado): lecturas descriptivas, no inferenciales.</w:t>
+      </w:r>
+    </w:p>
+    <w:p>
+      <w:pPr>
+        <w:spacing w:after="20" w:line="276" w:lineRule="auto"/>
+        <w:jc w:val="both"/>
+      </w:pPr>
+      <w:r>
+        <w:t>Alcances y pendientes: imputación final de Age, tratamiento definitivo de Cabin y de los outliers de Fare, codificación y partición de datos para el modelado.</w:t>
+      </w:r>
+    </w:p>
+    <w:p>
+      <w:pPr>
+        <w:spacing w:after="20" w:line="276" w:lineRule="auto"/>
+        <w:jc w:val="both"/>
+      </w:pPr>
+    </w:p>
+    <w:p>
       <w:pPr>
         <w:pStyle w:val="Ttulo2"/>
         <w:spacing w:before="0"/>
         <w:jc w:val="both"/>
       </w:pPr>
       <w:r>
-        <w:rPr/>
+        <w:t>VIII. Hallazgos exploratorios iniciales y referencias al notebook</w:t>
+      </w:r>
+    </w:p>
+    <w:p>
+      <w:pPr>
+        <w:spacing w:line="276" w:lineRule="auto"/>
+        <w:ind w:left="180"/>
+        <w:jc w:val="both"/>
+      </w:pPr>
+      <w:r>
+        <w:t xml:space="preserve">• </w:t>
+      </w:r>
+      <w:r>
+        <w:rPr>
+          <w:b/>
+        </w:rPr>
+        <w:t>Supervivencia global —</w:t>
+      </w:r>
+      <w:r>
+        <w:t xml:space="preserve"> 38,4% (342 de 891 pasajeros); notebook, apartado IV, conteo de Survived.</w:t>
+      </w:r>
+    </w:p>
+    <w:p>
+      <w:pPr>
+        <w:spacing w:line="276" w:lineRule="auto"/>
+        <w:ind w:left="180"/>
+        <w:jc w:val="both"/>
+      </w:pPr>
+      <w:r>
+        <w:t xml:space="preserve">• </w:t>
+      </w:r>
+      <w:r>
+        <w:rPr>
+          <w:b/>
+        </w:rPr>
+        <w:t>Sexo y clase de pasaje —</w:t>
+      </w:r>
+      <w:r>
+        <w:t xml:space="preserve"> mujeres 74,2% frente a hombres 18,9%; la supervivencia decrece con la clase (1ª 63,0%, 2ª 47,3%, 3ª 24,2%); notebook, apartado VI, f1_titanic_supervivencia_categoricas.png.</w:t>
+      </w:r>
+    </w:p>
+    <w:p>
+      <w:pPr>
+        <w:spacing w:line="276" w:lineRule="auto"/>
+        <w:ind w:left="180"/>
+        <w:jc w:val="both"/>
+      </w:pPr>
+      <w:r>
+        <w:t xml:space="preserve">• </w:t>
+      </w:r>
+      <w:r>
+        <w:rPr>
+          <w:b/>
+        </w:rPr>
+        <w:t>Tarifa y correlaciones —</w:t>
+      </w:r>
+      <w:r>
+        <w:t xml:space="preserve"> Fare correlaciona positivamente con Survived y Pclass negativamente; las demás correlaciones son moderadas o bajas, mientras FamilySize correlaciona alto con SibSp (0,89) y Parch (0,78) por construcción, condicionando su uso conjunto; notebook VI, f1_titanic_correlacion.png.</w:t>
+      </w:r>
+    </w:p>
+    <w:p>
+      <w:pPr>
+        <w:spacing w:line="276" w:lineRule="auto"/>
+        <w:ind w:left="180"/>
+        <w:jc w:val="both"/>
+      </w:pPr>
+      <w:r>
+        <w:t xml:space="preserve">• </w:t>
+      </w:r>
+      <w:r>
+        <w:rPr>
+          <w:b/>
+        </w:rPr>
+        <w:t>Composición familiar y título —</w:t>
+      </w:r>
+      <w:r>
+        <w:t xml:space="preserve"> acompañados (IsAlone = 0) sobreviven más (50,6%) que solos (30,4%); el título matiza el patrón por sexo y clase; notebook, apartado VI, f1_titanic_familia_titulo.png.</w:t>
+      </w:r>
+    </w:p>
+    <w:p>
+      <w:pPr>
+        <w:spacing w:line="276" w:lineRule="auto"/>
+        <w:ind w:left="180"/>
+        <w:jc w:val="both"/>
+      </w:pPr>
+      <w:r>
+        <w:t xml:space="preserve">• </w:t>
+      </w:r>
+      <w:r>
+        <w:rPr>
+          <w:b/>
+        </w:rPr>
+        <w:t>Valores atípicos —</w:t>
+      </w:r>
+      <w:r>
+        <w:t xml:space="preserve"> Fare presenta 13,0% de atípicos (tarifas altas) y Age 1,5%, según la regla IQR; no se removieron; notebook, apartado VI, celda detectar_outliers_iqr y f1_titanic_boxplots_survived.png.</w:t>
+      </w:r>
+    </w:p>
+    <w:p>
+      <w:pPr>
+        <w:spacing w:after="20" w:line="276" w:lineRule="auto"/>
+        <w:jc w:val="both"/>
+      </w:pPr>
+      <w:r>
+        <w:t>Interpretación: replican el patrón histórico (prioridad a mujeres, niños y 1ª clase) y sugieren que Pclass, Sex, Fare y la composición familiar son candidatas al modelado; Age y Cabin requieren tratar faltantes.</w:t>
+      </w:r>
+    </w:p>
+    <w:p>
+      <w:pPr>
+        <w:spacing w:after="20" w:line="276" w:lineRule="auto"/>
+        <w:jc w:val="both"/>
+      </w:pPr>
+    </w:p>
+    <w:p>
+      <w:pPr>
+        <w:pStyle w:val="Ttulo2"/>
+        <w:spacing w:before="0"/>
+        <w:jc w:val="both"/>
+      </w:pPr>
+      <w:r>
         <w:t>IX. Bibliografía</w:t>
       </w:r>
     </w:p>
-    <w:p xmlns:wp14="http://schemas.microsoft.com/office/word/2010/wordml" wp14:textId="77777777">
-      <w:pPr>
-        <w:spacing w:after="0" w:line="276" w:lineRule="auto"/>
+    <w:p>
+      <w:pPr>
+        <w:spacing w:line="276" w:lineRule="auto"/>
         <w:ind w:left="432" w:hanging="432"/>
         <w:jc w:val="both"/>
-      </w:pPr>
-      <w:r>
-        <w:rPr>
-          <w:rFonts w:ascii="Arial" w:hAnsi="Arial"/>
-          <w:i w:val="0"/>
-          <w:iCs w:val="0"/>
-          <w:sz w:val="22"/>
-          <w:szCs w:val="22"/>
-        </w:rPr>
+        <w:rPr>
+          <w:lang w:val="en-US"/>
+        </w:rPr>
+      </w:pPr>
+      <w:r>
         <w:t xml:space="preserve">Kaggle. (s. f.). </w:t>
       </w:r>
       <w:r>
         <w:rPr>
-          <w:rFonts w:ascii="Arial" w:hAnsi="Arial"/>
-          <w:i w:val="1"/>
-          <w:iCs w:val="1"/>
-          <w:sz w:val="22"/>
-          <w:szCs w:val="22"/>
+          <w:i/>
+          <w:lang w:val="en-US"/>
         </w:rPr>
         <w:t>Titanic - Machine Learning from Disaster</w:t>
       </w:r>
       <w:r>
         <w:rPr>
-          <w:rFonts w:ascii="Arial" w:hAnsi="Arial"/>
-          <w:sz w:val="22"/>
-          <w:szCs w:val="22"/>
-        </w:rPr>
-        <w:t xml:space="preserve"> [Conjunto de datos]. https://www.kaggle.com/c/titanic</w:t>
-      </w:r>
-    </w:p>
-    <w:p xmlns:wp14="http://schemas.microsoft.com/office/word/2010/wordml" wp14:textId="77777777">
-      <w:pPr>
-        <w:spacing w:after="0" w:line="276" w:lineRule="auto"/>
+          <w:lang w:val="en-US"/>
+        </w:rPr>
+        <w:t xml:space="preserve"> [Conjunto de </w:t>
+      </w:r>
+      <w:proofErr w:type="spellStart"/>
+      <w:r>
+        <w:rPr>
+          <w:lang w:val="en-US"/>
+        </w:rPr>
+        <w:t>datos</w:t>
+      </w:r>
+      <w:proofErr w:type="spellEnd"/>
+      <w:r>
+        <w:rPr>
+          <w:lang w:val="en-US"/>
+        </w:rPr>
+        <w:t>]. https://www.kaggle.com/c/titanic</w:t>
+      </w:r>
+    </w:p>
+    <w:p>
+      <w:pPr>
+        <w:spacing w:line="276" w:lineRule="auto"/>
         <w:ind w:left="432" w:hanging="432"/>
         <w:jc w:val="both"/>
-      </w:pPr>
-      <w:r>
-        <w:rPr>
-          <w:rFonts w:ascii="Arial" w:hAnsi="Arial"/>
-          <w:i w:val="0"/>
-          <w:iCs w:val="0"/>
-          <w:sz w:val="22"/>
-          <w:szCs w:val="22"/>
+        <w:rPr>
+          <w:lang w:val="en-US"/>
+        </w:rPr>
+      </w:pPr>
+      <w:r>
+        <w:rPr>
+          <w:lang w:val="en-US"/>
         </w:rPr>
         <w:t xml:space="preserve">McKinney, W. (2010). Data structures for statistical computing in Python. </w:t>
       </w:r>
       <w:r>
         <w:rPr>
-          <w:rFonts w:ascii="Arial" w:hAnsi="Arial"/>
-          <w:i w:val="1"/>
-          <w:iCs w:val="1"/>
-          <w:sz w:val="22"/>
-          <w:szCs w:val="22"/>
+          <w:i/>
+          <w:lang w:val="en-US"/>
         </w:rPr>
         <w:t>Proceedings of the 9th Python in Science Conference</w:t>
       </w:r>
       <w:r>
         <w:rPr>
-          <w:rFonts w:ascii="Arial" w:hAnsi="Arial"/>
-          <w:sz w:val="22"/>
-          <w:szCs w:val="22"/>
+          <w:lang w:val="en-US"/>
         </w:rPr>
         <w:t>, 56–61. https://doi.org/10.25080/Majora-92bf1922-00a</w:t>
       </w:r>
     </w:p>
-    <w:p xmlns:wp14="http://schemas.microsoft.com/office/word/2010/wordml" wp14:textId="77777777">
-      <w:pPr>
-        <w:spacing w:after="0" w:line="276" w:lineRule="auto"/>
+    <w:p>
+      <w:pPr>
+        <w:spacing w:line="276" w:lineRule="auto"/>
         <w:ind w:left="432" w:hanging="432"/>
         <w:jc w:val="both"/>
       </w:pPr>
       <w:r>
-        <w:rPr>
-          <w:rFonts w:ascii="Arial" w:hAnsi="Arial"/>
-          <w:i w:val="0"/>
-          <w:iCs w:val="0"/>
-          <w:sz w:val="22"/>
-          <w:szCs w:val="22"/>
-        </w:rPr>
         <w:t xml:space="preserve">Paraíso, S. (2026). </w:t>
       </w:r>
       <w:r>
         <w:rPr>
-          <w:rFonts w:ascii="Arial" w:hAnsi="Arial"/>
-          <w:i w:val="1"/>
-          <w:iCs w:val="1"/>
-          <w:sz w:val="22"/>
-          <w:szCs w:val="22"/>
+          <w:i/>
         </w:rPr>
         <w:t>Resumen aplicado del libro: EDA mínimo viable</w:t>
       </w:r>
       <w:r>
-        <w:rPr>
-          <w:rFonts w:ascii="Arial" w:hAnsi="Arial"/>
-          <w:sz w:val="22"/>
-          <w:szCs w:val="22"/>
-        </w:rPr>
-        <w:t xml:space="preserve"> [Apunte]. Universidad Andrés Bello, Santiago, Chile.</w:t>
-      </w:r>
-    </w:p>
-    <w:p xmlns:wp14="http://schemas.microsoft.com/office/word/2010/wordml" wp14:textId="77777777">
-      <w:pPr>
-        <w:spacing w:after="0" w:line="276" w:lineRule="auto"/>
+        <w:t xml:space="preserve"> [Apunte]. Universidad Andrés Bello.</w:t>
+      </w:r>
+    </w:p>
+    <w:p>
+      <w:pPr>
+        <w:spacing w:line="276" w:lineRule="auto"/>
         <w:ind w:left="432" w:hanging="432"/>
         <w:jc w:val="both"/>
       </w:pPr>
       <w:r>
-        <w:rPr>
-          <w:rFonts w:ascii="Arial" w:hAnsi="Arial"/>
-          <w:i w:val="0"/>
-          <w:iCs w:val="0"/>
-          <w:sz w:val="22"/>
-          <w:szCs w:val="22"/>
-        </w:rPr>
         <w:t xml:space="preserve">The pandas development team. (2026). </w:t>
       </w:r>
       <w:r>
         <w:rPr>
-          <w:rFonts w:ascii="Arial" w:hAnsi="Arial"/>
-          <w:i w:val="1"/>
-          <w:iCs w:val="1"/>
-          <w:sz w:val="22"/>
-          <w:szCs w:val="22"/>
+          <w:i/>
         </w:rPr>
         <w:t>pandas documentation</w:t>
       </w:r>
       <w:r>
-        <w:rPr>
-          <w:rFonts w:ascii="Arial" w:hAnsi="Arial"/>
-          <w:sz w:val="22"/>
-          <w:szCs w:val="22"/>
-        </w:rPr>
-        <w:t xml:space="preserve"> (versión 3.0) [Documentación de software]. https://pandas.pydata.org/docs/</w:t>
-      </w:r>
-    </w:p>
-    <w:p xmlns:wp14="http://schemas.microsoft.com/office/word/2010/wordml" wp14:textId="77777777">
-      <w:pPr>
-        <w:spacing w:after="0" w:line="276" w:lineRule="auto"/>
+        <w:t xml:space="preserve"> [Documentación de software]. https://pandas.pydata.org/docs/</w:t>
+      </w:r>
+    </w:p>
+    <w:p>
+      <w:pPr>
+        <w:spacing w:line="276" w:lineRule="auto"/>
         <w:ind w:left="432" w:hanging="432"/>
         <w:jc w:val="both"/>
-      </w:pPr>
-      <w:r>
-        <w:rPr>
-          <w:rFonts w:ascii="Arial" w:hAnsi="Arial"/>
-          <w:i w:val="0"/>
-          <w:iCs w:val="0"/>
-          <w:sz w:val="22"/>
-          <w:szCs w:val="22"/>
+        <w:rPr>
+          <w:lang w:val="en-US"/>
+        </w:rPr>
+      </w:pPr>
+      <w:r>
+        <w:rPr>
+          <w:lang w:val="en-US"/>
         </w:rPr>
         <w:t xml:space="preserve">Waskom, M. L. (2021). Seaborn: Statistical data visualization. </w:t>
       </w:r>
       <w:r>
         <w:rPr>
-          <w:rFonts w:ascii="Arial" w:hAnsi="Arial"/>
-          <w:i w:val="1"/>
-          <w:iCs w:val="1"/>
-          <w:sz w:val="22"/>
-          <w:szCs w:val="22"/>
-        </w:rPr>
-        <w:t>Journal of Open Source Software, 6</w:t>
-      </w:r>
-      <w:r>
-        <w:rPr>
-          <w:rFonts w:ascii="Arial" w:hAnsi="Arial"/>
-          <w:sz w:val="22"/>
-          <w:szCs w:val="22"/>
+          <w:i/>
+          <w:lang w:val="en-US"/>
+        </w:rPr>
+        <w:t xml:space="preserve">Journal of </w:t>
+      </w:r>
+      <w:proofErr w:type="gramStart"/>
+      <w:r>
+        <w:rPr>
+          <w:i/>
+          <w:lang w:val="en-US"/>
+        </w:rPr>
+        <w:t>Open Source</w:t>
+      </w:r>
+      <w:proofErr w:type="gramEnd"/>
+      <w:r>
+        <w:rPr>
+          <w:i/>
+          <w:lang w:val="en-US"/>
+        </w:rPr>
+        <w:t xml:space="preserve"> Software, 6</w:t>
+      </w:r>
+      <w:r>
+        <w:rPr>
+          <w:lang w:val="en-US"/>
         </w:rPr>
         <w:t>(60), 3021. https://doi.org/10.21105/joss.03021</w:t>
       </w:r>
     </w:p>
-    <w:p xmlns:wp14="http://schemas.microsoft.com/office/word/2010/wordml" wp14:textId="77777777">
-      <w:pPr>
-        <w:spacing w:after="0" w:line="276" w:lineRule="auto"/>
+    <w:p>
+      <w:pPr>
+        <w:spacing w:line="276" w:lineRule="auto"/>
         <w:ind w:left="432" w:hanging="432"/>
         <w:jc w:val="both"/>
-      </w:pPr>
-      <w:r>
-        <w:rPr>
-          <w:rFonts w:ascii="Arial" w:hAnsi="Arial"/>
-          <w:i w:val="0"/>
-          <w:iCs w:val="0"/>
-          <w:sz w:val="22"/>
-          <w:szCs w:val="22"/>
-        </w:rPr>
-        <w:t xml:space="preserve">Wilson, G., Bryan, J., Cranston, K., Kitzes, J., Nederbragt, L., &amp; Teal, T. K. (2017). Good enough practices in scientific computing. </w:t>
-      </w:r>
-      <w:r>
-        <w:rPr>
-          <w:rFonts w:ascii="Arial" w:hAnsi="Arial"/>
-          <w:i w:val="1"/>
-          <w:iCs w:val="1"/>
-          <w:sz w:val="22"/>
-          <w:szCs w:val="22"/>
+        <w:rPr>
+          <w:lang w:val="en-US"/>
+        </w:rPr>
+      </w:pPr>
+      <w:r>
+        <w:rPr>
+          <w:lang w:val="en-US"/>
+        </w:rPr>
+        <w:t xml:space="preserve">Wilson, G., Bryan, J., Cranston, K., </w:t>
+      </w:r>
+      <w:proofErr w:type="spellStart"/>
+      <w:r>
+        <w:rPr>
+          <w:lang w:val="en-US"/>
+        </w:rPr>
+        <w:t>Kitzes</w:t>
+      </w:r>
+      <w:proofErr w:type="spellEnd"/>
+      <w:r>
+        <w:rPr>
+          <w:lang w:val="en-US"/>
+        </w:rPr>
+        <w:t xml:space="preserve">, J., </w:t>
+      </w:r>
+      <w:proofErr w:type="spellStart"/>
+      <w:r>
+        <w:rPr>
+          <w:lang w:val="en-US"/>
+        </w:rPr>
+        <w:t>Nederbragt</w:t>
+      </w:r>
+      <w:proofErr w:type="spellEnd"/>
+      <w:r>
+        <w:rPr>
+          <w:lang w:val="en-US"/>
+        </w:rPr>
+        <w:t xml:space="preserve">, L., &amp; Teal, T. K. (2017). Good enough </w:t>
+      </w:r>
+      <w:proofErr w:type="gramStart"/>
+      <w:r>
+        <w:rPr>
+          <w:lang w:val="en-US"/>
+        </w:rPr>
+        <w:t>practices</w:t>
+      </w:r>
+      <w:proofErr w:type="gramEnd"/>
+      <w:r>
+        <w:rPr>
+          <w:lang w:val="en-US"/>
+        </w:rPr>
+        <w:t xml:space="preserve"> in scientific computing. </w:t>
+      </w:r>
+      <w:r>
+        <w:rPr>
+          <w:i/>
+          <w:lang w:val="en-US"/>
         </w:rPr>
         <w:t>PLOS Computational Biology, 13</w:t>
       </w:r>
       <w:r>
         <w:rPr>
-          <w:rFonts w:ascii="Arial" w:hAnsi="Arial"/>
-          <w:sz w:val="22"/>
-          <w:szCs w:val="22"/>
+          <w:lang w:val="en-US"/>
         </w:rPr>
         <w:t>(6), e1005510. https://doi.org/10.1371/journal.pcbi.1005510</w:t>
       </w:r>
@@ -2617,8 +2165,8 @@
     <w:sectPr>
       <w:headerReference w:type="default" r:id="rId22"/>
       <w:footerReference w:type="default" r:id="rId23"/>
-      <w:pgSz w:w="12240" w:h="15840" w:orient="portrait"/>
-      <w:pgMar w:top="1100" w:right="840" w:bottom="1340" w:left="1020" w:header="493" w:footer="1149" w:gutter="0"/>
+      <w:pgSz w:w="12240" w:h="15840"/>
+      <w:pgMar w:top="1100" w:right="864" w:bottom="1340" w:left="864" w:header="493" w:footer="1149" w:gutter="0"/>
       <w:cols w:space="720"/>
     </w:sectPr>
   </w:body>
@@ -2626,7 +2174,7 @@
 </file>
 
 <file path=word/endnotes.xml><?xml version="1.0" encoding="utf-8"?>
-<w:endnotes xmlns:wpc="http://schemas.microsoft.com/office/word/2010/wordprocessingCanvas" xmlns:cx="http://schemas.microsoft.com/office/drawing/2014/chartex" xmlns:cx1="http://schemas.microsoft.com/office/drawing/2015/9/8/chartex" xmlns:cx2="http://schemas.microsoft.com/office/drawing/2015/10/21/chartex" xmlns:cx3="http://schemas.microsoft.com/office/drawing/2016/5/9/chartex" xmlns:cx4="http://schemas.microsoft.com/office/drawing/2016/5/10/chartex" xmlns:cx5="http://schemas.microsoft.com/office/drawing/2016/5/11/chartex" xmlns:cx6="http://schemas.microsoft.com/office/drawing/2016/5/12/chartex" xmlns:cx7="http://schemas.microsoft.com/office/drawing/2016/5/13/chartex" xmlns:cx8="http://schemas.microsoft.com/office/drawing/2016/5/14/chartex" xmlns:mc="http://schemas.openxmlformats.org/markup-compatibility/2006" xmlns:aink="http://schemas.microsoft.com/office/drawing/2016/ink" xmlns:am3d="http://schemas.microsoft.com/office/drawing/2017/model3d" xmlns:o="urn:schemas-microsoft-com:office:office" xmlns:oel="http://schemas.microsoft.com/office/2019/extlst" xmlns:r="http://schemas.openxmlformats.org/officeDocument/2006/relationships" xmlns:m="http://schemas.openxmlformats.org/officeDocument/2006/math" xmlns:v="urn:schemas-microsoft-com:vml" xmlns:wp14="http://schemas.microsoft.com/office/word/2010/wordprocessingDrawing" xmlns:wp="http://schemas.openxmlformats.org/drawingml/2006/wordprocessingDrawing" xmlns:w10="urn:schemas-microsoft-com:office:word" xmlns:w="http://schemas.openxmlformats.org/wordprocessingml/2006/main" xmlns:w14="http://schemas.microsoft.com/office/word/2010/wordml" xmlns:w15="http://schemas.microsoft.com/office/word/2012/wordml" xmlns:w16cex="http://schemas.microsoft.com/office/word/2018/wordml/cex" xmlns:w16cid="http://schemas.microsoft.com/office/word/2016/wordml/cid" xmlns:w16="http://schemas.microsoft.com/office/word/2018/wordml" xmlns:w16du="http://schemas.microsoft.com/office/word/2023/wordml/word16du" xmlns:w16sdtdh="http://schemas.microsoft.com/office/word/2020/wordml/sdtdatahash" xmlns:w16sdtfl="http://schemas.microsoft.com/office/word/2024/wordml/sdtformatlock" xmlns:w16se="http://schemas.microsoft.com/office/word/2015/wordml/symex" xmlns:wpg="http://schemas.microsoft.com/office/word/2010/wordprocessingGroup" xmlns:wpi="http://schemas.microsoft.com/office/word/2010/wordprocessingInk" xmlns:wne="http://schemas.microsoft.com/office/word/2006/wordml" xmlns:wps="http://schemas.microsoft.com/office/word/2010/wordprocessingShape" mc:Ignorable="w14 w15 w16se w16cid w16 w16cex w16sdtdh w16sdtfl w16du wp14">
+<w:endnotes xmlns:wpc="http://schemas.microsoft.com/office/word/2010/wordprocessingCanvas" xmlns:cx="http://schemas.microsoft.com/office/drawing/2014/chartex" xmlns:cx1="http://schemas.microsoft.com/office/drawing/2015/9/8/chartex" xmlns:cx2="http://schemas.microsoft.com/office/drawing/2015/10/21/chartex" xmlns:cx3="http://schemas.microsoft.com/office/drawing/2016/5/9/chartex" xmlns:cx4="http://schemas.microsoft.com/office/drawing/2016/5/10/chartex" xmlns:cx5="http://schemas.microsoft.com/office/drawing/2016/5/11/chartex" xmlns:cx6="http://schemas.microsoft.com/office/drawing/2016/5/12/chartex" xmlns:cx7="http://schemas.microsoft.com/office/drawing/2016/5/13/chartex" xmlns:cx8="http://schemas.microsoft.com/office/drawing/2016/5/14/chartex" xmlns:mc="http://schemas.openxmlformats.org/markup-compatibility/2006" xmlns:aink="http://schemas.microsoft.com/office/drawing/2016/ink" xmlns:am3d="http://schemas.microsoft.com/office/drawing/2017/model3d" xmlns:o="urn:schemas-microsoft-com:office:office" xmlns:oel="http://schemas.microsoft.com/office/2019/extlst" xmlns:r="http://schemas.openxmlformats.org/officeDocument/2006/relationships" xmlns:m="http://schemas.openxmlformats.org/officeDocument/2006/math" xmlns:v="urn:schemas-microsoft-com:vml" xmlns:wp14="http://schemas.microsoft.com/office/word/2010/wordprocessingDrawing" xmlns:wp="http://schemas.openxmlformats.org/drawingml/2006/wordprocessingDrawing" xmlns:w10="urn:schemas-microsoft-com:office:word" xmlns:w="http://schemas.openxmlformats.org/wordprocessingml/2006/main" xmlns:w14="http://schemas.microsoft.com/office/word/2010/wordml" xmlns:w15="http://schemas.microsoft.com/office/word/2012/wordml" xmlns:w16cei="http://schemas.microsoft.com/office/word/2026/wordml/cei" xmlns:w16cex="http://schemas.microsoft.com/office/word/2018/wordml/cex" xmlns:w16cid="http://schemas.microsoft.com/office/word/2016/wordml/cid" xmlns:w16="http://schemas.microsoft.com/office/word/2018/wordml" xmlns:w16du="http://schemas.microsoft.com/office/word/2023/wordml/word16du" xmlns:w16sdtdh="http://schemas.microsoft.com/office/word/2020/wordml/sdtdatahash" xmlns:w16sdtfl="http://schemas.microsoft.com/office/word/2024/wordml/sdtformatlock" xmlns:w16se="http://schemas.microsoft.com/office/word/2015/wordml/symex" xmlns:wpg="http://schemas.microsoft.com/office/word/2010/wordprocessingGroup" xmlns:wpi="http://schemas.microsoft.com/office/word/2010/wordprocessingInk" xmlns:wne="http://schemas.microsoft.com/office/word/2006/wordml" xmlns:wps="http://schemas.microsoft.com/office/word/2010/wordprocessingShape" mc:Ignorable="w14 w15 w16se w16cid w16 w16cex w16sdtdh w16sdtfl w16du wp14">
   <w:endnote w:type="separator" w:id="-1">
     <w:p>
       <w:r>
@@ -2645,7 +2193,7 @@
 </file>
 
 <file path=word/footer1.xml><?xml version="1.0" encoding="utf-8"?>
-<w:ftr xmlns:wpc="http://schemas.microsoft.com/office/word/2010/wordprocessingCanvas" xmlns:cx="http://schemas.microsoft.com/office/drawing/2014/chartex" xmlns:cx1="http://schemas.microsoft.com/office/drawing/2015/9/8/chartex" xmlns:cx2="http://schemas.microsoft.com/office/drawing/2015/10/21/chartex" xmlns:cx3="http://schemas.microsoft.com/office/drawing/2016/5/9/chartex" xmlns:cx4="http://schemas.microsoft.com/office/drawing/2016/5/10/chartex" xmlns:cx5="http://schemas.microsoft.com/office/drawing/2016/5/11/chartex" xmlns:cx6="http://schemas.microsoft.com/office/drawing/2016/5/12/chartex" xmlns:cx7="http://schemas.microsoft.com/office/drawing/2016/5/13/chartex" xmlns:cx8="http://schemas.microsoft.com/office/drawing/2016/5/14/chartex" xmlns:mc="http://schemas.openxmlformats.org/markup-compatibility/2006" xmlns:aink="http://schemas.microsoft.com/office/drawing/2016/ink" xmlns:am3d="http://schemas.microsoft.com/office/drawing/2017/model3d" xmlns:o="urn:schemas-microsoft-com:office:office" xmlns:oel="http://schemas.microsoft.com/office/2019/extlst" xmlns:r="http://schemas.openxmlformats.org/officeDocument/2006/relationships" xmlns:m="http://schemas.openxmlformats.org/officeDocument/2006/math" xmlns:v="urn:schemas-microsoft-com:vml" xmlns:wp14="http://schemas.microsoft.com/office/word/2010/wordprocessingDrawing" xmlns:wp="http://schemas.openxmlformats.org/drawingml/2006/wordprocessingDrawing" xmlns:w10="urn:schemas-microsoft-com:office:word" xmlns:w="http://schemas.openxmlformats.org/wordprocessingml/2006/main" xmlns:w14="http://schemas.microsoft.com/office/word/2010/wordml" xmlns:w15="http://schemas.microsoft.com/office/word/2012/wordml" xmlns:w16cex="http://schemas.microsoft.com/office/word/2018/wordml/cex" xmlns:w16cid="http://schemas.microsoft.com/office/word/2016/wordml/cid" xmlns:w16="http://schemas.microsoft.com/office/word/2018/wordml" xmlns:w16du="http://schemas.microsoft.com/office/word/2023/wordml/word16du" xmlns:w16sdtdh="http://schemas.microsoft.com/office/word/2020/wordml/sdtdatahash" xmlns:w16sdtfl="http://schemas.microsoft.com/office/word/2024/wordml/sdtformatlock" xmlns:w16se="http://schemas.microsoft.com/office/word/2015/wordml/symex" xmlns:wpg="http://schemas.microsoft.com/office/word/2010/wordprocessingGroup" xmlns:wpi="http://schemas.microsoft.com/office/word/2010/wordprocessingInk" xmlns:wne="http://schemas.microsoft.com/office/word/2006/wordml" xmlns:wps="http://schemas.microsoft.com/office/word/2010/wordprocessingShape" xmlns:a="http://schemas.openxmlformats.org/drawingml/2006/main" xmlns:pic="http://schemas.openxmlformats.org/drawingml/2006/picture" mc:Ignorable="w14 w15 w16se w16cid w16 w16cex w16sdtdh w16sdtfl w16du wp14">
+<w:ftr xmlns:wpc="http://schemas.microsoft.com/office/word/2010/wordprocessingCanvas" xmlns:cx="http://schemas.microsoft.com/office/drawing/2014/chartex" xmlns:cx1="http://schemas.microsoft.com/office/drawing/2015/9/8/chartex" xmlns:cx2="http://schemas.microsoft.com/office/drawing/2015/10/21/chartex" xmlns:cx3="http://schemas.microsoft.com/office/drawing/2016/5/9/chartex" xmlns:cx4="http://schemas.microsoft.com/office/drawing/2016/5/10/chartex" xmlns:cx5="http://schemas.microsoft.com/office/drawing/2016/5/11/chartex" xmlns:cx6="http://schemas.microsoft.com/office/drawing/2016/5/12/chartex" xmlns:cx7="http://schemas.microsoft.com/office/drawing/2016/5/13/chartex" xmlns:cx8="http://schemas.microsoft.com/office/drawing/2016/5/14/chartex" xmlns:mc="http://schemas.openxmlformats.org/markup-compatibility/2006" xmlns:aink="http://schemas.microsoft.com/office/drawing/2016/ink" xmlns:am3d="http://schemas.microsoft.com/office/drawing/2017/model3d" xmlns:o="urn:schemas-microsoft-com:office:office" xmlns:oel="http://schemas.microsoft.com/office/2019/extlst" xmlns:r="http://schemas.openxmlformats.org/officeDocument/2006/relationships" xmlns:m="http://schemas.openxmlformats.org/officeDocument/2006/math" xmlns:v="urn:schemas-microsoft-com:vml" xmlns:wp14="http://schemas.microsoft.com/office/word/2010/wordprocessingDrawing" xmlns:wp="http://schemas.openxmlformats.org/drawingml/2006/wordprocessingDrawing" xmlns:w10="urn:schemas-microsoft-com:office:word" xmlns:w="http://schemas.openxmlformats.org/wordprocessingml/2006/main" xmlns:w14="http://schemas.microsoft.com/office/word/2010/wordml" xmlns:w15="http://schemas.microsoft.com/office/word/2012/wordml" xmlns:w16cei="http://schemas.microsoft.com/office/word/2026/wordml/cei" xmlns:w16cex="http://schemas.microsoft.com/office/word/2018/wordml/cex" xmlns:w16cid="http://schemas.microsoft.com/office/word/2016/wordml/cid" xmlns:w16="http://schemas.microsoft.com/office/word/2018/wordml" xmlns:w16du="http://schemas.microsoft.com/office/word/2023/wordml/word16du" xmlns:w16sdtdh="http://schemas.microsoft.com/office/word/2020/wordml/sdtdatahash" xmlns:w16sdtfl="http://schemas.microsoft.com/office/word/2024/wordml/sdtformatlock" xmlns:w16se="http://schemas.microsoft.com/office/word/2015/wordml/symex" xmlns:wpg="http://schemas.microsoft.com/office/word/2010/wordprocessingGroup" xmlns:wpi="http://schemas.microsoft.com/office/word/2010/wordprocessingInk" xmlns:wne="http://schemas.microsoft.com/office/word/2006/wordml" xmlns:wps="http://schemas.microsoft.com/office/word/2010/wordprocessingShape" mc:Ignorable="w14 w15 w16se w16cid w16 w16cex w16sdtdh w16sdtfl w16du wp14">
   <w:p>
     <w:pPr>
       <w:pStyle w:val="Textoindependiente"/>
@@ -2771,8 +2319,8 @@
             </wp:anchor>
           </w:drawing>
         </mc:Choice>
-        <mc:Fallback xmlns:pic="http://schemas.openxmlformats.org/drawingml/2006/picture" xmlns:a="http://schemas.openxmlformats.org/drawingml/2006/main">
-          <w:pict w14:anchorId="0345CD9E">
+        <mc:Fallback xmlns:a="http://schemas.openxmlformats.org/drawingml/2006/main" xmlns:pic="http://schemas.openxmlformats.org/drawingml/2006/picture">
+          <w:pict>
             <v:shape id="Graphic 17" style="position:absolute;margin-left:42.5pt;margin-top:739.9pt;width:218.15pt;height:.1pt;z-index:-15813632;visibility:visible;mso-wrap-style:square;mso-wrap-distance-left:0;mso-wrap-distance-top:0;mso-wrap-distance-right:0;mso-wrap-distance-bottom:0;mso-position-horizontal:absolute;mso-position-horizontal-relative:page;mso-position-vertical:absolute;mso-position-vertical-relative:page;v-text-anchor:top" coordsize="2770505,1270" o:spid="_x0000_s1026" filled="f" strokecolor="#1d4b63" path="m,l2770204,e" o:gfxdata="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" w14:anchorId="0747A2B0">
               <v:path arrowok="t"/>
               <w10:wrap anchorx="page" anchory="page"/>
@@ -2850,8 +2398,8 @@
             </wp:anchor>
           </w:drawing>
         </mc:Choice>
-        <mc:Fallback xmlns:pic="http://schemas.openxmlformats.org/drawingml/2006/picture" xmlns:a="http://schemas.openxmlformats.org/drawingml/2006/main">
-          <w:pict w14:anchorId="7E3D2D0C">
+        <mc:Fallback xmlns:a="http://schemas.openxmlformats.org/drawingml/2006/main" xmlns:pic="http://schemas.openxmlformats.org/drawingml/2006/picture">
+          <w:pict>
             <v:shape id="Graphic 18" style="position:absolute;margin-left:371.35pt;margin-top:739.9pt;width:198.15pt;height:.1pt;z-index:-15813120;visibility:visible;mso-wrap-style:square;mso-wrap-distance-left:0;mso-wrap-distance-top:0;mso-wrap-distance-right:0;mso-wrap-distance-bottom:0;mso-position-horizontal:absolute;mso-position-horizontal-relative:page;mso-position-vertical:absolute;mso-position-vertical-relative:page;v-text-anchor:top" coordsize="2516505,1270" o:spid="_x0000_s1026" filled="f" strokecolor="#1d4b63" path="m,l2516399,e" o:gfxdata="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" w14:anchorId="3C0EE5FF">
               <v:path arrowok="t"/>
               <w10:wrap anchorx="page" anchory="page"/>
@@ -2865,7 +2413,7 @@
 </file>
 
 <file path=word/footnotes.xml><?xml version="1.0" encoding="utf-8"?>
-<w:footnotes xmlns:wpc="http://schemas.microsoft.com/office/word/2010/wordprocessingCanvas" xmlns:cx="http://schemas.microsoft.com/office/drawing/2014/chartex" xmlns:cx1="http://schemas.microsoft.com/office/drawing/2015/9/8/chartex" xmlns:cx2="http://schemas.microsoft.com/office/drawing/2015/10/21/chartex" xmlns:cx3="http://schemas.microsoft.com/office/drawing/2016/5/9/chartex" xmlns:cx4="http://schemas.microsoft.com/office/drawing/2016/5/10/chartex" xmlns:cx5="http://schemas.microsoft.com/office/drawing/2016/5/11/chartex" xmlns:cx6="http://schemas.microsoft.com/office/drawing/2016/5/12/chartex" xmlns:cx7="http://schemas.microsoft.com/office/drawing/2016/5/13/chartex" xmlns:cx8="http://schemas.microsoft.com/office/drawing/2016/5/14/chartex" xmlns:mc="http://schemas.openxmlformats.org/markup-compatibility/2006" xmlns:aink="http://schemas.microsoft.com/office/drawing/2016/ink" xmlns:am3d="http://schemas.microsoft.com/office/drawing/2017/model3d" xmlns:o="urn:schemas-microsoft-com:office:office" xmlns:oel="http://schemas.microsoft.com/office/2019/extlst" xmlns:r="http://schemas.openxmlformats.org/officeDocument/2006/relationships" xmlns:m="http://schemas.openxmlformats.org/officeDocument/2006/math" xmlns:v="urn:schemas-microsoft-com:vml" xmlns:wp14="http://schemas.microsoft.com/office/word/2010/wordprocessingDrawing" xmlns:wp="http://schemas.openxmlformats.org/drawingml/2006/wordprocessingDrawing" xmlns:w10="urn:schemas-microsoft-com:office:word" xmlns:w="http://schemas.openxmlformats.org/wordprocessingml/2006/main" xmlns:w14="http://schemas.microsoft.com/office/word/2010/wordml" xmlns:w15="http://schemas.microsoft.com/office/word/2012/wordml" xmlns:w16cex="http://schemas.microsoft.com/office/word/2018/wordml/cex" xmlns:w16cid="http://schemas.microsoft.com/office/word/2016/wordml/cid" xmlns:w16="http://schemas.microsoft.com/office/word/2018/wordml" xmlns:w16du="http://schemas.microsoft.com/office/word/2023/wordml/word16du" xmlns:w16sdtdh="http://schemas.microsoft.com/office/word/2020/wordml/sdtdatahash" xmlns:w16sdtfl="http://schemas.microsoft.com/office/word/2024/wordml/sdtformatlock" xmlns:w16se="http://schemas.microsoft.com/office/word/2015/wordml/symex" xmlns:wpg="http://schemas.microsoft.com/office/word/2010/wordprocessingGroup" xmlns:wpi="http://schemas.microsoft.com/office/word/2010/wordprocessingInk" xmlns:wne="http://schemas.microsoft.com/office/word/2006/wordml" xmlns:wps="http://schemas.microsoft.com/office/word/2010/wordprocessingShape" mc:Ignorable="w14 w15 w16se w16cid w16 w16cex w16sdtdh w16sdtfl w16du wp14">
+<w:footnotes xmlns:wpc="http://schemas.microsoft.com/office/word/2010/wordprocessingCanvas" xmlns:cx="http://schemas.microsoft.com/office/drawing/2014/chartex" xmlns:cx1="http://schemas.microsoft.com/office/drawing/2015/9/8/chartex" xmlns:cx2="http://schemas.microsoft.com/office/drawing/2015/10/21/chartex" xmlns:cx3="http://schemas.microsoft.com/office/drawing/2016/5/9/chartex" xmlns:cx4="http://schemas.microsoft.com/office/drawing/2016/5/10/chartex" xmlns:cx5="http://schemas.microsoft.com/office/drawing/2016/5/11/chartex" xmlns:cx6="http://schemas.microsoft.com/office/drawing/2016/5/12/chartex" xmlns:cx7="http://schemas.microsoft.com/office/drawing/2016/5/13/chartex" xmlns:cx8="http://schemas.microsoft.com/office/drawing/2016/5/14/chartex" xmlns:mc="http://schemas.openxmlformats.org/markup-compatibility/2006" xmlns:aink="http://schemas.microsoft.com/office/drawing/2016/ink" xmlns:am3d="http://schemas.microsoft.com/office/drawing/2017/model3d" xmlns:o="urn:schemas-microsoft-com:office:office" xmlns:oel="http://schemas.microsoft.com/office/2019/extlst" xmlns:r="http://schemas.openxmlformats.org/officeDocument/2006/relationships" xmlns:m="http://schemas.openxmlformats.org/officeDocument/2006/math" xmlns:v="urn:schemas-microsoft-com:vml" xmlns:wp14="http://schemas.microsoft.com/office/word/2010/wordprocessingDrawing" xmlns:wp="http://schemas.openxmlformats.org/drawingml/2006/wordprocessingDrawing" xmlns:w10="urn:schemas-microsoft-com:office:word" xmlns:w="http://schemas.openxmlformats.org/wordprocessingml/2006/main" xmlns:w14="http://schemas.microsoft.com/office/word/2010/wordml" xmlns:w15="http://schemas.microsoft.com/office/word/2012/wordml" xmlns:w16cei="http://schemas.microsoft.com/office/word/2026/wordml/cei" xmlns:w16cex="http://schemas.microsoft.com/office/word/2018/wordml/cex" xmlns:w16cid="http://schemas.microsoft.com/office/word/2016/wordml/cid" xmlns:w16="http://schemas.microsoft.com/office/word/2018/wordml" xmlns:w16du="http://schemas.microsoft.com/office/word/2023/wordml/word16du" xmlns:w16sdtdh="http://schemas.microsoft.com/office/word/2020/wordml/sdtdatahash" xmlns:w16sdtfl="http://schemas.microsoft.com/office/word/2024/wordml/sdtformatlock" xmlns:w16se="http://schemas.microsoft.com/office/word/2015/wordml/symex" xmlns:wpg="http://schemas.microsoft.com/office/word/2010/wordprocessingGroup" xmlns:wpi="http://schemas.microsoft.com/office/word/2010/wordprocessingInk" xmlns:wne="http://schemas.microsoft.com/office/word/2006/wordml" xmlns:wps="http://schemas.microsoft.com/office/word/2010/wordprocessingShape" mc:Ignorable="w14 w15 w16se w16cid w16 w16cex w16sdtdh w16sdtfl w16du wp14">
   <w:footnote w:type="separator" w:id="-1">
     <w:p>
       <w:r>
@@ -2884,14 +2432,13 @@
 </file>
 
 <file path=word/header1.xml><?xml version="1.0" encoding="utf-8"?>
-<w:hdr xmlns:wpc="http://schemas.microsoft.com/office/word/2010/wordprocessingCanvas" xmlns:cx="http://schemas.microsoft.com/office/drawing/2014/chartex" xmlns:cx1="http://schemas.microsoft.com/office/drawing/2015/9/8/chartex" xmlns:cx2="http://schemas.microsoft.com/office/drawing/2015/10/21/chartex" xmlns:cx3="http://schemas.microsoft.com/office/drawing/2016/5/9/chartex" xmlns:cx4="http://schemas.microsoft.com/office/drawing/2016/5/10/chartex" xmlns:cx5="http://schemas.microsoft.com/office/drawing/2016/5/11/chartex" xmlns:cx6="http://schemas.microsoft.com/office/drawing/2016/5/12/chartex" xmlns:cx7="http://schemas.microsoft.com/office/drawing/2016/5/13/chartex" xmlns:cx8="http://schemas.microsoft.com/office/drawing/2016/5/14/chartex" xmlns:mc="http://schemas.openxmlformats.org/markup-compatibility/2006" xmlns:aink="http://schemas.microsoft.com/office/drawing/2016/ink" xmlns:am3d="http://schemas.microsoft.com/office/drawing/2017/model3d" xmlns:o="urn:schemas-microsoft-com:office:office" xmlns:oel="http://schemas.microsoft.com/office/2019/extlst" xmlns:r="http://schemas.openxmlformats.org/officeDocument/2006/relationships" xmlns:m="http://schemas.openxmlformats.org/officeDocument/2006/math" xmlns:v="urn:schemas-microsoft-com:vml" xmlns:wp14="http://schemas.microsoft.com/office/word/2010/wordprocessingDrawing" xmlns:wp="http://schemas.openxmlformats.org/drawingml/2006/wordprocessingDrawing" xmlns:w10="urn:schemas-microsoft-com:office:word" xmlns:w="http://schemas.openxmlformats.org/wordprocessingml/2006/main" xmlns:w14="http://schemas.microsoft.com/office/word/2010/wordml" xmlns:w15="http://schemas.microsoft.com/office/word/2012/wordml" xmlns:w16cex="http://schemas.microsoft.com/office/word/2018/wordml/cex" xmlns:w16cid="http://schemas.microsoft.com/office/word/2016/wordml/cid" xmlns:w16="http://schemas.microsoft.com/office/word/2018/wordml" xmlns:w16du="http://schemas.microsoft.com/office/word/2023/wordml/word16du" xmlns:w16sdtdh="http://schemas.microsoft.com/office/word/2020/wordml/sdtdatahash" xmlns:w16sdtfl="http://schemas.microsoft.com/office/word/2024/wordml/sdtformatlock" xmlns:w16se="http://schemas.microsoft.com/office/word/2015/wordml/symex" xmlns:wpg="http://schemas.microsoft.com/office/word/2010/wordprocessingGroup" xmlns:wpi="http://schemas.microsoft.com/office/word/2010/wordprocessingInk" xmlns:wne="http://schemas.microsoft.com/office/word/2006/wordml" xmlns:wps="http://schemas.microsoft.com/office/word/2010/wordprocessingShape" xmlns:a="http://schemas.openxmlformats.org/drawingml/2006/main" xmlns:pic="http://schemas.openxmlformats.org/drawingml/2006/picture" mc:Ignorable="w14 w15 w16se w16cid w16 w16cex w16sdtdh w16sdtfl w16du wp14">
+<w:hdr xmlns:wpc="http://schemas.microsoft.com/office/word/2010/wordprocessingCanvas" xmlns:cx="http://schemas.microsoft.com/office/drawing/2014/chartex" xmlns:cx1="http://schemas.microsoft.com/office/drawing/2015/9/8/chartex" xmlns:cx2="http://schemas.microsoft.com/office/drawing/2015/10/21/chartex" xmlns:cx3="http://schemas.microsoft.com/office/drawing/2016/5/9/chartex" xmlns:cx4="http://schemas.microsoft.com/office/drawing/2016/5/10/chartex" xmlns:cx5="http://schemas.microsoft.com/office/drawing/2016/5/11/chartex" xmlns:cx6="http://schemas.microsoft.com/office/drawing/2016/5/12/chartex" xmlns:cx7="http://schemas.microsoft.com/office/drawing/2016/5/13/chartex" xmlns:cx8="http://schemas.microsoft.com/office/drawing/2016/5/14/chartex" xmlns:mc="http://schemas.openxmlformats.org/markup-compatibility/2006" xmlns:aink="http://schemas.microsoft.com/office/drawing/2016/ink" xmlns:am3d="http://schemas.microsoft.com/office/drawing/2017/model3d" xmlns:o="urn:schemas-microsoft-com:office:office" xmlns:oel="http://schemas.microsoft.com/office/2019/extlst" xmlns:r="http://schemas.openxmlformats.org/officeDocument/2006/relationships" xmlns:m="http://schemas.openxmlformats.org/officeDocument/2006/math" xmlns:v="urn:schemas-microsoft-com:vml" xmlns:wp14="http://schemas.microsoft.com/office/word/2010/wordprocessingDrawing" xmlns:wp="http://schemas.openxmlformats.org/drawingml/2006/wordprocessingDrawing" xmlns:w10="urn:schemas-microsoft-com:office:word" xmlns:w="http://schemas.openxmlformats.org/wordprocessingml/2006/main" xmlns:w14="http://schemas.microsoft.com/office/word/2010/wordml" xmlns:w15="http://schemas.microsoft.com/office/word/2012/wordml" xmlns:w16cei="http://schemas.microsoft.com/office/word/2026/wordml/cei" xmlns:w16cex="http://schemas.microsoft.com/office/word/2018/wordml/cex" xmlns:w16cid="http://schemas.microsoft.com/office/word/2016/wordml/cid" xmlns:w16="http://schemas.microsoft.com/office/word/2018/wordml" xmlns:w16du="http://schemas.microsoft.com/office/word/2023/wordml/word16du" xmlns:w16sdtdh="http://schemas.microsoft.com/office/word/2020/wordml/sdtdatahash" xmlns:w16sdtfl="http://schemas.microsoft.com/office/word/2024/wordml/sdtformatlock" xmlns:w16se="http://schemas.microsoft.com/office/word/2015/wordml/symex" xmlns:wpg="http://schemas.microsoft.com/office/word/2010/wordprocessingGroup" xmlns:wpi="http://schemas.microsoft.com/office/word/2010/wordprocessingInk" xmlns:wne="http://schemas.microsoft.com/office/word/2006/wordml" xmlns:wps="http://schemas.microsoft.com/office/word/2010/wordprocessingShape" mc:Ignorable="w14 w15 w16se w16cid w16 w16cex w16sdtdh w16sdtfl w16du wp14">
   <w:p>
     <w:pPr>
       <w:pStyle w:val="Textoindependiente"/>
       <w:spacing w:line="14" w:lineRule="auto"/>
       <w:rPr>
         <w:sz w:val="20"/>
-        <w:szCs w:val="20"/>
       </w:rPr>
     </w:pPr>
     <w:r>
@@ -2996,8 +2543,8 @@
             </wp:anchor>
           </w:drawing>
         </mc:Choice>
-        <mc:Fallback xmlns:pic="http://schemas.openxmlformats.org/drawingml/2006/picture" xmlns:a="http://schemas.openxmlformats.org/drawingml/2006/main">
-          <w:pict w14:anchorId="7EEB9CA8">
+        <mc:Fallback xmlns:a="http://schemas.openxmlformats.org/drawingml/2006/main" xmlns:pic="http://schemas.openxmlformats.org/drawingml/2006/picture">
+          <w:pict>
             <v:group id="Group 12" style="position:absolute;margin-left:42.5pt;margin-top:37.85pt;width:527pt;height:9.1pt;z-index:-15815168;mso-wrap-distance-left:0;mso-wrap-distance-right:0;mso-position-horizontal-relative:page;mso-position-vertical-relative:page" coordsize="66929,1155" o:spid="_x0000_s1026" w14:anchorId="58BDBA3A" o:gfxdata="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">
               <v:shape id="Graphic 13" style="position:absolute;left:539;top:551;width:66390;height:13;visibility:visible;mso-wrap-style:square;v-text-anchor:top" coordsize="6638925,1270" o:spid="_x0000_s1027" filled="f" strokecolor="#1d4b63" path="m,l6638404,e" o:gfxdata="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">
                 <v:path arrowok="t"/>
@@ -3131,12 +2678,12 @@
           </w:drawing>
         </mc:Choice>
         <mc:Fallback>
-          <w:pict w14:anchorId="6F81A354">
-            <v:shapetype id="_x0000_t202" coordsize="21600,21600" o:spt="202" path="m,l,21600r21600,l21600,xe" w14:anchorId="2B617FCF">
+          <w:pict>
+            <v:shapetype w14:anchorId="2B617FCF" id="_x0000_t202" coordsize="21600,21600" o:spt="202" path="m,l,21600r21600,l21600,xe">
               <v:stroke joinstyle="miter"/>
               <v:path gradientshapeok="t" o:connecttype="rect"/>
             </v:shapetype>
-            <v:shape id="Textbox 15" style="position:absolute;margin-left:560.4pt;margin-top:23.65pt;width:13.1pt;height:14pt;z-index:-15814656;visibility:visible;mso-wrap-style:square;mso-wrap-distance-left:0;mso-wrap-distance-top:0;mso-wrap-distance-right:0;mso-wrap-distance-bottom:0;mso-position-horizontal:absolute;mso-position-horizontal-relative:page;mso-position-vertical:absolute;mso-position-vertical-relative:page;v-text-anchor:top" o:spid="_x0000_s1026" filled="f" stroked="f" type="#_x0000_t202" o:gfxdata="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">
+            <v:shape id="Textbox 15" o:spid="_x0000_s1026" type="#_x0000_t202" style="position:absolute;margin-left:560.4pt;margin-top:23.65pt;width:13.1pt;height:14pt;z-index:-15814656;visibility:visible;mso-wrap-style:square;mso-wrap-distance-left:0;mso-wrap-distance-top:0;mso-wrap-distance-right:0;mso-wrap-distance-bottom:0;mso-position-horizontal:absolute;mso-position-horizontal-relative:page;mso-position-vertical:absolute;mso-position-vertical-relative:page;v-text-anchor:top" o:gfxdata="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" filled="f" stroked="f">
               <v:textbox inset="0,0,0,0">
                 <w:txbxContent>
                   <w:p>
@@ -3202,8 +2749,29 @@
 </file>
 
 <file path=word/numbering.xml><?xml version="1.0" encoding="utf-8"?>
-<w:numbering xmlns:wpc="http://schemas.microsoft.com/office/word/2010/wordprocessingCanvas" xmlns:cx="http://schemas.microsoft.com/office/drawing/2014/chartex" xmlns:cx1="http://schemas.microsoft.com/office/drawing/2015/9/8/chartex" xmlns:cx2="http://schemas.microsoft.com/office/drawing/2015/10/21/chartex" xmlns:cx3="http://schemas.microsoft.com/office/drawing/2016/5/9/chartex" xmlns:cx4="http://schemas.microsoft.com/office/drawing/2016/5/10/chartex" xmlns:cx5="http://schemas.microsoft.com/office/drawing/2016/5/11/chartex" xmlns:cx6="http://schemas.microsoft.com/office/drawing/2016/5/12/chartex" xmlns:cx7="http://schemas.microsoft.com/office/drawing/2016/5/13/chartex" xmlns:cx8="http://schemas.microsoft.com/office/drawing/2016/5/14/chartex" xmlns:mc="http://schemas.openxmlformats.org/markup-compatibility/2006" xmlns:aink="http://schemas.microsoft.com/office/drawing/2016/ink" xmlns:am3d="http://schemas.microsoft.com/office/drawing/2017/model3d" xmlns:o="urn:schemas-microsoft-com:office:office" xmlns:oel="http://schemas.microsoft.com/office/2019/extlst" xmlns:r="http://schemas.openxmlformats.org/officeDocument/2006/relationships" xmlns:m="http://schemas.openxmlformats.org/officeDocument/2006/math" xmlns:v="urn:schemas-microsoft-com:vml" xmlns:wp14="http://schemas.microsoft.com/office/word/2010/wordprocessingDrawing" xmlns:wp="http://schemas.openxmlformats.org/drawingml/2006/wordprocessingDrawing" xmlns:w10="urn:schemas-microsoft-com:office:word" xmlns:w="http://schemas.openxmlformats.org/wordprocessingml/2006/main" xmlns:w14="http://schemas.microsoft.com/office/word/2010/wordml" xmlns:w15="http://schemas.microsoft.com/office/word/2012/wordml" xmlns:w16cex="http://schemas.microsoft.com/office/word/2018/wordml/cex" xmlns:w16cid="http://schemas.microsoft.com/office/word/2016/wordml/cid" xmlns:w16="http://schemas.microsoft.com/office/word/2018/wordml" xmlns:w16du="http://schemas.microsoft.com/office/word/2023/wordml/word16du" xmlns:w16sdtdh="http://schemas.microsoft.com/office/word/2020/wordml/sdtdatahash" xmlns:w16sdtfl="http://schemas.microsoft.com/office/word/2024/wordml/sdtformatlock" xmlns:w16se="http://schemas.microsoft.com/office/word/2015/wordml/symex" xmlns:wpg="http://schemas.microsoft.com/office/word/2010/wordprocessingGroup" xmlns:wpi="http://schemas.microsoft.com/office/word/2010/wordprocessingInk" xmlns:wne="http://schemas.microsoft.com/office/word/2006/wordml" xmlns:wps="http://schemas.microsoft.com/office/word/2010/wordprocessingShape" mc:Ignorable="w14 w15 w16se w16cid w16 w16cex w16sdtdh w16sdtfl w16du wp14">
+<w:numbering xmlns:wpc="http://schemas.microsoft.com/office/word/2010/wordprocessingCanvas" xmlns:cx="http://schemas.microsoft.com/office/drawing/2014/chartex" xmlns:cx1="http://schemas.microsoft.com/office/drawing/2015/9/8/chartex" xmlns:cx2="http://schemas.microsoft.com/office/drawing/2015/10/21/chartex" xmlns:cx3="http://schemas.microsoft.com/office/drawing/2016/5/9/chartex" xmlns:cx4="http://schemas.microsoft.com/office/drawing/2016/5/10/chartex" xmlns:cx5="http://schemas.microsoft.com/office/drawing/2016/5/11/chartex" xmlns:cx6="http://schemas.microsoft.com/office/drawing/2016/5/12/chartex" xmlns:cx7="http://schemas.microsoft.com/office/drawing/2016/5/13/chartex" xmlns:cx8="http://schemas.microsoft.com/office/drawing/2016/5/14/chartex" xmlns:mc="http://schemas.openxmlformats.org/markup-compatibility/2006" xmlns:aink="http://schemas.microsoft.com/office/drawing/2016/ink" xmlns:am3d="http://schemas.microsoft.com/office/drawing/2017/model3d" xmlns:o="urn:schemas-microsoft-com:office:office" xmlns:oel="http://schemas.microsoft.com/office/2019/extlst" xmlns:r="http://schemas.openxmlformats.org/officeDocument/2006/relationships" xmlns:m="http://schemas.openxmlformats.org/officeDocument/2006/math" xmlns:v="urn:schemas-microsoft-com:vml" xmlns:wp14="http://schemas.microsoft.com/office/word/2010/wordprocessingDrawing" xmlns:wp="http://schemas.openxmlformats.org/drawingml/2006/wordprocessingDrawing" xmlns:w10="urn:schemas-microsoft-com:office:word" xmlns:w="http://schemas.openxmlformats.org/wordprocessingml/2006/main" xmlns:w14="http://schemas.microsoft.com/office/word/2010/wordml" xmlns:w15="http://schemas.microsoft.com/office/word/2012/wordml" xmlns:w16cei="http://schemas.microsoft.com/office/word/2026/wordml/cei" xmlns:w16cex="http://schemas.microsoft.com/office/word/2018/wordml/cex" xmlns:w16cid="http://schemas.microsoft.com/office/word/2016/wordml/cid" xmlns:w16="http://schemas.microsoft.com/office/word/2018/wordml" xmlns:w16du="http://schemas.microsoft.com/office/word/2023/wordml/word16du" xmlns:w16sdtdh="http://schemas.microsoft.com/office/word/2020/wordml/sdtdatahash" xmlns:w16sdtfl="http://schemas.microsoft.com/office/word/2024/wordml/sdtformatlock" xmlns:w16se="http://schemas.microsoft.com/office/word/2015/wordml/symex" xmlns:wpg="http://schemas.microsoft.com/office/word/2010/wordprocessingGroup" xmlns:wpi="http://schemas.microsoft.com/office/word/2010/wordprocessingInk" xmlns:wne="http://schemas.microsoft.com/office/word/2006/wordml" xmlns:wps="http://schemas.microsoft.com/office/word/2010/wordprocessingShape" mc:Ignorable="w14 w15 w16se w16cid w16 w16cex w16sdtdh w16sdtfl w16du wp14">
   <w:abstractNum w:abstractNumId="0" w15:restartNumberingAfterBreak="0">
+    <w:nsid w:val="FFFFFF89"/>
+    <w:multiLevelType w:val="singleLevel"/>
+    <w:tmpl w:val="EDC42D60"/>
+    <w:lvl w:ilvl="0">
+      <w:start w:val="1"/>
+      <w:numFmt w:val="bullet"/>
+      <w:pStyle w:val="Listaconvietas"/>
+      <w:lvlText w:val=""/>
+      <w:lvlJc w:val="left"/>
+      <w:pPr>
+        <w:tabs>
+          <w:tab w:val="num" w:pos="360"/>
+        </w:tabs>
+        <w:ind w:left="360" w:hanging="360"/>
+      </w:pPr>
+      <w:rPr>
+        <w:rFonts w:ascii="Symbol" w:hAnsi="Symbol" w:hint="default"/>
+      </w:rPr>
+    </w:lvl>
+  </w:abstractNum>
+  <w:abstractNum w:abstractNumId="1" w15:restartNumberingAfterBreak="0">
     <w:nsid w:val="06DF4ED4"/>
     <w:multiLevelType w:val="hybridMultilevel"/>
     <w:tmpl w:val="D87A756E"/>
@@ -3216,7 +2784,7 @@
         <w:ind w:left="340" w:hanging="340"/>
       </w:pPr>
       <w:rPr>
-        <w:rFonts w:hint="default" w:ascii="Arial" w:hAnsi="Arial" w:eastAsia="Arial" w:cs="Arial"/>
+        <w:rFonts w:ascii="Arial" w:eastAsia="Arial" w:hAnsi="Arial" w:cs="Arial" w:hint="default"/>
         <w:b/>
         <w:bCs/>
         <w:i w:val="0"/>
@@ -3238,7 +2806,7 @@
         <w:ind w:left="700" w:hanging="341"/>
       </w:pPr>
       <w:rPr>
-        <w:rFonts w:hint="default" w:ascii="Arial" w:hAnsi="Arial" w:eastAsia="Arial" w:cs="Arial"/>
+        <w:rFonts w:ascii="Arial" w:eastAsia="Arial" w:hAnsi="Arial" w:cs="Arial" w:hint="default"/>
         <w:b/>
         <w:bCs/>
         <w:i w:val="0"/>
@@ -3274,7 +2842,7 @@
         <w:ind w:left="1360" w:hanging="340"/>
       </w:pPr>
       <w:rPr>
-        <w:rFonts w:hint="default" w:ascii="Arial" w:hAnsi="Arial" w:eastAsia="Arial" w:cs="Arial"/>
+        <w:rFonts w:ascii="Arial" w:eastAsia="Arial" w:hAnsi="Arial" w:cs="Arial" w:hint="default"/>
         <w:b w:val="0"/>
         <w:bCs w:val="0"/>
         <w:i w:val="0"/>
@@ -3348,7 +2916,7 @@
       </w:rPr>
     </w:lvl>
   </w:abstractNum>
-  <w:abstractNum w:abstractNumId="1" w15:restartNumberingAfterBreak="0">
+  <w:abstractNum w:abstractNumId="2" w15:restartNumberingAfterBreak="0">
     <w:nsid w:val="116E5B54"/>
     <w:multiLevelType w:val="hybridMultilevel"/>
     <w:tmpl w:val="A3B278C8"/>
@@ -3361,7 +2929,7 @@
         <w:ind w:left="502" w:hanging="360"/>
       </w:pPr>
       <w:rPr>
-        <w:rFonts w:hint="default" w:ascii="Arial" w:hAnsi="Arial" w:eastAsia="MS Mincho" w:cs="Arial"/>
+        <w:rFonts w:ascii="Arial" w:eastAsia="MS Mincho" w:hAnsi="Arial" w:cs="Arial" w:hint="default"/>
         <w:b/>
         <w:bCs/>
         <w:sz w:val="22"/>
@@ -3440,7 +3008,7 @@
       </w:pPr>
     </w:lvl>
   </w:abstractNum>
-  <w:abstractNum w:abstractNumId="2" w15:restartNumberingAfterBreak="0">
+  <w:abstractNum w:abstractNumId="3" w15:restartNumberingAfterBreak="0">
     <w:nsid w:val="25317EF4"/>
     <w:multiLevelType w:val="hybridMultilevel"/>
     <w:tmpl w:val="E1F63A20"/>
@@ -3453,7 +3021,7 @@
         <w:ind w:left="1207" w:hanging="340"/>
       </w:pPr>
       <w:rPr>
-        <w:rFonts w:hint="default" w:ascii="Arial" w:hAnsi="Arial" w:eastAsia="Arial" w:cs="Arial"/>
+        <w:rFonts w:ascii="Arial" w:eastAsia="Arial" w:hAnsi="Arial" w:cs="Arial" w:hint="default"/>
         <w:b/>
         <w:bCs/>
         <w:i w:val="0"/>
@@ -3563,7 +3131,7 @@
       </w:rPr>
     </w:lvl>
   </w:abstractNum>
-  <w:abstractNum w:abstractNumId="3" w15:restartNumberingAfterBreak="0">
+  <w:abstractNum w:abstractNumId="4" w15:restartNumberingAfterBreak="0">
     <w:nsid w:val="27F93C76"/>
     <w:multiLevelType w:val="hybridMultilevel"/>
     <w:tmpl w:val="3834B38C"/>
@@ -3652,7 +3220,7 @@
       </w:pPr>
     </w:lvl>
   </w:abstractNum>
-  <w:abstractNum w:abstractNumId="4" w15:restartNumberingAfterBreak="0">
+  <w:abstractNum w:abstractNumId="5" w15:restartNumberingAfterBreak="0">
     <w:nsid w:val="2C090DB3"/>
     <w:multiLevelType w:val="hybridMultilevel"/>
     <w:tmpl w:val="901ACB7A"/>
@@ -3742,7 +3310,7 @@
       </w:pPr>
     </w:lvl>
   </w:abstractNum>
-  <w:abstractNum w:abstractNumId="5" w15:restartNumberingAfterBreak="0">
+  <w:abstractNum w:abstractNumId="6" w15:restartNumberingAfterBreak="0">
     <w:nsid w:val="44D03387"/>
     <w:multiLevelType w:val="hybridMultilevel"/>
     <w:tmpl w:val="84563E42"/>
@@ -3833,7 +3401,7 @@
       </w:pPr>
     </w:lvl>
   </w:abstractNum>
-  <w:abstractNum w:abstractNumId="6" w15:restartNumberingAfterBreak="0">
+  <w:abstractNum w:abstractNumId="7" w15:restartNumberingAfterBreak="0">
     <w:nsid w:val="4CE53233"/>
     <w:multiLevelType w:val="hybridMultilevel"/>
     <w:tmpl w:val="78A4D17C"/>
@@ -3923,7 +3491,7 @@
       </w:pPr>
     </w:lvl>
   </w:abstractNum>
-  <w:abstractNum w:abstractNumId="7" w15:restartNumberingAfterBreak="0">
+  <w:abstractNum w:abstractNumId="8" w15:restartNumberingAfterBreak="0">
     <w:nsid w:val="61B34CEE"/>
     <w:multiLevelType w:val="hybridMultilevel"/>
     <w:tmpl w:val="84563E42"/>
@@ -4014,7 +3582,7 @@
       </w:pPr>
     </w:lvl>
   </w:abstractNum>
-  <w:abstractNum w:abstractNumId="8" w15:restartNumberingAfterBreak="0">
+  <w:abstractNum w:abstractNumId="9" w15:restartNumberingAfterBreak="0">
     <w:nsid w:val="7B426CE0"/>
     <w:multiLevelType w:val="hybridMultilevel"/>
     <w:tmpl w:val="13FC1F1E"/>
@@ -4101,13 +3669,13 @@
     </w:lvl>
   </w:abstractNum>
   <w:num w:numId="1" w16cid:durableId="1792236605">
-    <w:abstractNumId w:val="2"/>
+    <w:abstractNumId w:val="3"/>
   </w:num>
   <w:num w:numId="2" w16cid:durableId="1182664394">
-    <w:abstractNumId w:val="0"/>
+    <w:abstractNumId w:val="1"/>
   </w:num>
   <w:num w:numId="3" w16cid:durableId="25719447">
-    <w:abstractNumId w:val="6"/>
+    <w:abstractNumId w:val="7"/>
     <w:lvlOverride w:ilvl="0">
       <w:startOverride w:val="1"/>
     </w:lvlOverride>
@@ -4137,32 +3705,35 @@
     </w:lvlOverride>
   </w:num>
   <w:num w:numId="4" w16cid:durableId="1739790130">
+    <w:abstractNumId w:val="5"/>
+  </w:num>
+  <w:num w:numId="5" w16cid:durableId="114713531">
+    <w:abstractNumId w:val="6"/>
+  </w:num>
+  <w:num w:numId="6" w16cid:durableId="1514028092">
+    <w:abstractNumId w:val="9"/>
+  </w:num>
+  <w:num w:numId="7" w16cid:durableId="701251958">
+    <w:abstractNumId w:val="2"/>
+  </w:num>
+  <w:num w:numId="8" w16cid:durableId="1575435567">
     <w:abstractNumId w:val="4"/>
   </w:num>
-  <w:num w:numId="5" w16cid:durableId="114713531">
-    <w:abstractNumId w:val="5"/>
-  </w:num>
-  <w:num w:numId="6" w16cid:durableId="1514028092">
+  <w:num w:numId="9" w16cid:durableId="2058625057">
     <w:abstractNumId w:val="8"/>
   </w:num>
-  <w:num w:numId="7" w16cid:durableId="701251958">
-    <w:abstractNumId w:val="1"/>
-  </w:num>
-  <w:num w:numId="8" w16cid:durableId="1575435567">
-    <w:abstractNumId w:val="3"/>
-  </w:num>
-  <w:num w:numId="9" w16cid:durableId="2058625057">
-    <w:abstractNumId w:val="7"/>
+  <w:num w:numId="10" w16cid:durableId="1456489685">
+    <w:abstractNumId w:val="0"/>
   </w:num>
 </w:numbering>
 </file>
 
 <file path=word/styles.xml><?xml version="1.0" encoding="utf-8"?>
-<w:styles xmlns:wp14="http://schemas.microsoft.com/office/word/2010/wordprocessingDrawing" xmlns:mc="http://schemas.openxmlformats.org/markup-compatibility/2006" xmlns:r="http://schemas.openxmlformats.org/officeDocument/2006/relationships" xmlns:w="http://schemas.openxmlformats.org/wordprocessingml/2006/main" xmlns:w14="http://schemas.microsoft.com/office/word/2010/wordml" xmlns:w15="http://schemas.microsoft.com/office/word/2012/wordml" xmlns:w16cex="http://schemas.microsoft.com/office/word/2018/wordml/cex" xmlns:w16cid="http://schemas.microsoft.com/office/word/2016/wordml/cid" xmlns:w16="http://schemas.microsoft.com/office/word/2018/wordml" xmlns:w16du="http://schemas.microsoft.com/office/word/2023/wordml/word16du" xmlns:w16sdtdh="http://schemas.microsoft.com/office/word/2020/wordml/sdtdatahash" xmlns:w16sdtfl="http://schemas.microsoft.com/office/word/2024/wordml/sdtformatlock" xmlns:w16se="http://schemas.microsoft.com/office/word/2015/wordml/symex" mc:Ignorable="w14 w15 w16se w16cid w16 w16cex w16sdtdh w16sdtfl w16du wp14">
+<w:styles xmlns:mc="http://schemas.openxmlformats.org/markup-compatibility/2006" xmlns:r="http://schemas.openxmlformats.org/officeDocument/2006/relationships" xmlns:w="http://schemas.openxmlformats.org/wordprocessingml/2006/main" xmlns:w14="http://schemas.microsoft.com/office/word/2010/wordml" xmlns:w15="http://schemas.microsoft.com/office/word/2012/wordml" xmlns:w16cex="http://schemas.microsoft.com/office/word/2018/wordml/cex" xmlns:w16cid="http://schemas.microsoft.com/office/word/2016/wordml/cid" xmlns:w16="http://schemas.microsoft.com/office/word/2018/wordml" xmlns:w16du="http://schemas.microsoft.com/office/word/2023/wordml/word16du" xmlns:w16sdtdh="http://schemas.microsoft.com/office/word/2020/wordml/sdtdatahash" xmlns:w16sdtfl="http://schemas.microsoft.com/office/word/2024/wordml/sdtformatlock" xmlns:w16se="http://schemas.microsoft.com/office/word/2015/wordml/symex" mc:Ignorable="w14 w15 w16se w16cid w16 w16cex w16sdtdh w16sdtfl w16du">
   <w:docDefaults>
     <w:rPrDefault>
       <w:rPr>
-        <w:rFonts w:asciiTheme="minorHAnsi" w:hAnsiTheme="minorHAnsi" w:eastAsiaTheme="minorHAnsi" w:cstheme="minorBidi"/>
+        <w:rFonts w:asciiTheme="minorHAnsi" w:eastAsiaTheme="minorHAnsi" w:hAnsiTheme="minorHAnsi" w:cstheme="minorBidi"/>
         <w:sz w:val="22"/>
         <w:szCs w:val="22"/>
         <w:lang w:val="en-US" w:eastAsia="en-US" w:bidi="ar-SA"/>
@@ -4179,14 +3750,14 @@
   <w:latentStyles w:defLockedState="0" w:defUIPriority="99" w:defSemiHidden="0" w:defUnhideWhenUsed="0" w:defQFormat="0" w:count="376">
     <w:lsdException w:name="Normal" w:uiPriority="0" w:qFormat="1"/>
     <w:lsdException w:name="heading 1" w:uiPriority="9" w:qFormat="1"/>
-    <w:lsdException w:name="heading 2" w:uiPriority="9" w:semiHidden="1" w:unhideWhenUsed="1" w:qFormat="1"/>
-    <w:lsdException w:name="heading 3" w:uiPriority="9" w:semiHidden="1" w:unhideWhenUsed="1" w:qFormat="1"/>
-    <w:lsdException w:name="heading 4" w:uiPriority="9" w:semiHidden="1" w:unhideWhenUsed="1" w:qFormat="1"/>
-    <w:lsdException w:name="heading 5" w:uiPriority="9" w:semiHidden="1" w:unhideWhenUsed="1" w:qFormat="1"/>
-    <w:lsdException w:name="heading 6" w:uiPriority="9" w:semiHidden="1" w:unhideWhenUsed="1" w:qFormat="1"/>
-    <w:lsdException w:name="heading 7" w:uiPriority="9" w:semiHidden="1" w:unhideWhenUsed="1" w:qFormat="1"/>
-    <w:lsdException w:name="heading 8" w:uiPriority="9" w:semiHidden="1" w:unhideWhenUsed="1" w:qFormat="1"/>
-    <w:lsdException w:name="heading 9" w:uiPriority="9" w:semiHidden="1" w:unhideWhenUsed="1" w:qFormat="1"/>
+    <w:lsdException w:name="heading 2" w:semiHidden="1" w:uiPriority="9" w:unhideWhenUsed="1" w:qFormat="1"/>
+    <w:lsdException w:name="heading 3" w:semiHidden="1" w:uiPriority="9" w:unhideWhenUsed="1" w:qFormat="1"/>
+    <w:lsdException w:name="heading 4" w:semiHidden="1" w:uiPriority="9" w:unhideWhenUsed="1" w:qFormat="1"/>
+    <w:lsdException w:name="heading 5" w:semiHidden="1" w:uiPriority="9" w:unhideWhenUsed="1" w:qFormat="1"/>
+    <w:lsdException w:name="heading 6" w:semiHidden="1" w:uiPriority="9" w:unhideWhenUsed="1" w:qFormat="1"/>
+    <w:lsdException w:name="heading 7" w:semiHidden="1" w:uiPriority="9" w:unhideWhenUsed="1" w:qFormat="1"/>
+    <w:lsdException w:name="heading 8" w:semiHidden="1" w:uiPriority="9" w:unhideWhenUsed="1" w:qFormat="1"/>
+    <w:lsdException w:name="heading 9" w:semiHidden="1" w:uiPriority="9" w:unhideWhenUsed="1" w:qFormat="1"/>
     <w:lsdException w:name="index 1" w:semiHidden="1" w:unhideWhenUsed="1"/>
     <w:lsdException w:name="index 2" w:semiHidden="1" w:unhideWhenUsed="1"/>
     <w:lsdException w:name="index 3" w:semiHidden="1" w:unhideWhenUsed="1"/>
@@ -4196,22 +3767,22 @@
     <w:lsdException w:name="index 7" w:semiHidden="1" w:unhideWhenUsed="1"/>
     <w:lsdException w:name="index 8" w:semiHidden="1" w:unhideWhenUsed="1"/>
     <w:lsdException w:name="index 9" w:semiHidden="1" w:unhideWhenUsed="1"/>
-    <w:lsdException w:name="toc 1" w:uiPriority="39" w:semiHidden="1" w:unhideWhenUsed="1"/>
-    <w:lsdException w:name="toc 2" w:uiPriority="39" w:semiHidden="1" w:unhideWhenUsed="1"/>
-    <w:lsdException w:name="toc 3" w:uiPriority="39" w:semiHidden="1" w:unhideWhenUsed="1"/>
-    <w:lsdException w:name="toc 4" w:uiPriority="39" w:semiHidden="1" w:unhideWhenUsed="1"/>
-    <w:lsdException w:name="toc 5" w:uiPriority="39" w:semiHidden="1" w:unhideWhenUsed="1"/>
-    <w:lsdException w:name="toc 6" w:uiPriority="39" w:semiHidden="1" w:unhideWhenUsed="1"/>
-    <w:lsdException w:name="toc 7" w:uiPriority="39" w:semiHidden="1" w:unhideWhenUsed="1"/>
-    <w:lsdException w:name="toc 8" w:uiPriority="39" w:semiHidden="1" w:unhideWhenUsed="1"/>
-    <w:lsdException w:name="toc 9" w:uiPriority="39" w:semiHidden="1" w:unhideWhenUsed="1"/>
+    <w:lsdException w:name="toc 1" w:semiHidden="1" w:uiPriority="39" w:unhideWhenUsed="1"/>
+    <w:lsdException w:name="toc 2" w:semiHidden="1" w:uiPriority="39" w:unhideWhenUsed="1"/>
+    <w:lsdException w:name="toc 3" w:semiHidden="1" w:uiPriority="39" w:unhideWhenUsed="1"/>
+    <w:lsdException w:name="toc 4" w:semiHidden="1" w:uiPriority="39" w:unhideWhenUsed="1"/>
+    <w:lsdException w:name="toc 5" w:semiHidden="1" w:uiPriority="39" w:unhideWhenUsed="1"/>
+    <w:lsdException w:name="toc 6" w:semiHidden="1" w:uiPriority="39" w:unhideWhenUsed="1"/>
+    <w:lsdException w:name="toc 7" w:semiHidden="1" w:uiPriority="39" w:unhideWhenUsed="1"/>
+    <w:lsdException w:name="toc 8" w:semiHidden="1" w:uiPriority="39" w:unhideWhenUsed="1"/>
+    <w:lsdException w:name="toc 9" w:semiHidden="1" w:uiPriority="39" w:unhideWhenUsed="1"/>
     <w:lsdException w:name="Normal Indent" w:semiHidden="1" w:unhideWhenUsed="1"/>
     <w:lsdException w:name="footnote text" w:semiHidden="1" w:unhideWhenUsed="1"/>
     <w:lsdException w:name="annotation text" w:semiHidden="1" w:unhideWhenUsed="1"/>
     <w:lsdException w:name="header" w:semiHidden="1" w:unhideWhenUsed="1"/>
     <w:lsdException w:name="footer" w:semiHidden="1" w:unhideWhenUsed="1"/>
     <w:lsdException w:name="index heading" w:semiHidden="1" w:unhideWhenUsed="1"/>
-    <w:lsdException w:name="caption" w:uiPriority="35" w:semiHidden="1" w:unhideWhenUsed="1" w:qFormat="1"/>
+    <w:lsdException w:name="caption" w:semiHidden="1" w:uiPriority="35" w:unhideWhenUsed="1" w:qFormat="1"/>
     <w:lsdException w:name="table of figures" w:semiHidden="1" w:unhideWhenUsed="1"/>
     <w:lsdException w:name="envelope address" w:semiHidden="1" w:unhideWhenUsed="1"/>
     <w:lsdException w:name="envelope return" w:semiHidden="1" w:unhideWhenUsed="1"/>
@@ -4242,7 +3813,7 @@
     <w:lsdException w:name="Title" w:uiPriority="10" w:qFormat="1"/>
     <w:lsdException w:name="Closing" w:semiHidden="1" w:unhideWhenUsed="1"/>
     <w:lsdException w:name="Signature" w:semiHidden="1" w:unhideWhenUsed="1"/>
-    <w:lsdException w:name="Default Paragraph Font" w:uiPriority="1" w:semiHidden="1" w:unhideWhenUsed="1"/>
+    <w:lsdException w:name="Default Paragraph Font" w:semiHidden="1" w:uiPriority="1" w:unhideWhenUsed="1"/>
     <w:lsdException w:name="Body Text" w:semiHidden="1" w:unhideWhenUsed="1"/>
     <w:lsdException w:name="Body Text Indent" w:semiHidden="1" w:unhideWhenUsed="1"/>
     <w:lsdException w:name="List Continue" w:semiHidden="1" w:unhideWhenUsed="1"/>
@@ -4442,8 +4013,8 @@
     <w:lsdException w:name="Subtle Reference" w:uiPriority="31" w:qFormat="1"/>
     <w:lsdException w:name="Intense Reference" w:uiPriority="32" w:qFormat="1"/>
     <w:lsdException w:name="Book Title" w:uiPriority="33" w:qFormat="1"/>
-    <w:lsdException w:name="Bibliography" w:uiPriority="37" w:semiHidden="1" w:unhideWhenUsed="1"/>
-    <w:lsdException w:name="TOC Heading" w:uiPriority="39" w:semiHidden="1" w:unhideWhenUsed="1" w:qFormat="1"/>
+    <w:lsdException w:name="Bibliography" w:semiHidden="1" w:uiPriority="37" w:unhideWhenUsed="1"/>
+    <w:lsdException w:name="TOC Heading" w:semiHidden="1" w:uiPriority="39" w:unhideWhenUsed="1" w:qFormat="1"/>
     <w:lsdException w:name="Plain Table 1" w:uiPriority="41"/>
     <w:lsdException w:name="Plain Table 2" w:uiPriority="42"/>
     <w:lsdException w:name="Plain Table 3" w:uiPriority="43"/>
@@ -4554,11 +4125,11 @@
     <w:lsdException w:name="Unresolved Mention" w:semiHidden="1" w:unhideWhenUsed="1"/>
     <w:lsdException w:name="Smart Link" w:semiHidden="1" w:unhideWhenUsed="1"/>
   </w:latentStyles>
-  <w:style w:type="paragraph" w:styleId="Normal" w:default="1">
+  <w:style w:type="paragraph" w:default="1" w:styleId="Normal">
     <w:name w:val="Normal"/>
     <w:qFormat/>
     <w:rPr>
-      <w:rFonts w:ascii="Arial" w:hAnsi="Arial" w:eastAsia="Arial" w:cs="Arial"/>
+      <w:rFonts w:ascii="Arial" w:eastAsia="Arial" w:hAnsi="Arial" w:cs="Arial"/>
       <w:lang w:val="es-ES"/>
     </w:rPr>
   </w:style>
@@ -4584,13 +4155,12 @@
       <w:szCs w:val="26"/>
     </w:rPr>
   </w:style>
-  <w:style w:type="character" w:styleId="Fuentedeprrafopredeter" w:default="1">
+  <w:style w:type="character" w:default="1" w:styleId="Fuentedeprrafopredeter">
     <w:name w:val="Default Paragraph Font"/>
     <w:uiPriority w:val="1"/>
-    <w:semiHidden/>
     <w:unhideWhenUsed/>
   </w:style>
-  <w:style w:type="table" w:styleId="Tablanormal" w:default="1">
+  <w:style w:type="table" w:default="1" w:styleId="Tablanormal">
     <w:name w:val="Normal Table"/>
     <w:uiPriority w:val="99"/>
     <w:semiHidden/>
@@ -4605,13 +4175,13 @@
       </w:tblCellMar>
     </w:tblPr>
   </w:style>
-  <w:style w:type="numbering" w:styleId="Sinlista" w:default="1">
+  <w:style w:type="numbering" w:default="1" w:styleId="Sinlista">
     <w:name w:val="No List"/>
     <w:uiPriority w:val="99"/>
     <w:semiHidden/>
     <w:unhideWhenUsed/>
   </w:style>
-  <w:style w:type="table" w:styleId="TableNormal" w:customStyle="1">
+  <w:style w:type="table" w:customStyle="1" w:styleId="TableNormal">
     <w:name w:val="Table Normal"/>
     <w:uiPriority w:val="2"/>
     <w:semiHidden/>
@@ -4663,30 +4233,30 @@
       <w:jc w:val="both"/>
     </w:pPr>
   </w:style>
-  <w:style w:type="paragraph" w:styleId="TableParagraph" w:customStyle="1">
+  <w:style w:type="paragraph" w:customStyle="1" w:styleId="TableParagraph">
     <w:name w:val="Table Paragraph"/>
     <w:basedOn w:val="Normal"/>
     <w:uiPriority w:val="1"/>
     <w:qFormat/>
   </w:style>
-  <w:style w:type="character" w:styleId="normaltextrun" w:customStyle="1">
+  <w:style w:type="character" w:customStyle="1" w:styleId="normaltextrun">
     <w:name w:val="normaltextrun"/>
     <w:basedOn w:val="Fuentedeprrafopredeter"/>
     <w:rsid w:val="00E02CCA"/>
   </w:style>
-  <w:style w:type="character" w:styleId="eop" w:customStyle="1">
+  <w:style w:type="character" w:customStyle="1" w:styleId="eop">
     <w:name w:val="eop"/>
     <w:basedOn w:val="Fuentedeprrafopredeter"/>
     <w:rsid w:val="00464217"/>
   </w:style>
-  <w:style w:type="character" w:styleId="PrrafodelistaCar" w:customStyle="1">
+  <w:style w:type="character" w:customStyle="1" w:styleId="PrrafodelistaCar">
     <w:name w:val="Párrafo de lista Car"/>
     <w:link w:val="Prrafodelista"/>
     <w:uiPriority w:val="34"/>
     <w:qFormat/>
     <w:rsid w:val="005F5AD8"/>
     <w:rPr>
-      <w:rFonts w:ascii="Arial" w:hAnsi="Arial" w:eastAsia="Arial" w:cs="Arial"/>
+      <w:rFonts w:ascii="Arial" w:eastAsia="Arial" w:hAnsi="Arial" w:cs="Arial"/>
       <w:lang w:val="es-ES"/>
     </w:rPr>
   </w:style>
@@ -4703,7 +4273,7 @@
       <w:spacing w:before="100" w:beforeAutospacing="1" w:after="100" w:afterAutospacing="1"/>
     </w:pPr>
     <w:rPr>
-      <w:rFonts w:ascii="Times" w:hAnsi="Times" w:eastAsia="MS Mincho" w:cs="Times New Roman"/>
+      <w:rFonts w:ascii="Times" w:eastAsia="MS Mincho" w:hAnsi="Times" w:cs="Times New Roman"/>
       <w:sz w:val="20"/>
       <w:szCs w:val="20"/>
       <w:lang w:val="es-ES_tradnl" w:eastAsia="es-ES"/>
@@ -4721,14 +4291,14 @@
       <w:szCs w:val="20"/>
     </w:rPr>
   </w:style>
-  <w:style w:type="character" w:styleId="TextocomentarioCar" w:customStyle="1">
+  <w:style w:type="character" w:customStyle="1" w:styleId="TextocomentarioCar">
     <w:name w:val="Texto comentario Car"/>
     <w:basedOn w:val="Fuentedeprrafopredeter"/>
     <w:link w:val="Textocomentario"/>
     <w:uiPriority w:val="99"/>
     <w:semiHidden/>
     <w:rPr>
-      <w:rFonts w:ascii="Arial" w:hAnsi="Arial" w:eastAsia="Arial" w:cs="Arial"/>
+      <w:rFonts w:ascii="Arial" w:eastAsia="Arial" w:hAnsi="Arial" w:cs="Arial"/>
       <w:sz w:val="20"/>
       <w:szCs w:val="20"/>
       <w:lang w:val="es-ES"/>
@@ -4745,18 +4315,66 @@
       <w:szCs w:val="16"/>
     </w:rPr>
   </w:style>
-  <w:style w:type="character" w:styleId="Ttulo2Car" w:customStyle="1">
+  <w:style w:type="character" w:customStyle="1" w:styleId="Ttulo2Car">
     <w:name w:val="Título 2 Car"/>
     <w:basedOn w:val="Fuentedeprrafopredeter"/>
     <w:link w:val="Ttulo2"/>
     <w:uiPriority w:val="9"/>
     <w:rsid w:val="00A863D6"/>
     <w:rPr>
-      <w:rFonts w:ascii="Arial" w:hAnsi="Arial" w:eastAsiaTheme="majorEastAsia" w:cstheme="majorBidi"/>
+      <w:rFonts w:ascii="Arial" w:eastAsiaTheme="majorEastAsia" w:hAnsi="Arial" w:cstheme="majorBidi"/>
       <w:color w:val="002F49"/>
       <w:sz w:val="28"/>
       <w:szCs w:val="26"/>
       <w:lang w:val="es-ES"/>
+    </w:rPr>
+  </w:style>
+  <w:style w:type="paragraph" w:styleId="Listaconvietas">
+    <w:name w:val="List Bullet"/>
+    <w:basedOn w:val="Normal"/>
+    <w:uiPriority w:val="99"/>
+    <w:unhideWhenUsed/>
+    <w:rsid w:val="00753B35"/>
+    <w:pPr>
+      <w:widowControl/>
+      <w:numPr>
+        <w:numId w:val="10"/>
+      </w:numPr>
+      <w:tabs>
+        <w:tab w:val="clear" w:pos="360"/>
+      </w:tabs>
+      <w:autoSpaceDE/>
+      <w:autoSpaceDN/>
+      <w:spacing w:after="120" w:line="259" w:lineRule="auto"/>
+      <w:ind w:left="0" w:firstLine="0"/>
+      <w:contextualSpacing/>
+    </w:pPr>
+    <w:rPr>
+      <w:rFonts w:ascii="Calibri" w:eastAsiaTheme="minorEastAsia" w:hAnsi="Calibri" w:cstheme="minorBidi"/>
+      <w:lang w:val="en-US"/>
+    </w:rPr>
+  </w:style>
+  <w:style w:type="character" w:styleId="Hipervnculo">
+    <w:name w:val="Hyperlink"/>
+    <w:basedOn w:val="Fuentedeprrafopredeter"/>
+    <w:uiPriority w:val="99"/>
+    <w:unhideWhenUsed/>
+    <w:rsid w:val="00607FFC"/>
+    <w:rPr>
+      <w:color w:val="0000FF" w:themeColor="hyperlink"/>
+      <w:u w:val="single"/>
+    </w:rPr>
+  </w:style>
+  <w:style w:type="character" w:styleId="Mencinsinresolver">
+    <w:name w:val="Unresolved Mention"/>
+    <w:basedOn w:val="Fuentedeprrafopredeter"/>
+    <w:uiPriority w:val="99"/>
+    <w:semiHidden/>
+    <w:unhideWhenUsed/>
+    <w:rsid w:val="00607FFC"/>
+    <w:rPr>
+      <w:color w:val="605E5C"/>
+      <w:shd w:val="clear" w:color="auto" w:fill="E1DFDD"/>
     </w:rPr>
   </w:style>
 </w:styles>
@@ -5046,10 +4664,6 @@
 </file>
 
 <file path=customXml/item1.xml><?xml version="1.0" encoding="utf-8"?>
-<b:Sources xmlns:b="http://schemas.openxmlformats.org/officeDocument/2006/bibliography" xmlns="http://schemas.openxmlformats.org/officeDocument/2006/bibliography" SelectedStyle="\APASixthEditionOfficeOnline.xsl" StyleName="APA" Version="6"/>
-</file>
-
-<file path=customXml/item2.xml><?xml version="1.0" encoding="utf-8"?>
 <?mso-contentType ?>
 <FormTemplates xmlns="http://schemas.microsoft.com/sharepoint/v3/contenttype/forms">
   <Display>DocumentLibraryForm</Display>
@@ -5058,7 +4672,21 @@
 </FormTemplates>
 </file>
 
+<file path=customXml/item2.xml><?xml version="1.0" encoding="utf-8"?>
+<b:Sources xmlns:b="http://schemas.openxmlformats.org/officeDocument/2006/bibliography" xmlns="http://schemas.openxmlformats.org/officeDocument/2006/bibliography" SelectedStyle="\APASixthEditionOfficeOnline.xsl" StyleName="APA" Version="6"/>
+</file>
+
 <file path=customXml/item3.xml><?xml version="1.0" encoding="utf-8"?>
+<p:properties xmlns:p="http://schemas.microsoft.com/office/2006/metadata/properties" xmlns:xsi="http://www.w3.org/2001/XMLSchema-instance" xmlns:pc="http://schemas.microsoft.com/office/infopath/2007/PartnerControls">
+  <documentManagement>
+    <lcf76f155ced4ddcb4097134ff3c332f xmlns="0a2fff00-f002-44e7-b50c-b90cb65110b9">
+      <Terms xmlns="http://schemas.microsoft.com/office/infopath/2007/PartnerControls"/>
+    </lcf76f155ced4ddcb4097134ff3c332f>
+  </documentManagement>
+</p:properties>
+</file>
+
+<file path=customXml/item4.xml><?xml version="1.0" encoding="utf-8"?>
 <ct:contentTypeSchema xmlns:ct="http://schemas.microsoft.com/office/2006/metadata/contentType" xmlns:ma="http://schemas.microsoft.com/office/2006/metadata/properties/metaAttributes" ct:_="" ma:_="" ma:contentTypeName="Documento" ma:contentTypeID="0x010100E4D0EA28D091FE4192BEFA8519B37564" ma:contentTypeVersion="10" ma:contentTypeDescription="Crear nuevo documento." ma:contentTypeScope="" ma:versionID="17620f574f55d5cf2c9d9aad83b30a21">
   <xsd:schema xmlns:xsd="http://www.w3.org/2001/XMLSchema" xmlns:xs="http://www.w3.org/2001/XMLSchema" xmlns:p="http://schemas.microsoft.com/office/2006/metadata/properties" xmlns:ns2="0a2fff00-f002-44e7-b50c-b90cb65110b9" targetNamespace="http://schemas.microsoft.com/office/2006/metadata/properties" ma:root="true" ma:fieldsID="c88e6efe226a77927f0e84941c699975" ns2:_="">
     <xsd:import namespace="0a2fff00-f002-44e7-b50c-b90cb65110b9"/>
@@ -5236,17 +4864,15 @@
 </ct:contentTypeSchema>
 </file>
 
-<file path=customXml/item4.xml><?xml version="1.0" encoding="utf-8"?>
-<p:properties xmlns:p="http://schemas.microsoft.com/office/2006/metadata/properties" xmlns:xsi="http://www.w3.org/2001/XMLSchema-instance" xmlns:pc="http://schemas.microsoft.com/office/infopath/2007/PartnerControls">
-  <documentManagement>
-    <lcf76f155ced4ddcb4097134ff3c332f xmlns="0a2fff00-f002-44e7-b50c-b90cb65110b9">
-      <Terms xmlns="http://schemas.microsoft.com/office/infopath/2007/PartnerControls"/>
-    </lcf76f155ced4ddcb4097134ff3c332f>
-  </documentManagement>
-</p:properties>
+<file path=customXml/itemProps1.xml><?xml version="1.0" encoding="utf-8"?>
+<ds:datastoreItem xmlns:ds="http://schemas.openxmlformats.org/officeDocument/2006/customXml" ds:itemID="{084C26D9-49C9-4ADB-A387-DA6079798921}">
+  <ds:schemaRefs>
+    <ds:schemaRef ds:uri="http://schemas.microsoft.com/sharepoint/v3/contenttype/forms"/>
+  </ds:schemaRefs>
+</ds:datastoreItem>
 </file>
 
-<file path=customXml/itemProps1.xml><?xml version="1.0" encoding="utf-8"?>
+<file path=customXml/itemProps2.xml><?xml version="1.0" encoding="utf-8"?>
 <ds:datastoreItem xmlns:ds="http://schemas.openxmlformats.org/officeDocument/2006/customXml" ds:itemID="{FACB83BB-458E-4CCB-91D7-35CFBA93934D}">
   <ds:schemaRefs>
     <ds:schemaRef ds:uri="http://schemas.openxmlformats.org/officeDocument/2006/bibliography"/>
@@ -5254,15 +4880,17 @@
 </ds:datastoreItem>
 </file>
 
-<file path=customXml/itemProps2.xml><?xml version="1.0" encoding="utf-8"?>
-<ds:datastoreItem xmlns:ds="http://schemas.openxmlformats.org/officeDocument/2006/customXml" ds:itemID="{084C26D9-49C9-4ADB-A387-DA6079798921}">
+<file path=customXml/itemProps3.xml><?xml version="1.0" encoding="utf-8"?>
+<ds:datastoreItem xmlns:ds="http://schemas.openxmlformats.org/officeDocument/2006/customXml" ds:itemID="{662F60C8-4BC5-4139-BE63-6954D22D77BD}">
   <ds:schemaRefs>
-    <ds:schemaRef ds:uri="http://schemas.microsoft.com/sharepoint/v3/contenttype/forms"/>
+    <ds:schemaRef ds:uri="http://schemas.microsoft.com/office/2006/metadata/properties"/>
+    <ds:schemaRef ds:uri="http://schemas.microsoft.com/office/infopath/2007/PartnerControls"/>
+    <ds:schemaRef ds:uri="0a2fff00-f002-44e7-b50c-b90cb65110b9"/>
   </ds:schemaRefs>
 </ds:datastoreItem>
 </file>
 
-<file path=customXml/itemProps3.xml><?xml version="1.0" encoding="utf-8"?>
+<file path=customXml/itemProps4.xml><?xml version="1.0" encoding="utf-8"?>
 <ds:datastoreItem xmlns:ds="http://schemas.openxmlformats.org/officeDocument/2006/customXml" ds:itemID="{33ACE72F-0E89-45C2-A0D0-41ED1397348A}">
   <ds:schemaRefs>
     <ds:schemaRef ds:uri="http://schemas.microsoft.com/office/2006/metadata/contentType"/>
@@ -5278,14 +4906,4 @@
     <ds:schemaRef ds:uri="http://schemas.microsoft.com/internal/obd"/>
   </ds:schemaRefs>
 </ds:datastoreItem>
-</file>
-
-<file path=customXml/itemProps4.xml><?xml version="1.0" encoding="utf-8"?>
-<ds:datastoreItem xmlns:ds="http://schemas.openxmlformats.org/officeDocument/2006/customXml" ds:itemID="{662F60C8-4BC5-4139-BE63-6954D22D77BD}">
-  <ds:schemaRefs>
-    <ds:schemaRef ds:uri="http://schemas.microsoft.com/office/2006/metadata/properties"/>
-    <ds:schemaRef ds:uri="http://schemas.microsoft.com/office/infopath/2007/PartnerControls"/>
-    <ds:schemaRef ds:uri="0a2fff00-f002-44e7-b50c-b90cb65110b9"/>
-  </ds:schemaRefs>
-</ds:datastoreItem>
 </file>
</xml_diff>